<commit_message>
multiple workspaces and workflow implementation
</commit_message>
<xml_diff>
--- a/docs/prd/RelayFlow_PRD_Technical_Strategy.docx
+++ b/docs/prd/RelayFlow_PRD_Technical_Strategy.docx
@@ -4,88 +4,695 @@
   <w:body>
     <w:p>
       <w:pPr>
-        <w:spacing w:after="60"/>
+        <w:jc w:val="left"/>
       </w:pPr>
       <w:r>
         <w:rPr>
-          <w:rFonts w:ascii="Calibri" w:hAnsi="Calibri"/>
           <w:b/>
-          <w:color w:val="0B2545"/>
-          <w:sz w:val="56"/>
+          <w:color w:val="0E2456"/>
+          <w:sz w:val="52"/>
         </w:rPr>
         <w:t>RelayFlow</w:t>
       </w:r>
     </w:p>
     <w:p>
-      <w:pPr>
-        <w:spacing w:after="240"/>
-      </w:pPr>
       <w:r>
         <w:rPr>
-          <w:rFonts w:ascii="Calibri" w:hAnsi="Calibri"/>
-          <w:color w:val="1F4D78"/>
-          <w:sz w:val="28"/>
+          <w:color w:val="5A6272"/>
+          <w:sz w:val="22"/>
         </w:rPr>
-        <w:t>Product Requirements and Technical Strategy</w:t>
+        <w:t>Product Requirements and Technical Strategy | Updated May 30, 2026</w:t>
       </w:r>
     </w:p>
     <w:p>
       <w:pPr>
-        <w:spacing w:after="360"/>
+        <w:pStyle w:val="Heading1"/>
       </w:pPr>
       <w:r>
-        <w:rPr>
-          <w:rFonts w:ascii="Calibri" w:hAnsi="Calibri"/>
-          <w:color w:val="666666"/>
-          <w:sz w:val="20"/>
-        </w:rPr>
-        <w:t>Working document | Telegram pilot channel | Channel-agnostic messaging automation platform</w:t>
+        <w:t>1. Product Summary</w:t>
+      </w:r>
+    </w:p>
+    <w:p>
+      <w:pPr>
+        <w:spacing w:after="120"/>
+      </w:pPr>
+      <w:r>
+        <w:t>RelayFlow is an omnichannel customer messaging platform with developer-grade workflow automation. Telegram is the first adapter used to validate the channel model, but the product is not Telegram-specific. The core model is designed around workspaces, channel accounts, contacts, external identities, conversations, messages, and workflow definitions.</w:t>
+      </w:r>
+    </w:p>
+    <w:p>
+      <w:pPr>
+        <w:spacing w:after="120"/>
+      </w:pPr>
+      <w:r>
+        <w:t>The product differentiates on reliable automation: mutable workflow variables, controllable HTTP behavior, visible execution logs, and durable message handling.</w:t>
+      </w:r>
+    </w:p>
+    <w:p>
+      <w:pPr>
+        <w:pStyle w:val="Heading1"/>
+      </w:pPr>
+      <w:r>
+        <w:t>2. Problem</w:t>
+      </w:r>
+    </w:p>
+    <w:p>
+      <w:pPr>
+        <w:pStyle w:val="ListBullet"/>
+      </w:pPr>
+      <w:r>
+        <w:t>Messaging workflow tools often make variables hard to override, inspect, and reuse.</w:t>
+      </w:r>
+    </w:p>
+    <w:p>
+      <w:pPr>
+        <w:pStyle w:val="ListBullet"/>
+      </w:pPr>
+      <w:r>
+        <w:t>HTTP/API steps frequently hide important controls such as timeout, response mapping, retry, and error branching.</w:t>
+      </w:r>
+    </w:p>
+    <w:p>
+      <w:pPr>
+        <w:pStyle w:val="ListBullet"/>
+      </w:pPr>
+      <w:r>
+        <w:t>Failed automations are difficult to debug when step inputs, outputs, branch decisions, and variables are not visible.</w:t>
+      </w:r>
+    </w:p>
+    <w:p>
+      <w:pPr>
+        <w:pStyle w:val="ListBullet"/>
+      </w:pPr>
+      <w:r>
+        <w:t>Small businesses need a simple inbox, while technical operators need predictable workflow execution.</w:t>
+      </w:r>
+    </w:p>
+    <w:p>
+      <w:pPr>
+        <w:pStyle w:val="Heading1"/>
+      </w:pPr>
+      <w:r>
+        <w:t>3. Target Market</w:t>
+      </w:r>
+    </w:p>
+    <w:p>
+      <w:pPr>
+        <w:spacing w:after="120"/>
+      </w:pPr>
+      <w:r>
+        <w:t>The initial target market is small businesses handling customer chats through Telegram. Telegram is a test phase and validation adapter. The broader market is SMB teams handling support, sales, and operations across messaging channels.</w:t>
+      </w:r>
+    </w:p>
+    <w:p>
+      <w:pPr>
+        <w:pStyle w:val="Heading1"/>
+      </w:pPr>
+      <w:r>
+        <w:t>4. Current Implementation Snapshot</w:t>
       </w:r>
     </w:p>
     <w:tbl>
       <w:tblPr>
         <w:tblStyle w:val="TableGrid"/>
-        <w:tblW w:type="dxa" w:w="9360"/>
-        <w:jc w:val="left"/>
-        <w:tblLayout w:type="fixed"/>
+        <w:tblW w:type="auto" w:w="0"/>
         <w:tblLook w:firstColumn="1" w:firstRow="1" w:lastColumn="0" w:lastRow="0" w:noHBand="0" w:noVBand="1" w:val="04A0"/>
-        <w:tblInd w:w="120" w:type="dxa"/>
       </w:tblPr>
       <w:tblGrid>
-        <w:gridCol w:w="9360"/>
+        <w:gridCol w:w="3264"/>
+        <w:gridCol w:w="3264"/>
+        <w:gridCol w:w="3264"/>
       </w:tblGrid>
       <w:tr>
         <w:tc>
           <w:tcPr>
-            <w:tcW w:type="dxa" w:w="9360"/>
-            <w:tcMar>
-              <w:top w:w="140" w:type="dxa"/>
-              <w:start w:w="180" w:type="dxa"/>
-              <w:bottom w:w="140" w:type="dxa"/>
-              <w:end w:w="180" w:type="dxa"/>
-            </w:tcMar>
-            <w:vAlign w:val="center"/>
-            <w:shd w:fill="F4F6F9"/>
+            <w:tcW w:type="dxa" w:w="3264"/>
           </w:tcPr>
           <w:p>
-            <w:pPr>
-              <w:spacing w:after="0"/>
-            </w:pPr>
             <w:r>
               <w:rPr>
-                <w:rFonts w:ascii="Calibri" w:hAnsi="Calibri"/>
-                <w:b/>
-                <w:color w:val="1F3A5F"/>
-                <w:sz w:val="21"/>
+                <w:sz w:val="18"/>
               </w:rPr>
-              <w:t xml:space="preserve">Core Idea: </w:t>
+              <w:t>Area</w:t>
             </w:r>
+          </w:p>
+        </w:tc>
+        <w:tc>
+          <w:tcPr>
+            <w:tcW w:type="dxa" w:w="3264"/>
+          </w:tcPr>
+          <w:p>
             <w:r>
               <w:rPr>
-                <w:rFonts w:ascii="Calibri" w:hAnsi="Calibri"/>
-                <w:sz w:val="21"/>
+                <w:sz w:val="18"/>
               </w:rPr>
-              <w:t>Build an omnichannel customer messaging platform with developer-grade workflow automation. Telegram is only the first adapter because it is easy to access and useful for validating the core architecture.</w:t>
+              <w:t>Status</w:t>
+            </w:r>
+          </w:p>
+        </w:tc>
+        <w:tc>
+          <w:tcPr>
+            <w:tcW w:type="dxa" w:w="3264"/>
+          </w:tcPr>
+          <w:p>
+            <w:r>
+              <w:rPr>
+                <w:sz w:val="18"/>
+              </w:rPr>
+              <w:t>Notes</w:t>
+            </w:r>
+          </w:p>
+        </w:tc>
+      </w:tr>
+      <w:tr>
+        <w:tc>
+          <w:tcPr>
+            <w:tcW w:type="dxa" w:w="3264"/>
+          </w:tcPr>
+          <w:p>
+            <w:r>
+              <w:rPr>
+                <w:sz w:val="18"/>
+              </w:rPr>
+              <w:t>Auth</w:t>
+            </w:r>
+          </w:p>
+        </w:tc>
+        <w:tc>
+          <w:tcPr>
+            <w:tcW w:type="dxa" w:w="3264"/>
+          </w:tcPr>
+          <w:p>
+            <w:r>
+              <w:rPr>
+                <w:sz w:val="18"/>
+              </w:rPr>
+              <w:t>Implemented</w:t>
+            </w:r>
+          </w:p>
+        </w:tc>
+        <w:tc>
+          <w:tcPr>
+            <w:tcW w:type="dxa" w:w="3264"/>
+          </w:tcPr>
+          <w:p>
+            <w:r>
+              <w:rPr>
+                <w:sz w:val="18"/>
+              </w:rPr>
+              <w:t>Email/password, Google OAuth, anonymous guest sessions, logout cookie clearing.</w:t>
+            </w:r>
+          </w:p>
+        </w:tc>
+      </w:tr>
+      <w:tr>
+        <w:tc>
+          <w:tcPr>
+            <w:tcW w:type="dxa" w:w="3264"/>
+          </w:tcPr>
+          <w:p>
+            <w:r>
+              <w:rPr>
+                <w:sz w:val="18"/>
+              </w:rPr>
+              <w:t>Workspace model</w:t>
+            </w:r>
+          </w:p>
+        </w:tc>
+        <w:tc>
+          <w:tcPr>
+            <w:tcW w:type="dxa" w:w="3264"/>
+          </w:tcPr>
+          <w:p>
+            <w:r>
+              <w:rPr>
+                <w:sz w:val="18"/>
+              </w:rPr>
+              <w:t>Implemented</w:t>
+            </w:r>
+          </w:p>
+        </w:tc>
+        <w:tc>
+          <w:tcPr>
+            <w:tcW w:type="dxa" w:w="3264"/>
+          </w:tcPr>
+          <w:p>
+            <w:r>
+              <w:rPr>
+                <w:sz w:val="18"/>
+              </w:rPr>
+              <w:t>Users can own workspaces; workspace switcher and create-workspace flow exist.</w:t>
+            </w:r>
+          </w:p>
+        </w:tc>
+      </w:tr>
+      <w:tr>
+        <w:tc>
+          <w:tcPr>
+            <w:tcW w:type="dxa" w:w="3264"/>
+          </w:tcPr>
+          <w:p>
+            <w:r>
+              <w:rPr>
+                <w:sz w:val="18"/>
+              </w:rPr>
+              <w:t>Messaging core</w:t>
+            </w:r>
+          </w:p>
+        </w:tc>
+        <w:tc>
+          <w:tcPr>
+            <w:tcW w:type="dxa" w:w="3264"/>
+          </w:tcPr>
+          <w:p>
+            <w:r>
+              <w:rPr>
+                <w:sz w:val="18"/>
+              </w:rPr>
+              <w:t>Implemented</w:t>
+            </w:r>
+          </w:p>
+        </w:tc>
+        <w:tc>
+          <w:tcPr>
+            <w:tcW w:type="dxa" w:w="3264"/>
+          </w:tcPr>
+          <w:p>
+            <w:r>
+              <w:rPr>
+                <w:sz w:val="18"/>
+              </w:rPr>
+              <w:t>Workspaces, channel accounts, contacts, identities, conversations, messages.</w:t>
+            </w:r>
+          </w:p>
+        </w:tc>
+      </w:tr>
+      <w:tr>
+        <w:tc>
+          <w:tcPr>
+            <w:tcW w:type="dxa" w:w="3264"/>
+          </w:tcPr>
+          <w:p>
+            <w:r>
+              <w:rPr>
+                <w:sz w:val="18"/>
+              </w:rPr>
+              <w:t>Telegram adapter</w:t>
+            </w:r>
+          </w:p>
+        </w:tc>
+        <w:tc>
+          <w:tcPr>
+            <w:tcW w:type="dxa" w:w="3264"/>
+          </w:tcPr>
+          <w:p>
+            <w:r>
+              <w:rPr>
+                <w:sz w:val="18"/>
+              </w:rPr>
+              <w:t>Implemented</w:t>
+            </w:r>
+          </w:p>
+        </w:tc>
+        <w:tc>
+          <w:tcPr>
+            <w:tcW w:type="dxa" w:w="3264"/>
+          </w:tcPr>
+          <w:p>
+            <w:r>
+              <w:rPr>
+                <w:sz w:val="18"/>
+              </w:rPr>
+              <w:t>Dedicated bot webhooks, shared guest bot flow, inbound normalization, outbound send.</w:t>
+            </w:r>
+          </w:p>
+        </w:tc>
+      </w:tr>
+      <w:tr>
+        <w:tc>
+          <w:tcPr>
+            <w:tcW w:type="dxa" w:w="3264"/>
+          </w:tcPr>
+          <w:p>
+            <w:r>
+              <w:rPr>
+                <w:sz w:val="18"/>
+              </w:rPr>
+              <w:t>Inbox UI</w:t>
+            </w:r>
+          </w:p>
+        </w:tc>
+        <w:tc>
+          <w:tcPr>
+            <w:tcW w:type="dxa" w:w="3264"/>
+          </w:tcPr>
+          <w:p>
+            <w:r>
+              <w:rPr>
+                <w:sz w:val="18"/>
+              </w:rPr>
+              <w:t>Implemented</w:t>
+            </w:r>
+          </w:p>
+        </w:tc>
+        <w:tc>
+          <w:tcPr>
+            <w:tcW w:type="dxa" w:w="3264"/>
+          </w:tcPr>
+          <w:p>
+            <w:r>
+              <w:rPr>
+                <w:sz w:val="18"/>
+              </w:rPr>
+              <w:t>Conversation list, message thread, composer, SSE-backed updates.</w:t>
+            </w:r>
+          </w:p>
+        </w:tc>
+      </w:tr>
+      <w:tr>
+        <w:tc>
+          <w:tcPr>
+            <w:tcW w:type="dxa" w:w="3264"/>
+          </w:tcPr>
+          <w:p>
+            <w:r>
+              <w:rPr>
+                <w:sz w:val="18"/>
+              </w:rPr>
+              <w:t>Settings UI</w:t>
+            </w:r>
+          </w:p>
+        </w:tc>
+        <w:tc>
+          <w:tcPr>
+            <w:tcW w:type="dxa" w:w="3264"/>
+          </w:tcPr>
+          <w:p>
+            <w:r>
+              <w:rPr>
+                <w:sz w:val="18"/>
+              </w:rPr>
+              <w:t>Implemented</w:t>
+            </w:r>
+          </w:p>
+        </w:tc>
+        <w:tc>
+          <w:tcPr>
+            <w:tcW w:type="dxa" w:w="3264"/>
+          </w:tcPr>
+          <w:p>
+            <w:r>
+              <w:rPr>
+                <w:sz w:val="18"/>
+              </w:rPr>
+              <w:t>Channel management moved to workspace settings.</w:t>
+            </w:r>
+          </w:p>
+        </w:tc>
+      </w:tr>
+      <w:tr>
+        <w:tc>
+          <w:tcPr>
+            <w:tcW w:type="dxa" w:w="3264"/>
+          </w:tcPr>
+          <w:p>
+            <w:r>
+              <w:rPr>
+                <w:sz w:val="18"/>
+              </w:rPr>
+              <w:t>Workflow definitions</w:t>
+            </w:r>
+          </w:p>
+        </w:tc>
+        <w:tc>
+          <w:tcPr>
+            <w:tcW w:type="dxa" w:w="3264"/>
+          </w:tcPr>
+          <w:p>
+            <w:r>
+              <w:rPr>
+                <w:sz w:val="18"/>
+              </w:rPr>
+              <w:t>Implemented</w:t>
+            </w:r>
+          </w:p>
+        </w:tc>
+        <w:tc>
+          <w:tcPr>
+            <w:tcW w:type="dxa" w:w="3264"/>
+          </w:tcPr>
+          <w:p>
+            <w:r>
+              <w:rPr>
+                <w:sz w:val="18"/>
+              </w:rPr>
+              <w:t>CRUD API and draft graph persistence.</w:t>
+            </w:r>
+          </w:p>
+        </w:tc>
+      </w:tr>
+      <w:tr>
+        <w:tc>
+          <w:tcPr>
+            <w:tcW w:type="dxa" w:w="3264"/>
+          </w:tcPr>
+          <w:p>
+            <w:r>
+              <w:rPr>
+                <w:sz w:val="18"/>
+              </w:rPr>
+              <w:t>Workflow runtime</w:t>
+            </w:r>
+          </w:p>
+        </w:tc>
+        <w:tc>
+          <w:tcPr>
+            <w:tcW w:type="dxa" w:w="3264"/>
+          </w:tcPr>
+          <w:p>
+            <w:r>
+              <w:rPr>
+                <w:sz w:val="18"/>
+              </w:rPr>
+              <w:t>Implemented</w:t>
+            </w:r>
+          </w:p>
+        </w:tc>
+        <w:tc>
+          <w:tcPr>
+            <w:tcW w:type="dxa" w:w="3264"/>
+          </w:tcPr>
+          <w:p>
+            <w:r>
+              <w:rPr>
+                <w:sz w:val="18"/>
+              </w:rPr>
+              <w:t>Graph execution, run records, step records, waiting/resume behavior.</w:t>
+            </w:r>
+          </w:p>
+        </w:tc>
+      </w:tr>
+      <w:tr>
+        <w:tc>
+          <w:tcPr>
+            <w:tcW w:type="dxa" w:w="3264"/>
+          </w:tcPr>
+          <w:p>
+            <w:r>
+              <w:rPr>
+                <w:sz w:val="18"/>
+              </w:rPr>
+              <w:t>Workflow builder</w:t>
+            </w:r>
+          </w:p>
+        </w:tc>
+        <w:tc>
+          <w:tcPr>
+            <w:tcW w:type="dxa" w:w="3264"/>
+          </w:tcPr>
+          <w:p>
+            <w:r>
+              <w:rPr>
+                <w:sz w:val="18"/>
+              </w:rPr>
+              <w:t>Implemented</w:t>
+            </w:r>
+          </w:p>
+        </w:tc>
+        <w:tc>
+          <w:tcPr>
+            <w:tcW w:type="dxa" w:w="3264"/>
+          </w:tcPr>
+          <w:p>
+            <w:r>
+              <w:rPr>
+                <w:sz w:val="18"/>
+              </w:rPr>
+              <w:t>React Flow canvas, node palette, config panel, save, publish/unpublish.</w:t>
+            </w:r>
+          </w:p>
+        </w:tc>
+      </w:tr>
+      <w:tr>
+        <w:tc>
+          <w:tcPr>
+            <w:tcW w:type="dxa" w:w="3264"/>
+          </w:tcPr>
+          <w:p>
+            <w:r>
+              <w:rPr>
+                <w:sz w:val="18"/>
+              </w:rPr>
+              <w:t>Workflow run logs UI</w:t>
+            </w:r>
+          </w:p>
+        </w:tc>
+        <w:tc>
+          <w:tcPr>
+            <w:tcW w:type="dxa" w:w="3264"/>
+          </w:tcPr>
+          <w:p>
+            <w:r>
+              <w:rPr>
+                <w:sz w:val="18"/>
+              </w:rPr>
+              <w:t>Planned</w:t>
+            </w:r>
+          </w:p>
+        </w:tc>
+        <w:tc>
+          <w:tcPr>
+            <w:tcW w:type="dxa" w:w="3264"/>
+          </w:tcPr>
+          <w:p>
+            <w:r>
+              <w:rPr>
+                <w:sz w:val="18"/>
+              </w:rPr>
+              <w:t>Data is persisted, but a user-facing run log screen is still needed.</w:t>
+            </w:r>
+          </w:p>
+        </w:tc>
+      </w:tr>
+      <w:tr>
+        <w:tc>
+          <w:tcPr>
+            <w:tcW w:type="dxa" w:w="3264"/>
+          </w:tcPr>
+          <w:p>
+            <w:r>
+              <w:rPr>
+                <w:sz w:val="18"/>
+              </w:rPr>
+              <w:t>Workspace authorization</w:t>
+            </w:r>
+          </w:p>
+        </w:tc>
+        <w:tc>
+          <w:tcPr>
+            <w:tcW w:type="dxa" w:w="3264"/>
+          </w:tcPr>
+          <w:p>
+            <w:r>
+              <w:rPr>
+                <w:sz w:val="18"/>
+              </w:rPr>
+              <w:t>Planned</w:t>
+            </w:r>
+          </w:p>
+        </w:tc>
+        <w:tc>
+          <w:tcPr>
+            <w:tcW w:type="dxa" w:w="3264"/>
+          </w:tcPr>
+          <w:p>
+            <w:r>
+              <w:rPr>
+                <w:sz w:val="18"/>
+              </w:rPr>
+              <w:t>Membership model exists; full workspace-scoped authorization checks remain pending.</w:t>
+            </w:r>
+          </w:p>
+        </w:tc>
+      </w:tr>
+      <w:tr>
+        <w:tc>
+          <w:tcPr>
+            <w:tcW w:type="dxa" w:w="3264"/>
+          </w:tcPr>
+          <w:p>
+            <w:r>
+              <w:rPr>
+                <w:sz w:val="18"/>
+              </w:rPr>
+              <w:t>Webhook verification</w:t>
+            </w:r>
+          </w:p>
+        </w:tc>
+        <w:tc>
+          <w:tcPr>
+            <w:tcW w:type="dxa" w:w="3264"/>
+          </w:tcPr>
+          <w:p>
+            <w:r>
+              <w:rPr>
+                <w:sz w:val="18"/>
+              </w:rPr>
+              <w:t>Planned</w:t>
+            </w:r>
+          </w:p>
+        </w:tc>
+        <w:tc>
+          <w:tcPr>
+            <w:tcW w:type="dxa" w:w="3264"/>
+          </w:tcPr>
+          <w:p>
+            <w:r>
+              <w:rPr>
+                <w:sz w:val="18"/>
+              </w:rPr>
+              <w:t>Telegram secret-token validation remains pending.</w:t>
+            </w:r>
+          </w:p>
+        </w:tc>
+      </w:tr>
+      <w:tr>
+        <w:tc>
+          <w:tcPr>
+            <w:tcW w:type="dxa" w:w="3264"/>
+          </w:tcPr>
+          <w:p>
+            <w:r>
+              <w:rPr>
+                <w:sz w:val="18"/>
+              </w:rPr>
+              <w:t>Manual migrations</w:t>
+            </w:r>
+          </w:p>
+        </w:tc>
+        <w:tc>
+          <w:tcPr>
+            <w:tcW w:type="dxa" w:w="3264"/>
+          </w:tcPr>
+          <w:p>
+            <w:r>
+              <w:rPr>
+                <w:sz w:val="18"/>
+              </w:rPr>
+              <w:t>Required</w:t>
+            </w:r>
+          </w:p>
+        </w:tc>
+        <w:tc>
+          <w:tcPr>
+            <w:tcW w:type="dxa" w:w="3264"/>
+          </w:tcPr>
+          <w:p>
+            <w:r>
+              <w:rPr>
+                <w:sz w:val="18"/>
+              </w:rPr>
+              <w:t>Flyway is disabled at runtime; migrations must be run manually.</w:t>
             </w:r>
           </w:p>
         </w:tc>
@@ -97,350 +704,36 @@
         <w:pStyle w:val="Heading1"/>
       </w:pPr>
       <w:r>
-        <w:t>1. Product Summary</w:t>
+        <w:t>5. Product Scope</w:t>
       </w:r>
     </w:p>
     <w:p>
+      <w:pPr>
+        <w:pStyle w:val="Heading2"/>
+      </w:pPr>
       <w:r>
-        <w:t>RelayFlow is a customer messaging and automation platform for businesses that manage conversations across chat channels and need more control than typical no-code inbox tools provide. The product starts with Telegram as a pilot adapter, but the domain model, workflow runtime, and inbox are designed to support WhatsApp, Instagram, Messenger, webchat, email, and other channels later.</w:t>
+        <w:t>5.1 MVP Goal</w:t>
       </w:r>
     </w:p>
     <w:p>
+      <w:pPr>
+        <w:spacing w:after="120"/>
+      </w:pPr>
       <w:r>
-        <w:t>The differentiation is not Telegram support. The differentiation is a powerful, debuggable workflow system with mutable variables, controllable HTTP behavior, transparent run logs, and durable execution semantics.</w:t>
+        <w:t>Prove that RelayFlow can normalize Telegram conversations into a channel-agnostic inbox and run configurable workflows with transparent execution data.</w:t>
       </w:r>
     </w:p>
     <w:p>
       <w:pPr>
-        <w:pStyle w:val="Heading1"/>
+        <w:pStyle w:val="Heading2"/>
       </w:pPr>
       <w:r>
-        <w:t>2. Problem</w:t>
+        <w:t>5.2 Implemented MVP Features</w:t>
       </w:r>
     </w:p>
     <w:p>
       <w:pPr>
         <w:pStyle w:val="ListBullet"/>
-        <w:spacing w:after="80" w:line="280" w:lineRule="auto"/>
-      </w:pPr>
-      <w:r>
-        <w:t>Many messaging platforms offer workflow builders, but their automation primitives are limited.</w:t>
-      </w:r>
-    </w:p>
-    <w:p>
-      <w:pPr>
-        <w:pStyle w:val="ListBullet"/>
-        <w:spacing w:after="80" w:line="280" w:lineRule="auto"/>
-      </w:pPr>
-      <w:r>
-        <w:t>Variables are often awkward to create, update, override, inspect, and reuse.</w:t>
-      </w:r>
-    </w:p>
-    <w:p>
-      <w:pPr>
-        <w:pStyle w:val="ListBullet"/>
-        <w:spacing w:after="80" w:line="280" w:lineRule="auto"/>
-      </w:pPr>
-      <w:r>
-        <w:t>HTTP/API steps frequently hide important controls such as timeout, retry, backoff, and error branching.</w:t>
-      </w:r>
-    </w:p>
-    <w:p>
-      <w:pPr>
-        <w:pStyle w:val="ListBullet"/>
-        <w:spacing w:after="80" w:line="280" w:lineRule="auto"/>
-      </w:pPr>
-      <w:r>
-        <w:t>Failed automations are difficult to debug because users cannot inspect every step input, output, branch decision, and variable snapshot.</w:t>
-      </w:r>
-    </w:p>
-    <w:p>
-      <w:pPr>
-        <w:pStyle w:val="ListBullet"/>
-        <w:spacing w:after="80" w:line="280" w:lineRule="auto"/>
-      </w:pPr>
-      <w:r>
-        <w:t>Business users need no-code workflow control, while developer users need predictable execution behavior.</w:t>
-      </w:r>
-    </w:p>
-    <w:p>
-      <w:pPr>
-        <w:pStyle w:val="Heading1"/>
-      </w:pPr>
-      <w:r>
-        <w:t>3. Target Market</w:t>
-      </w:r>
-    </w:p>
-    <w:p>
-      <w:r>
-        <w:t>The target market is small and mid-sized businesses that handle support, sales, and operations through customer messaging channels. Telegram users are pilot users only; they are not the long-term market definition.</w:t>
-      </w:r>
-    </w:p>
-    <w:tbl>
-      <w:tblPr>
-        <w:tblStyle w:val="TableGrid"/>
-        <w:tblW w:type="dxa" w:w="9360"/>
-        <w:jc w:val="left"/>
-        <w:tblLayout w:type="fixed"/>
-        <w:tblLook w:firstColumn="1" w:firstRow="1" w:lastColumn="0" w:lastRow="0" w:noHBand="0" w:noVBand="1" w:val="04A0"/>
-        <w:tblInd w:w="120" w:type="dxa"/>
-      </w:tblPr>
-      <w:tblGrid>
-        <w:gridCol w:w="2400"/>
-        <w:gridCol w:w="6960"/>
-      </w:tblGrid>
-      <w:tr>
-        <w:tc>
-          <w:tcPr>
-            <w:tcW w:type="dxa" w:w="2400"/>
-            <w:tcMar>
-              <w:top w:w="80" w:type="dxa"/>
-              <w:start w:w="120" w:type="dxa"/>
-              <w:bottom w:w="80" w:type="dxa"/>
-              <w:end w:w="120" w:type="dxa"/>
-            </w:tcMar>
-            <w:vAlign w:val="center"/>
-            <w:shd w:fill="F2F4F7"/>
-          </w:tcPr>
-          <w:p>
-            <w:pPr>
-              <w:spacing w:after="0" w:line="264" w:lineRule="auto"/>
-            </w:pPr>
-            <w:r/>
-            <w:r>
-              <w:rPr>
-                <w:rFonts w:ascii="Calibri" w:hAnsi="Calibri"/>
-                <w:b/>
-                <w:color w:val="0B2545"/>
-                <w:sz w:val="20"/>
-              </w:rPr>
-              <w:t>Segment</w:t>
-            </w:r>
-          </w:p>
-        </w:tc>
-        <w:tc>
-          <w:tcPr>
-            <w:tcW w:type="dxa" w:w="6960"/>
-            <w:tcMar>
-              <w:top w:w="80" w:type="dxa"/>
-              <w:start w:w="120" w:type="dxa"/>
-              <w:bottom w:w="80" w:type="dxa"/>
-              <w:end w:w="120" w:type="dxa"/>
-            </w:tcMar>
-            <w:vAlign w:val="center"/>
-            <w:shd w:fill="F2F4F7"/>
-          </w:tcPr>
-          <w:p>
-            <w:pPr>
-              <w:spacing w:after="0" w:line="264" w:lineRule="auto"/>
-            </w:pPr>
-            <w:r/>
-            <w:r>
-              <w:rPr>
-                <w:rFonts w:ascii="Calibri" w:hAnsi="Calibri"/>
-                <w:b/>
-                <w:color w:val="0B2545"/>
-                <w:sz w:val="20"/>
-              </w:rPr>
-              <w:t>Need</w:t>
-            </w:r>
-          </w:p>
-        </w:tc>
-      </w:tr>
-      <w:tr>
-        <w:tc>
-          <w:tcPr>
-            <w:tcW w:type="dxa" w:w="2400"/>
-          </w:tcPr>
-          <w:p>
-            <w:pPr>
-              <w:spacing w:after="0" w:line="264" w:lineRule="auto"/>
-            </w:pPr>
-            <w:r/>
-            <w:r>
-              <w:rPr>
-                <w:rFonts w:ascii="Calibri" w:hAnsi="Calibri"/>
-                <w:b w:val="0"/>
-                <w:sz w:val="20"/>
-              </w:rPr>
-              <w:t>SMBs</w:t>
-            </w:r>
-          </w:p>
-        </w:tc>
-        <w:tc>
-          <w:tcPr>
-            <w:tcW w:type="dxa" w:w="6960"/>
-          </w:tcPr>
-          <w:p>
-            <w:pPr>
-              <w:spacing w:after="0" w:line="264" w:lineRule="auto"/>
-            </w:pPr>
-            <w:r/>
-            <w:r>
-              <w:rPr>
-                <w:rFonts w:ascii="Calibri" w:hAnsi="Calibri"/>
-                <w:b w:val="0"/>
-                <w:sz w:val="20"/>
-              </w:rPr>
-              <w:t>Manage customer conversations and automate repeatable support or sales workflows.</w:t>
-            </w:r>
-          </w:p>
-        </w:tc>
-      </w:tr>
-      <w:tr>
-        <w:tc>
-          <w:tcPr>
-            <w:tcW w:type="dxa" w:w="2400"/>
-          </w:tcPr>
-          <w:p>
-            <w:pPr>
-              <w:spacing w:after="0" w:line="264" w:lineRule="auto"/>
-            </w:pPr>
-            <w:r/>
-            <w:r>
-              <w:rPr>
-                <w:rFonts w:ascii="Calibri" w:hAnsi="Calibri"/>
-                <w:b w:val="0"/>
-                <w:sz w:val="20"/>
-              </w:rPr>
-              <w:t>Agencies</w:t>
-            </w:r>
-          </w:p>
-        </w:tc>
-        <w:tc>
-          <w:tcPr>
-            <w:tcW w:type="dxa" w:w="6960"/>
-          </w:tcPr>
-          <w:p>
-            <w:pPr>
-              <w:spacing w:after="0" w:line="264" w:lineRule="auto"/>
-            </w:pPr>
-            <w:r/>
-            <w:r>
-              <w:rPr>
-                <w:rFonts w:ascii="Calibri" w:hAnsi="Calibri"/>
-                <w:b w:val="0"/>
-                <w:sz w:val="20"/>
-              </w:rPr>
-              <w:t>Build and maintain messaging automations for multiple client businesses.</w:t>
-            </w:r>
-          </w:p>
-        </w:tc>
-      </w:tr>
-      <w:tr>
-        <w:tc>
-          <w:tcPr>
-            <w:tcW w:type="dxa" w:w="2400"/>
-          </w:tcPr>
-          <w:p>
-            <w:pPr>
-              <w:spacing w:after="0" w:line="264" w:lineRule="auto"/>
-            </w:pPr>
-            <w:r/>
-            <w:r>
-              <w:rPr>
-                <w:rFonts w:ascii="Calibri" w:hAnsi="Calibri"/>
-                <w:b w:val="0"/>
-                <w:sz w:val="20"/>
-              </w:rPr>
-              <w:t>Operations teams</w:t>
-            </w:r>
-          </w:p>
-        </w:tc>
-        <w:tc>
-          <w:tcPr>
-            <w:tcW w:type="dxa" w:w="6960"/>
-          </w:tcPr>
-          <w:p>
-            <w:pPr>
-              <w:spacing w:after="0" w:line="264" w:lineRule="auto"/>
-            </w:pPr>
-            <w:r/>
-            <w:r>
-              <w:rPr>
-                <w:rFonts w:ascii="Calibri" w:hAnsi="Calibri"/>
-                <w:b w:val="0"/>
-                <w:sz w:val="20"/>
-              </w:rPr>
-              <w:t>Connect chat events to internal systems, CRMs, order tools, and custom APIs.</w:t>
-            </w:r>
-          </w:p>
-        </w:tc>
-      </w:tr>
-      <w:tr>
-        <w:tc>
-          <w:tcPr>
-            <w:tcW w:type="dxa" w:w="2400"/>
-          </w:tcPr>
-          <w:p>
-            <w:pPr>
-              <w:spacing w:after="0" w:line="264" w:lineRule="auto"/>
-            </w:pPr>
-            <w:r/>
-            <w:r>
-              <w:rPr>
-                <w:rFonts w:ascii="Calibri" w:hAnsi="Calibri"/>
-                <w:b w:val="0"/>
-                <w:sz w:val="20"/>
-              </w:rPr>
-              <w:t>Developer-led teams</w:t>
-            </w:r>
-          </w:p>
-        </w:tc>
-        <w:tc>
-          <w:tcPr>
-            <w:tcW w:type="dxa" w:w="6960"/>
-          </w:tcPr>
-          <w:p>
-            <w:pPr>
-              <w:spacing w:after="0" w:line="264" w:lineRule="auto"/>
-            </w:pPr>
-            <w:r/>
-            <w:r>
-              <w:rPr>
-                <w:rFonts w:ascii="Calibri" w:hAnsi="Calibri"/>
-                <w:b w:val="0"/>
-                <w:sz w:val="20"/>
-              </w:rPr>
-              <w:t>Use no-code flow design without losing API control, logs, and predictable execution semantics.</w:t>
-            </w:r>
-          </w:p>
-        </w:tc>
-      </w:tr>
-    </w:tbl>
-    <w:p>
-      <w:pPr>
-        <w:pStyle w:val="Heading1"/>
-      </w:pPr>
-      <w:r>
-        <w:t>4. Product Scope</w:t>
-      </w:r>
-    </w:p>
-    <w:p>
-      <w:pPr>
-        <w:pStyle w:val="Heading2"/>
-      </w:pPr>
-      <w:r>
-        <w:t>4.1 MVP Goal</w:t>
-      </w:r>
-    </w:p>
-    <w:p>
-      <w:r>
-        <w:t>Build a channel-agnostic messaging and workflow platform, using Telegram only as the first adapter. The MVP should prove that inbound messages can be normalized, conversations can be handled in a generic inbox, and workflows can run with transparent variable and HTTP behavior.</w:t>
-      </w:r>
-    </w:p>
-    <w:p>
-      <w:pPr>
-        <w:pStyle w:val="Heading2"/>
-      </w:pPr>
-      <w:r>
-        <w:t>4.2 MVP Features</w:t>
-      </w:r>
-    </w:p>
-    <w:p>
-      <w:pPr>
-        <w:pStyle w:val="ListBullet"/>
-        <w:spacing w:after="80" w:line="280" w:lineRule="auto"/>
       </w:pPr>
       <w:r>
         <w:t>Workspace and user account system.</w:t>
@@ -449,7 +742,14 @@
     <w:p>
       <w:pPr>
         <w:pStyle w:val="ListBullet"/>
-        <w:spacing w:after="80" w:line="280" w:lineRule="auto"/>
+      </w:pPr>
+      <w:r>
+        <w:t>Email/password login, Google login, and anonymous guest sessions.</w:t>
+      </w:r>
+    </w:p>
+    <w:p>
+      <w:pPr>
+        <w:pStyle w:val="ListBullet"/>
       </w:pPr>
       <w:r>
         <w:t>Telegram bot connection as the pilot channel adapter.</w:t>
@@ -458,7 +758,14 @@
     <w:p>
       <w:pPr>
         <w:pStyle w:val="ListBullet"/>
-        <w:spacing w:after="80" w:line="280" w:lineRule="auto"/>
+      </w:pPr>
+      <w:r>
+        <w:t>Shared Telegram guest bot with /start workspace linking.</w:t>
+      </w:r>
+    </w:p>
+    <w:p>
+      <w:pPr>
+        <w:pStyle w:val="ListBullet"/>
       </w:pPr>
       <w:r>
         <w:t>Generic contact, external identity, conversation, and message models.</w:t>
@@ -467,78 +774,150 @@
     <w:p>
       <w:pPr>
         <w:pStyle w:val="ListBullet"/>
-        <w:spacing w:after="80" w:line="280" w:lineRule="auto"/>
       </w:pPr>
       <w:r>
-        <w:t>Basic agent inbox with conversation list, message thread, assignment, and reply.</w:t>
+        <w:t>Agent inbox with conversation list, message thread, and outbound reply composer.</w:t>
       </w:r>
     </w:p>
     <w:p>
       <w:pPr>
         <w:pStyle w:val="ListBullet"/>
-        <w:spacing w:after="80" w:line="280" w:lineRule="auto"/>
       </w:pPr>
       <w:r>
-        <w:t>Workflow trigger for inbound message events.</w:t>
+        <w:t>Real-time updates through workspace SSE events.</w:t>
       </w:r>
     </w:p>
     <w:p>
       <w:pPr>
         <w:pStyle w:val="ListBullet"/>
-        <w:spacing w:after="80" w:line="280" w:lineRule="auto"/>
       </w:pPr>
       <w:r>
-        <w:t>Set variable, condition, HTTP request, send message, wait, and end nodes.</w:t>
+        <w:t>Workflow definition CRUD and React Flow-based builder.</w:t>
       </w:r>
     </w:p>
     <w:p>
       <w:pPr>
         <w:pStyle w:val="ListBullet"/>
-        <w:spacing w:after="80" w:line="280" w:lineRule="auto"/>
       </w:pPr>
       <w:r>
-        <w:t>Workflow run timeline showing step inputs, outputs, errors, retries, branches, and variable snapshots.</w:t>
+        <w:t>Workflow trigger for conversation_opened events.</w:t>
       </w:r>
     </w:p>
     <w:p>
       <w:pPr>
         <w:pStyle w:val="ListBullet"/>
-        <w:spacing w:after="80" w:line="280" w:lineRule="auto"/>
       </w:pPr>
       <w:r>
-        <w:t>Draft and published workflow versions.</w:t>
+        <w:t>Workflow nodes: Trigger, Send Message, Condition, HTTP Request, Set Variable, Ask Question, Jump To, End Conversation.</w:t>
       </w:r>
     </w:p>
     <w:p>
       <w:pPr>
         <w:pStyle w:val="ListBullet"/>
-        <w:spacing w:after="80" w:line="280" w:lineRule="auto"/>
       </w:pPr>
       <w:r>
-        <w:t>Basic roles: owner, admin, and agent.</w:t>
+        <w:t>Persisted workflow runs and per-step input/output snapshots.</w:t>
       </w:r>
     </w:p>
     <w:p>
       <w:pPr>
-        <w:pStyle w:val="Heading2"/>
+        <w:pStyle w:val="ListBullet"/>
       </w:pPr>
       <w:r>
-        <w:t>4.3 Out of Scope for MVP</w:t>
+        <w:t>Workflow publish validation for structural graph rules, including valid Jump To targets.</w:t>
       </w:r>
     </w:p>
     <w:p>
       <w:pPr>
-        <w:pStyle w:val="ListBullet"/>
-        <w:spacing w:after="80" w:line="280" w:lineRule="auto"/>
+        <w:pStyle w:val="Heading2"/>
       </w:pPr>
       <w:r>
-        <w:t>WhatsApp, Instagram, Messenger, webchat, SMS, and email adapters.</w:t>
+        <w:t>5.3 Not Yet Implemented</w:t>
       </w:r>
     </w:p>
     <w:p>
       <w:pPr>
         <w:pStyle w:val="ListBullet"/>
-        <w:spacing w:after="80" w:line="280" w:lineRule="auto"/>
+      </w:pPr>
+      <w:r>
+        <w:t>Workflow run logs UI.</w:t>
+      </w:r>
+    </w:p>
+    <w:p>
+      <w:pPr>
+        <w:pStyle w:val="ListBullet"/>
+      </w:pPr>
+      <w:r>
+        <w:t>Manual workflow test-run mode.</w:t>
+      </w:r>
+    </w:p>
+    <w:p>
+      <w:pPr>
+        <w:pStyle w:val="ListBullet"/>
+      </w:pPr>
+      <w:r>
+        <w:t>Published workflow version history separate from draft graph.</w:t>
+      </w:r>
+    </w:p>
+    <w:p>
+      <w:pPr>
+        <w:pStyle w:val="ListBullet"/>
+      </w:pPr>
+      <w:r>
+        <w:t>Role-based authorization for owner/admin/agent.</w:t>
+      </w:r>
+    </w:p>
+    <w:p>
+      <w:pPr>
+        <w:pStyle w:val="ListBullet"/>
+      </w:pPr>
+      <w:r>
+        <w:t>Conversation assignment to workspace members.</w:t>
+      </w:r>
+    </w:p>
+    <w:p>
+      <w:pPr>
+        <w:pStyle w:val="ListBullet"/>
+      </w:pPr>
+      <w:r>
+        <w:t>Retry count, retry delay, and backoff controls for HTTP nodes.</w:t>
+      </w:r>
+    </w:p>
+    <w:p>
+      <w:pPr>
+        <w:pStyle w:val="ListBullet"/>
+      </w:pPr>
+      <w:r>
+        <w:t>Secret masking in workflow editor previews and run logs.</w:t>
+      </w:r>
+    </w:p>
+    <w:p>
+      <w:pPr>
+        <w:pStyle w:val="ListBullet"/>
+      </w:pPr>
+      <w:r>
+        <w:t>Telegram webhook secret verification.</w:t>
+      </w:r>
+    </w:p>
+    <w:p>
+      <w:pPr>
+        <w:pStyle w:val="ListBullet"/>
+      </w:pPr>
+      <w:r>
+        <w:t>Additional channel adapters beyond Telegram.</w:t>
+      </w:r>
+    </w:p>
+    <w:p>
+      <w:pPr>
+        <w:pStyle w:val="Heading2"/>
+      </w:pPr>
+      <w:r>
+        <w:t>5.4 Out Of Scope For Current MVP</w:t>
+      </w:r>
+    </w:p>
+    <w:p>
+      <w:pPr>
+        <w:pStyle w:val="ListBullet"/>
       </w:pPr>
       <w:r>
         <w:t>Broadcast campaigns.</w:t>
@@ -547,7 +926,6 @@
     <w:p>
       <w:pPr>
         <w:pStyle w:val="ListBullet"/>
-        <w:spacing w:after="80" w:line="280" w:lineRule="auto"/>
       </w:pPr>
       <w:r>
         <w:t>AI agent features.</w:t>
@@ -556,7 +934,6 @@
     <w:p>
       <w:pPr>
         <w:pStyle w:val="ListBullet"/>
-        <w:spacing w:after="80" w:line="280" w:lineRule="auto"/>
       </w:pPr>
       <w:r>
         <w:t>Advanced analytics.</w:t>
@@ -565,7 +942,6 @@
     <w:p>
       <w:pPr>
         <w:pStyle w:val="ListBullet"/>
-        <w:spacing w:after="80" w:line="280" w:lineRule="auto"/>
       </w:pPr>
       <w:r>
         <w:t>Mobile applications.</w:t>
@@ -574,7 +950,6 @@
     <w:p>
       <w:pPr>
         <w:pStyle w:val="ListBullet"/>
-        <w:spacing w:after="80" w:line="280" w:lineRule="auto"/>
       </w:pPr>
       <w:r>
         <w:t>Billing and subscription management.</w:t>
@@ -583,7 +958,6 @@
     <w:p>
       <w:pPr>
         <w:pStyle w:val="ListBullet"/>
-        <w:spacing w:after="80" w:line="280" w:lineRule="auto"/>
       </w:pPr>
       <w:r>
         <w:t>Marketplace integrations.</w:t>
@@ -592,7 +966,6 @@
     <w:p>
       <w:pPr>
         <w:pStyle w:val="ListBullet"/>
-        <w:spacing w:after="80" w:line="280" w:lineRule="auto"/>
       </w:pPr>
       <w:r>
         <w:t>Full CRM functionality.</w:t>
@@ -603,22 +976,36 @@
         <w:pStyle w:val="Heading1"/>
       </w:pPr>
       <w:r>
-        <w:t>5. User Stories</w:t>
+        <w:t>6. User Stories</w:t>
       </w:r>
     </w:p>
     <w:p>
       <w:pPr>
         <w:pStyle w:val="ListBullet"/>
-        <w:spacing w:after="80" w:line="280" w:lineRule="auto"/>
       </w:pPr>
       <w:r>
-        <w:t>As a workspace owner, I can connect a Telegram bot so that pilot messages enter RelayFlow.</w:t>
+        <w:t>As a workspace owner, I can create or switch workspaces.</w:t>
       </w:r>
     </w:p>
     <w:p>
       <w:pPr>
         <w:pStyle w:val="ListBullet"/>
-        <w:spacing w:after="80" w:line="280" w:lineRule="auto"/>
+      </w:pPr>
+      <w:r>
+        <w:t>As a workspace owner, I can connect a Telegram bot so messages enter RelayFlow.</w:t>
+      </w:r>
+    </w:p>
+    <w:p>
+      <w:pPr>
+        <w:pStyle w:val="ListBullet"/>
+      </w:pPr>
+      <w:r>
+        <w:t>As a guest user, I can try the product through a temporary workspace and shared Telegram bot.</w:t>
+      </w:r>
+    </w:p>
+    <w:p>
+      <w:pPr>
+        <w:pStyle w:val="ListBullet"/>
       </w:pPr>
       <w:r>
         <w:t>As an agent, I can view conversations and reply from the inbox.</w:t>
@@ -627,46 +1014,41 @@
     <w:p>
       <w:pPr>
         <w:pStyle w:val="ListBullet"/>
-        <w:spacing w:after="80" w:line="280" w:lineRule="auto"/>
       </w:pPr>
       <w:r>
-        <w:t>As an admin, I can create a workflow triggered by a generic inbound message event.</w:t>
+        <w:t>As an admin, I can create a workflow triggered when a conversation opens.</w:t>
       </w:r>
     </w:p>
     <w:p>
       <w:pPr>
         <w:pStyle w:val="ListBullet"/>
-        <w:spacing w:after="80" w:line="280" w:lineRule="auto"/>
       </w:pPr>
       <w:r>
-        <w:t>As an admin, I can create, override, and inspect variables during a workflow run.</w:t>
+        <w:t>As an admin, I can create and overwrite workflow variables.</w:t>
       </w:r>
     </w:p>
     <w:p>
       <w:pPr>
         <w:pStyle w:val="ListBullet"/>
-        <w:spacing w:after="80" w:line="280" w:lineRule="auto"/>
       </w:pPr>
       <w:r>
-        <w:t>As an admin, I can call an external API with configurable timeout, retry count, retry delay, headers, body, and error behavior.</w:t>
+        <w:t>As an admin, I can call an external API with configurable method, URL, headers, body, content type, timeout, and response mappings.</w:t>
       </w:r>
     </w:p>
     <w:p>
       <w:pPr>
         <w:pStyle w:val="ListBullet"/>
-        <w:spacing w:after="80" w:line="280" w:lineRule="auto"/>
       </w:pPr>
       <w:r>
-        <w:t>As an admin, I can inspect a workflow run and see every step, input, output, branch decision, error, retry, and sent message.</w:t>
+        <w:t>As an admin, I can publish only workflows that pass graph validation.</w:t>
       </w:r>
     </w:p>
     <w:p>
       <w:pPr>
         <w:pStyle w:val="ListBullet"/>
-        <w:spacing w:after="80" w:line="280" w:lineRule="auto"/>
       </w:pPr>
       <w:r>
-        <w:t>As a developer-user, I can test a workflow before publishing it.</w:t>
+        <w:t>As an admin, I should be able to inspect every workflow run and step in a future run logs UI.</w:t>
       </w:r>
     </w:p>
     <w:p>
@@ -674,7 +1056,7 @@
         <w:pStyle w:val="Heading1"/>
       </w:pPr>
       <w:r>
-        <w:t>6. Workflow Requirements</w:t>
+        <w:t>7. Workflow Requirements</w:t>
       </w:r>
     </w:p>
     <w:p>
@@ -682,2872 +1064,619 @@
         <w:pStyle w:val="Heading2"/>
       </w:pPr>
       <w:r>
-        <w:t>6.1 MVP Nodes</w:t>
-      </w:r>
-    </w:p>
-    <w:tbl>
-      <w:tblPr>
-        <w:tblStyle w:val="TableGrid"/>
-        <w:tblW w:type="dxa" w:w="9360"/>
-        <w:jc w:val="left"/>
-        <w:tblLayout w:type="fixed"/>
-        <w:tblLook w:firstColumn="1" w:firstRow="1" w:lastColumn="0" w:lastRow="0" w:noHBand="0" w:noVBand="1" w:val="04A0"/>
-        <w:tblInd w:w="120" w:type="dxa"/>
-      </w:tblPr>
-      <w:tblGrid>
-        <w:gridCol w:w="2800"/>
-        <w:gridCol w:w="6560"/>
-      </w:tblGrid>
-      <w:tr>
-        <w:tc>
-          <w:tcPr>
-            <w:tcW w:type="dxa" w:w="2800"/>
-            <w:tcMar>
-              <w:top w:w="80" w:type="dxa"/>
-              <w:start w:w="120" w:type="dxa"/>
-              <w:bottom w:w="80" w:type="dxa"/>
-              <w:end w:w="120" w:type="dxa"/>
-            </w:tcMar>
-            <w:vAlign w:val="center"/>
-            <w:shd w:fill="F2F4F7"/>
-          </w:tcPr>
-          <w:p>
-            <w:pPr>
-              <w:spacing w:after="0" w:line="264" w:lineRule="auto"/>
-            </w:pPr>
-            <w:r/>
-            <w:r>
-              <w:rPr>
-                <w:rFonts w:ascii="Calibri" w:hAnsi="Calibri"/>
-                <w:b/>
-                <w:color w:val="0B2545"/>
-                <w:sz w:val="20"/>
-              </w:rPr>
-              <w:t>Node</w:t>
-            </w:r>
-          </w:p>
-        </w:tc>
-        <w:tc>
-          <w:tcPr>
-            <w:tcW w:type="dxa" w:w="6560"/>
-            <w:tcMar>
-              <w:top w:w="80" w:type="dxa"/>
-              <w:start w:w="120" w:type="dxa"/>
-              <w:bottom w:w="80" w:type="dxa"/>
-              <w:end w:w="120" w:type="dxa"/>
-            </w:tcMar>
-            <w:vAlign w:val="center"/>
-            <w:shd w:fill="F2F4F7"/>
-          </w:tcPr>
-          <w:p>
-            <w:pPr>
-              <w:spacing w:after="0" w:line="264" w:lineRule="auto"/>
-            </w:pPr>
-            <w:r/>
-            <w:r>
-              <w:rPr>
-                <w:rFonts w:ascii="Calibri" w:hAnsi="Calibri"/>
-                <w:b/>
-                <w:color w:val="0B2545"/>
-                <w:sz w:val="20"/>
-              </w:rPr>
-              <w:t>Purpose</w:t>
-            </w:r>
-          </w:p>
-        </w:tc>
-      </w:tr>
-      <w:tr>
-        <w:tc>
-          <w:tcPr>
-            <w:tcW w:type="dxa" w:w="2800"/>
-          </w:tcPr>
-          <w:p>
-            <w:pPr>
-              <w:spacing w:after="0" w:line="264" w:lineRule="auto"/>
-            </w:pPr>
-            <w:r/>
-            <w:r>
-              <w:rPr>
-                <w:rFonts w:ascii="Calibri" w:hAnsi="Calibri"/>
-                <w:b w:val="0"/>
-                <w:sz w:val="20"/>
-              </w:rPr>
-              <w:t>Trigger: message received</w:t>
-            </w:r>
-          </w:p>
-        </w:tc>
-        <w:tc>
-          <w:tcPr>
-            <w:tcW w:type="dxa" w:w="6560"/>
-          </w:tcPr>
-          <w:p>
-            <w:pPr>
-              <w:spacing w:after="0" w:line="264" w:lineRule="auto"/>
-            </w:pPr>
-            <w:r/>
-            <w:r>
-              <w:rPr>
-                <w:rFonts w:ascii="Calibri" w:hAnsi="Calibri"/>
-                <w:b w:val="0"/>
-                <w:sz w:val="20"/>
-              </w:rPr>
-              <w:t>Starts a workflow when a normalized inbound message event is stored.</w:t>
-            </w:r>
-          </w:p>
-        </w:tc>
-      </w:tr>
-      <w:tr>
-        <w:tc>
-          <w:tcPr>
-            <w:tcW w:type="dxa" w:w="2800"/>
-          </w:tcPr>
-          <w:p>
-            <w:pPr>
-              <w:spacing w:after="0" w:line="264" w:lineRule="auto"/>
-            </w:pPr>
-            <w:r/>
-            <w:r>
-              <w:rPr>
-                <w:rFonts w:ascii="Calibri" w:hAnsi="Calibri"/>
-                <w:b w:val="0"/>
-                <w:sz w:val="20"/>
-              </w:rPr>
-              <w:t>Set variable</w:t>
-            </w:r>
-          </w:p>
-        </w:tc>
-        <w:tc>
-          <w:tcPr>
-            <w:tcW w:type="dxa" w:w="6560"/>
-          </w:tcPr>
-          <w:p>
-            <w:pPr>
-              <w:spacing w:after="0" w:line="264" w:lineRule="auto"/>
-            </w:pPr>
-            <w:r/>
-            <w:r>
-              <w:rPr>
-                <w:rFonts w:ascii="Calibri" w:hAnsi="Calibri"/>
-                <w:b w:val="0"/>
-                <w:sz w:val="20"/>
-              </w:rPr>
-              <w:t>Creates or overrides a workflow variable with explicit type handling.</w:t>
-            </w:r>
-          </w:p>
-        </w:tc>
-      </w:tr>
-      <w:tr>
-        <w:tc>
-          <w:tcPr>
-            <w:tcW w:type="dxa" w:w="2800"/>
-          </w:tcPr>
-          <w:p>
-            <w:pPr>
-              <w:spacing w:after="0" w:line="264" w:lineRule="auto"/>
-            </w:pPr>
-            <w:r/>
-            <w:r>
-              <w:rPr>
-                <w:rFonts w:ascii="Calibri" w:hAnsi="Calibri"/>
-                <w:b w:val="0"/>
-                <w:sz w:val="20"/>
-              </w:rPr>
-              <w:t>Condition</w:t>
-            </w:r>
-          </w:p>
-        </w:tc>
-        <w:tc>
-          <w:tcPr>
-            <w:tcW w:type="dxa" w:w="6560"/>
-          </w:tcPr>
-          <w:p>
-            <w:pPr>
-              <w:spacing w:after="0" w:line="264" w:lineRule="auto"/>
-            </w:pPr>
-            <w:r/>
-            <w:r>
-              <w:rPr>
-                <w:rFonts w:ascii="Calibri" w:hAnsi="Calibri"/>
-                <w:b w:val="0"/>
-                <w:sz w:val="20"/>
-              </w:rPr>
-              <w:t>Branches based on variables, message content, contact fields, or HTTP results.</w:t>
-            </w:r>
-          </w:p>
-        </w:tc>
-      </w:tr>
-      <w:tr>
-        <w:tc>
-          <w:tcPr>
-            <w:tcW w:type="dxa" w:w="2800"/>
-          </w:tcPr>
-          <w:p>
-            <w:pPr>
-              <w:spacing w:after="0" w:line="264" w:lineRule="auto"/>
-            </w:pPr>
-            <w:r/>
-            <w:r>
-              <w:rPr>
-                <w:rFonts w:ascii="Calibri" w:hAnsi="Calibri"/>
-                <w:b w:val="0"/>
-                <w:sz w:val="20"/>
-              </w:rPr>
-              <w:t>HTTP request</w:t>
-            </w:r>
-          </w:p>
-        </w:tc>
-        <w:tc>
-          <w:tcPr>
-            <w:tcW w:type="dxa" w:w="6560"/>
-          </w:tcPr>
-          <w:p>
-            <w:pPr>
-              <w:spacing w:after="0" w:line="264" w:lineRule="auto"/>
-            </w:pPr>
-            <w:r/>
-            <w:r>
-              <w:rPr>
-                <w:rFonts w:ascii="Calibri" w:hAnsi="Calibri"/>
-                <w:b w:val="0"/>
-                <w:sz w:val="20"/>
-              </w:rPr>
-              <w:t>Calls external APIs with configurable timeout, retry, headers, auth, body, and response mapping.</w:t>
-            </w:r>
-          </w:p>
-        </w:tc>
-      </w:tr>
-      <w:tr>
-        <w:tc>
-          <w:tcPr>
-            <w:tcW w:type="dxa" w:w="2800"/>
-          </w:tcPr>
-          <w:p>
-            <w:pPr>
-              <w:spacing w:after="0" w:line="264" w:lineRule="auto"/>
-            </w:pPr>
-            <w:r/>
-            <w:r>
-              <w:rPr>
-                <w:rFonts w:ascii="Calibri" w:hAnsi="Calibri"/>
-                <w:b w:val="0"/>
-                <w:sz w:val="20"/>
-              </w:rPr>
-              <w:t>Send message</w:t>
-            </w:r>
-          </w:p>
-        </w:tc>
-        <w:tc>
-          <w:tcPr>
-            <w:tcW w:type="dxa" w:w="6560"/>
-          </w:tcPr>
-          <w:p>
-            <w:pPr>
-              <w:spacing w:after="0" w:line="264" w:lineRule="auto"/>
-            </w:pPr>
-            <w:r/>
-            <w:r>
-              <w:rPr>
-                <w:rFonts w:ascii="Calibri" w:hAnsi="Calibri"/>
-                <w:b w:val="0"/>
-                <w:sz w:val="20"/>
-              </w:rPr>
-              <w:t>Sends a channel-appropriate outbound message through the active channel adapter.</w:t>
-            </w:r>
-          </w:p>
-        </w:tc>
-      </w:tr>
-      <w:tr>
-        <w:tc>
-          <w:tcPr>
-            <w:tcW w:type="dxa" w:w="2800"/>
-          </w:tcPr>
-          <w:p>
-            <w:pPr>
-              <w:spacing w:after="0" w:line="264" w:lineRule="auto"/>
-            </w:pPr>
-            <w:r/>
-            <w:r>
-              <w:rPr>
-                <w:rFonts w:ascii="Calibri" w:hAnsi="Calibri"/>
-                <w:b w:val="0"/>
-                <w:sz w:val="20"/>
-              </w:rPr>
-              <w:t>Wait</w:t>
-            </w:r>
-          </w:p>
-        </w:tc>
-        <w:tc>
-          <w:tcPr>
-            <w:tcW w:type="dxa" w:w="6560"/>
-          </w:tcPr>
-          <w:p>
-            <w:pPr>
-              <w:spacing w:after="0" w:line="264" w:lineRule="auto"/>
-            </w:pPr>
-            <w:r/>
-            <w:r>
-              <w:rPr>
-                <w:rFonts w:ascii="Calibri" w:hAnsi="Calibri"/>
-                <w:b w:val="0"/>
-                <w:sz w:val="20"/>
-              </w:rPr>
-              <w:t>Pauses execution for a defined duration.</w:t>
-            </w:r>
-          </w:p>
-        </w:tc>
-      </w:tr>
-      <w:tr>
-        <w:tc>
-          <w:tcPr>
-            <w:tcW w:type="dxa" w:w="2800"/>
-          </w:tcPr>
-          <w:p>
-            <w:pPr>
-              <w:spacing w:after="0" w:line="264" w:lineRule="auto"/>
-            </w:pPr>
-            <w:r/>
-            <w:r>
-              <w:rPr>
-                <w:rFonts w:ascii="Calibri" w:hAnsi="Calibri"/>
-                <w:b w:val="0"/>
-                <w:sz w:val="20"/>
-              </w:rPr>
-              <w:t>End</w:t>
-            </w:r>
-          </w:p>
-        </w:tc>
-        <w:tc>
-          <w:tcPr>
-            <w:tcW w:type="dxa" w:w="6560"/>
-          </w:tcPr>
-          <w:p>
-            <w:pPr>
-              <w:spacing w:after="0" w:line="264" w:lineRule="auto"/>
-            </w:pPr>
-            <w:r/>
-            <w:r>
-              <w:rPr>
-                <w:rFonts w:ascii="Calibri" w:hAnsi="Calibri"/>
-                <w:b w:val="0"/>
-                <w:sz w:val="20"/>
-              </w:rPr>
-              <w:t>Completes or fails the workflow run.</w:t>
-            </w:r>
-          </w:p>
-        </w:tc>
-      </w:tr>
-    </w:tbl>
-    <w:p>
-      <w:pPr>
-        <w:pStyle w:val="Heading2"/>
-      </w:pPr>
-      <w:r>
-        <w:t>6.2 Variable System</w:t>
+        <w:t>7.1 Implemented Nodes</w:t>
       </w:r>
     </w:p>
     <w:p>
       <w:pPr>
         <w:pStyle w:val="ListBullet"/>
-        <w:spacing w:after="80" w:line="280" w:lineRule="auto"/>
       </w:pPr>
       <w:r>
-        <w:t>Support create, override, inspect, and map variable values.</w:t>
+        <w:t>Trigger: starts from conversation_opened.</w:t>
       </w:r>
     </w:p>
     <w:p>
       <w:pPr>
         <w:pStyle w:val="ListBullet"/>
-        <w:spacing w:after="80" w:line="280" w:lineRule="auto"/>
       </w:pPr>
       <w:r>
-        <w:t>Support string, number, boolean, object, and array values.</w:t>
+        <w:t>Send Message: sends an outbound workflow message through the channel adapter.</w:t>
       </w:r>
     </w:p>
     <w:p>
       <w:pPr>
         <w:pStyle w:val="ListBullet"/>
-        <w:spacing w:after="80" w:line="280" w:lineRule="auto"/>
       </w:pPr>
       <w:r>
-        <w:t>Separate system, contact, conversation, workflow, and node-output scopes.</w:t>
+        <w:t>Condition: supports multiple branches and comparison operators.</w:t>
       </w:r>
     </w:p>
     <w:p>
       <w:pPr>
         <w:pStyle w:val="ListBullet"/>
-        <w:spacing w:after="80" w:line="280" w:lineRule="auto"/>
       </w:pPr>
       <w:r>
-        <w:t>Support JSON path extraction from HTTP responses.</w:t>
+        <w:t>HTTP Request: supports method, URL, headers, body, content type, timeout, success/error branches, status variable, and JSON response mappings.</w:t>
       </w:r>
     </w:p>
     <w:p>
       <w:pPr>
         <w:pStyle w:val="ListBullet"/>
-        <w:spacing w:after="80" w:line="280" w:lineRule="auto"/>
       </w:pPr>
       <w:r>
-        <w:t>Capture variable snapshots in run logs for debugging.</w:t>
+        <w:t>Set Variable: creates or overwrites a variable.</w:t>
       </w:r>
     </w:p>
     <w:p>
       <w:pPr>
         <w:pStyle w:val="ListBullet"/>
-        <w:spacing w:after="80" w:line="280" w:lineRule="auto"/>
       </w:pPr>
       <w:r>
-        <w:t>Mask secrets and sensitive values in UI logs.</w:t>
+        <w:t>Ask Question: sends a question, pauses the run, and resumes when the contact replies.</w:t>
       </w:r>
     </w:p>
     <w:p>
       <w:pPr>
-        <w:pStyle w:val="Heading2"/>
+        <w:pStyle w:val="ListBullet"/>
       </w:pPr>
       <w:r>
-        <w:t>6.3 HTTP Step</w:t>
+        <w:t>Jump To: redirects execution to another node by ID with a configurable max-jump limit to prevent unbounded loops.</w:t>
+        <w:br/>
+        <w:t>End Conversation: optionally sends a closing message and sets the conversation to closed.</w:t>
       </w:r>
     </w:p>
     <w:p>
       <w:pPr>
-        <w:pStyle w:val="ListBullet"/>
-        <w:spacing w:after="80" w:line="280" w:lineRule="auto"/>
+        <w:pStyle w:val="Heading2"/>
       </w:pPr>
       <w:r>
-        <w:t>Methods: GET, POST, PUT, PATCH, DELETE.</w:t>
+        <w:t>7.2 Variable System</w:t>
       </w:r>
     </w:p>
     <w:p>
       <w:pPr>
-        <w:pStyle w:val="ListBullet"/>
-        <w:spacing w:after="80" w:line="280" w:lineRule="auto"/>
+        <w:spacing w:after="120"/>
       </w:pPr>
       <w:r>
-        <w:t>Configurable URL, headers, query parameters, JSON body, and auth.</w:t>
+        <w:t>The current runtime uses a flat variable map with dot-notation names. Built-in variables include workspace, conversation, contact, channel, and triggering message values. User-defined variables are produced by Set Variable, HTTP response mappings, and Ask Question responses.</w:t>
       </w:r>
     </w:p>
     <w:p>
       <w:pPr>
         <w:pStyle w:val="ListBullet"/>
-        <w:spacing w:after="80" w:line="280" w:lineRule="auto"/>
       </w:pPr>
       <w:r>
-        <w:t>Configurable timeout in seconds.</w:t>
+        <w:t>Variables are mutable and can be overwritten.</w:t>
       </w:r>
     </w:p>
     <w:p>
       <w:pPr>
         <w:pStyle w:val="ListBullet"/>
-        <w:spacing w:after="80" w:line="280" w:lineRule="auto"/>
       </w:pPr>
       <w:r>
-        <w:t>Configurable retry count and retry delay or backoff.</w:t>
+        <w:t>Text interpolation uses {{variable}} placeholders.</w:t>
       </w:r>
     </w:p>
     <w:p>
       <w:pPr>
         <w:pStyle w:val="ListBullet"/>
-        <w:spacing w:after="80" w:line="280" w:lineRule="auto"/>
       </w:pPr>
       <w:r>
-        <w:t>Success and error branches.</w:t>
+        <w:t>HTTP response mappings can write JSON path values into workflow variables.</w:t>
       </w:r>
     </w:p>
     <w:p>
       <w:pPr>
         <w:pStyle w:val="ListBullet"/>
-        <w:spacing w:after="80" w:line="280" w:lineRule="auto"/>
       </w:pPr>
       <w:r>
-        <w:t>Response body and status code mapping to variables.</w:t>
+        <w:t>Step input snapshots and output snapshots are persisted for observability.</w:t>
       </w:r>
     </w:p>
     <w:p>
       <w:pPr>
         <w:pStyle w:val="ListBullet"/>
-        <w:spacing w:after="80" w:line="280" w:lineRule="auto"/>
       </w:pPr>
       <w:r>
-        <w:t>Step-level request and response logs with secret masking.</w:t>
+        <w:t>Formal system/contact/conversation/workflow/node-output scopes remain a design target; current implementation approximates this with dot-notation keys.</w:t>
       </w:r>
     </w:p>
     <w:p>
       <w:pPr>
-        <w:pStyle w:val="Heading1"/>
+        <w:pStyle w:val="ListBullet"/>
       </w:pPr>
       <w:r>
-        <w:t>7. Architecture</w:t>
-      </w:r>
-    </w:p>
-    <w:tbl>
-      <w:tblPr>
-        <w:tblStyle w:val="TableGrid"/>
-        <w:tblW w:type="dxa" w:w="9360"/>
-        <w:jc w:val="left"/>
-        <w:tblLayout w:type="fixed"/>
-        <w:tblLook w:firstColumn="1" w:firstRow="1" w:lastColumn="0" w:lastRow="0" w:noHBand="0" w:noVBand="1" w:val="04A0"/>
-        <w:tblInd w:w="120" w:type="dxa"/>
-      </w:tblPr>
-      <w:tblGrid>
-        <w:gridCol w:w="9360"/>
-      </w:tblGrid>
-      <w:tr>
-        <w:tc>
-          <w:tcPr>
-            <w:tcW w:type="dxa" w:w="9360"/>
-            <w:tcMar>
-              <w:top w:w="140" w:type="dxa"/>
-              <w:start w:w="180" w:type="dxa"/>
-              <w:bottom w:w="140" w:type="dxa"/>
-              <w:end w:w="180" w:type="dxa"/>
-            </w:tcMar>
-            <w:vAlign w:val="center"/>
-            <w:shd w:fill="F4F6F9"/>
-          </w:tcPr>
-          <w:p>
-            <w:pPr>
-              <w:spacing w:after="0"/>
-            </w:pPr>
-            <w:r>
-              <w:rPr>
-                <w:rFonts w:ascii="Calibri" w:hAnsi="Calibri"/>
-                <w:b/>
-                <w:color w:val="1F3A5F"/>
-                <w:sz w:val="21"/>
-              </w:rPr>
-              <w:t xml:space="preserve">Architecture rule: </w:t>
-            </w:r>
-            <w:r>
-              <w:rPr>
-                <w:rFonts w:ascii="Calibri" w:hAnsi="Calibri"/>
-                <w:sz w:val="21"/>
-              </w:rPr>
-              <w:t>Do not make Telegram the center of the product. Telegram should be implemented as a channel provider. Core objects must stay generic.</w:t>
-            </w:r>
-          </w:p>
-        </w:tc>
-      </w:tr>
-    </w:tbl>
-    <w:p/>
-    <w:tbl>
-      <w:tblPr>
-        <w:tblStyle w:val="TableGrid"/>
-        <w:tblW w:type="dxa" w:w="9360"/>
-        <w:jc w:val="left"/>
-        <w:tblLayout w:type="fixed"/>
-        <w:tblLook w:firstColumn="1" w:firstRow="1" w:lastColumn="0" w:lastRow="0" w:noHBand="0" w:noVBand="1" w:val="04A0"/>
-        <w:tblInd w:w="120" w:type="dxa"/>
-      </w:tblPr>
-      <w:tblGrid>
-        <w:gridCol w:w="2400"/>
-        <w:gridCol w:w="6960"/>
-      </w:tblGrid>
-      <w:tr>
-        <w:tc>
-          <w:tcPr>
-            <w:tcW w:type="dxa" w:w="2400"/>
-            <w:tcMar>
-              <w:top w:w="80" w:type="dxa"/>
-              <w:start w:w="120" w:type="dxa"/>
-              <w:bottom w:w="80" w:type="dxa"/>
-              <w:end w:w="120" w:type="dxa"/>
-            </w:tcMar>
-            <w:vAlign w:val="center"/>
-            <w:shd w:fill="F2F4F7"/>
-          </w:tcPr>
-          <w:p>
-            <w:pPr>
-              <w:spacing w:after="0" w:line="264" w:lineRule="auto"/>
-            </w:pPr>
-            <w:r/>
-            <w:r>
-              <w:rPr>
-                <w:rFonts w:ascii="Calibri" w:hAnsi="Calibri"/>
-                <w:b/>
-                <w:color w:val="0B2545"/>
-                <w:sz w:val="20"/>
-              </w:rPr>
-              <w:t>Layer</w:t>
-            </w:r>
-          </w:p>
-        </w:tc>
-        <w:tc>
-          <w:tcPr>
-            <w:tcW w:type="dxa" w:w="6960"/>
-            <w:tcMar>
-              <w:top w:w="80" w:type="dxa"/>
-              <w:start w:w="120" w:type="dxa"/>
-              <w:bottom w:w="80" w:type="dxa"/>
-              <w:end w:w="120" w:type="dxa"/>
-            </w:tcMar>
-            <w:vAlign w:val="center"/>
-            <w:shd w:fill="F2F4F7"/>
-          </w:tcPr>
-          <w:p>
-            <w:pPr>
-              <w:spacing w:after="0" w:line="264" w:lineRule="auto"/>
-            </w:pPr>
-            <w:r/>
-            <w:r>
-              <w:rPr>
-                <w:rFonts w:ascii="Calibri" w:hAnsi="Calibri"/>
-                <w:b/>
-                <w:color w:val="0B2545"/>
-                <w:sz w:val="20"/>
-              </w:rPr>
-              <w:t>Responsibility</w:t>
-            </w:r>
-          </w:p>
-        </w:tc>
-      </w:tr>
-      <w:tr>
-        <w:tc>
-          <w:tcPr>
-            <w:tcW w:type="dxa" w:w="2400"/>
-          </w:tcPr>
-          <w:p>
-            <w:pPr>
-              <w:spacing w:after="0" w:line="264" w:lineRule="auto"/>
-            </w:pPr>
-            <w:r/>
-            <w:r>
-              <w:rPr>
-                <w:rFonts w:ascii="Calibri" w:hAnsi="Calibri"/>
-                <w:b w:val="0"/>
-                <w:sz w:val="20"/>
-              </w:rPr>
-              <w:t>Frontend</w:t>
-            </w:r>
-          </w:p>
-        </w:tc>
-        <w:tc>
-          <w:tcPr>
-            <w:tcW w:type="dxa" w:w="6960"/>
-          </w:tcPr>
-          <w:p>
-            <w:pPr>
-              <w:spacing w:after="0" w:line="264" w:lineRule="auto"/>
-            </w:pPr>
-            <w:r/>
-            <w:r>
-              <w:rPr>
-                <w:rFonts w:ascii="Calibri" w:hAnsi="Calibri"/>
-                <w:b w:val="0"/>
-                <w:sz w:val="20"/>
-              </w:rPr>
-              <w:t>Inbox, workflow builder, run logs, workspace settings, and channel setup.</w:t>
-            </w:r>
-          </w:p>
-        </w:tc>
-      </w:tr>
-      <w:tr>
-        <w:tc>
-          <w:tcPr>
-            <w:tcW w:type="dxa" w:w="2400"/>
-          </w:tcPr>
-          <w:p>
-            <w:pPr>
-              <w:spacing w:after="0" w:line="264" w:lineRule="auto"/>
-            </w:pPr>
-            <w:r/>
-            <w:r>
-              <w:rPr>
-                <w:rFonts w:ascii="Calibri" w:hAnsi="Calibri"/>
-                <w:b w:val="0"/>
-                <w:sz w:val="20"/>
-              </w:rPr>
-              <w:t>API backend</w:t>
-            </w:r>
-          </w:p>
-        </w:tc>
-        <w:tc>
-          <w:tcPr>
-            <w:tcW w:type="dxa" w:w="6960"/>
-          </w:tcPr>
-          <w:p>
-            <w:pPr>
-              <w:spacing w:after="0" w:line="264" w:lineRule="auto"/>
-            </w:pPr>
-            <w:r/>
-            <w:r>
-              <w:rPr>
-                <w:rFonts w:ascii="Calibri" w:hAnsi="Calibri"/>
-                <w:b w:val="0"/>
-                <w:sz w:val="20"/>
-              </w:rPr>
-              <w:t>Authentication, workspace authorization, domain services, workflow management, and channel orchestration.</w:t>
-            </w:r>
-          </w:p>
-        </w:tc>
-      </w:tr>
-      <w:tr>
-        <w:tc>
-          <w:tcPr>
-            <w:tcW w:type="dxa" w:w="2400"/>
-          </w:tcPr>
-          <w:p>
-            <w:pPr>
-              <w:spacing w:after="0" w:line="264" w:lineRule="auto"/>
-            </w:pPr>
-            <w:r/>
-            <w:r>
-              <w:rPr>
-                <w:rFonts w:ascii="Calibri" w:hAnsi="Calibri"/>
-                <w:b w:val="0"/>
-                <w:sz w:val="20"/>
-              </w:rPr>
-              <w:t>Messaging core</w:t>
-            </w:r>
-          </w:p>
-        </w:tc>
-        <w:tc>
-          <w:tcPr>
-            <w:tcW w:type="dxa" w:w="6960"/>
-          </w:tcPr>
-          <w:p>
-            <w:pPr>
-              <w:spacing w:after="0" w:line="264" w:lineRule="auto"/>
-            </w:pPr>
-            <w:r/>
-            <w:r>
-              <w:rPr>
-                <w:rFonts w:ascii="Calibri" w:hAnsi="Calibri"/>
-                <w:b w:val="0"/>
-                <w:sz w:val="20"/>
-              </w:rPr>
-              <w:t>Normalizes provider events into contacts, identities, conversations, and messages.</w:t>
-            </w:r>
-          </w:p>
-        </w:tc>
-      </w:tr>
-      <w:tr>
-        <w:tc>
-          <w:tcPr>
-            <w:tcW w:type="dxa" w:w="2400"/>
-          </w:tcPr>
-          <w:p>
-            <w:pPr>
-              <w:spacing w:after="0" w:line="264" w:lineRule="auto"/>
-            </w:pPr>
-            <w:r/>
-            <w:r>
-              <w:rPr>
-                <w:rFonts w:ascii="Calibri" w:hAnsi="Calibri"/>
-                <w:b w:val="0"/>
-                <w:sz w:val="20"/>
-              </w:rPr>
-              <w:t>Channel adapters</w:t>
-            </w:r>
-          </w:p>
-        </w:tc>
-        <w:tc>
-          <w:tcPr>
-            <w:tcW w:type="dxa" w:w="6960"/>
-          </w:tcPr>
-          <w:p>
-            <w:pPr>
-              <w:spacing w:after="0" w:line="264" w:lineRule="auto"/>
-            </w:pPr>
-            <w:r/>
-            <w:r>
-              <w:rPr>
-                <w:rFonts w:ascii="Calibri" w:hAnsi="Calibri"/>
-                <w:b w:val="0"/>
-                <w:sz w:val="20"/>
-              </w:rPr>
-              <w:t>Provider-specific webhook parsing, outbound send logic, auth, and rate-limit behavior.</w:t>
-            </w:r>
-          </w:p>
-        </w:tc>
-      </w:tr>
-      <w:tr>
-        <w:tc>
-          <w:tcPr>
-            <w:tcW w:type="dxa" w:w="2400"/>
-          </w:tcPr>
-          <w:p>
-            <w:pPr>
-              <w:spacing w:after="0" w:line="264" w:lineRule="auto"/>
-            </w:pPr>
-            <w:r/>
-            <w:r>
-              <w:rPr>
-                <w:rFonts w:ascii="Calibri" w:hAnsi="Calibri"/>
-                <w:b w:val="0"/>
-                <w:sz w:val="20"/>
-              </w:rPr>
-              <w:t>Workflow runtime</w:t>
-            </w:r>
-          </w:p>
-        </w:tc>
-        <w:tc>
-          <w:tcPr>
-            <w:tcW w:type="dxa" w:w="6960"/>
-          </w:tcPr>
-          <w:p>
-            <w:pPr>
-              <w:spacing w:after="0" w:line="264" w:lineRule="auto"/>
-            </w:pPr>
-            <w:r/>
-            <w:r>
-              <w:rPr>
-                <w:rFonts w:ascii="Calibri" w:hAnsi="Calibri"/>
-                <w:b w:val="0"/>
-                <w:sz w:val="20"/>
-              </w:rPr>
-              <w:t>Executes workflow versions, step transitions, retries, variables, logs, and idempotency.</w:t>
-            </w:r>
-          </w:p>
-        </w:tc>
-      </w:tr>
-      <w:tr>
-        <w:tc>
-          <w:tcPr>
-            <w:tcW w:type="dxa" w:w="2400"/>
-          </w:tcPr>
-          <w:p>
-            <w:pPr>
-              <w:spacing w:after="0" w:line="264" w:lineRule="auto"/>
-            </w:pPr>
-            <w:r/>
-            <w:r>
-              <w:rPr>
-                <w:rFonts w:ascii="Calibri" w:hAnsi="Calibri"/>
-                <w:b w:val="0"/>
-                <w:sz w:val="20"/>
-              </w:rPr>
-              <w:t>Database</w:t>
-            </w:r>
-          </w:p>
-        </w:tc>
-        <w:tc>
-          <w:tcPr>
-            <w:tcW w:type="dxa" w:w="6960"/>
-          </w:tcPr>
-          <w:p>
-            <w:pPr>
-              <w:spacing w:after="0" w:line="264" w:lineRule="auto"/>
-            </w:pPr>
-            <w:r/>
-            <w:r>
-              <w:rPr>
-                <w:rFonts w:ascii="Calibri" w:hAnsi="Calibri"/>
-                <w:b w:val="0"/>
-                <w:sz w:val="20"/>
-              </w:rPr>
-              <w:t>Stores users, workspaces, channels, contacts, conversations, messages, workflows, and runs.</w:t>
-            </w:r>
-          </w:p>
-        </w:tc>
-      </w:tr>
-    </w:tbl>
-    <w:p>
-      <w:pPr>
-        <w:pStyle w:val="Heading1"/>
-      </w:pPr>
-      <w:r>
-        <w:t>8. Technology Stack</w:t>
-      </w:r>
-    </w:p>
-    <w:tbl>
-      <w:tblPr>
-        <w:tblStyle w:val="TableGrid"/>
-        <w:tblW w:type="dxa" w:w="9360"/>
-        <w:jc w:val="left"/>
-        <w:tblLayout w:type="fixed"/>
-        <w:tblLook w:firstColumn="1" w:firstRow="1" w:lastColumn="0" w:lastRow="0" w:noHBand="0" w:noVBand="1" w:val="04A0"/>
-        <w:tblInd w:w="120" w:type="dxa"/>
-      </w:tblPr>
-      <w:tblGrid>
-        <w:gridCol w:w="2200"/>
-        <w:gridCol w:w="7160"/>
-      </w:tblGrid>
-      <w:tr>
-        <w:tc>
-          <w:tcPr>
-            <w:tcW w:type="dxa" w:w="2200"/>
-            <w:tcMar>
-              <w:top w:w="80" w:type="dxa"/>
-              <w:start w:w="120" w:type="dxa"/>
-              <w:bottom w:w="80" w:type="dxa"/>
-              <w:end w:w="120" w:type="dxa"/>
-            </w:tcMar>
-            <w:vAlign w:val="center"/>
-            <w:shd w:fill="F2F4F7"/>
-          </w:tcPr>
-          <w:p>
-            <w:pPr>
-              <w:spacing w:after="0" w:line="264" w:lineRule="auto"/>
-            </w:pPr>
-            <w:r/>
-            <w:r>
-              <w:rPr>
-                <w:rFonts w:ascii="Calibri" w:hAnsi="Calibri"/>
-                <w:b/>
-                <w:color w:val="0B2545"/>
-                <w:sz w:val="20"/>
-              </w:rPr>
-              <w:t>Area</w:t>
-            </w:r>
-          </w:p>
-        </w:tc>
-        <w:tc>
-          <w:tcPr>
-            <w:tcW w:type="dxa" w:w="7160"/>
-            <w:tcMar>
-              <w:top w:w="80" w:type="dxa"/>
-              <w:start w:w="120" w:type="dxa"/>
-              <w:bottom w:w="80" w:type="dxa"/>
-              <w:end w:w="120" w:type="dxa"/>
-            </w:tcMar>
-            <w:vAlign w:val="center"/>
-            <w:shd w:fill="F2F4F7"/>
-          </w:tcPr>
-          <w:p>
-            <w:pPr>
-              <w:spacing w:after="0" w:line="264" w:lineRule="auto"/>
-            </w:pPr>
-            <w:r/>
-            <w:r>
-              <w:rPr>
-                <w:rFonts w:ascii="Calibri" w:hAnsi="Calibri"/>
-                <w:b/>
-                <w:color w:val="0B2545"/>
-                <w:sz w:val="20"/>
-              </w:rPr>
-              <w:t>Decision</w:t>
-            </w:r>
-          </w:p>
-        </w:tc>
-      </w:tr>
-      <w:tr>
-        <w:tc>
-          <w:tcPr>
-            <w:tcW w:type="dxa" w:w="2200"/>
-          </w:tcPr>
-          <w:p>
-            <w:pPr>
-              <w:spacing w:after="0" w:line="264" w:lineRule="auto"/>
-            </w:pPr>
-            <w:r/>
-            <w:r>
-              <w:rPr>
-                <w:rFonts w:ascii="Calibri" w:hAnsi="Calibri"/>
-                <w:b w:val="0"/>
-                <w:sz w:val="20"/>
-              </w:rPr>
-              <w:t>Frontend</w:t>
-            </w:r>
-          </w:p>
-        </w:tc>
-        <w:tc>
-          <w:tcPr>
-            <w:tcW w:type="dxa" w:w="7160"/>
-          </w:tcPr>
-          <w:p>
-            <w:pPr>
-              <w:spacing w:after="0" w:line="264" w:lineRule="auto"/>
-            </w:pPr>
-            <w:r/>
-            <w:r>
-              <w:rPr>
-                <w:rFonts w:ascii="Calibri" w:hAnsi="Calibri"/>
-                <w:b w:val="0"/>
-                <w:sz w:val="20"/>
-              </w:rPr>
-              <w:t>Next.js, React, TypeScript, React Flow, TanStack Query, Tailwind CSS or shadcn/ui.</w:t>
-            </w:r>
-          </w:p>
-        </w:tc>
-      </w:tr>
-      <w:tr>
-        <w:tc>
-          <w:tcPr>
-            <w:tcW w:type="dxa" w:w="2200"/>
-          </w:tcPr>
-          <w:p>
-            <w:pPr>
-              <w:spacing w:after="0" w:line="264" w:lineRule="auto"/>
-            </w:pPr>
-            <w:r/>
-            <w:r>
-              <w:rPr>
-                <w:rFonts w:ascii="Calibri" w:hAnsi="Calibri"/>
-                <w:b w:val="0"/>
-                <w:sz w:val="20"/>
-              </w:rPr>
-              <w:t>Backend</w:t>
-            </w:r>
-          </w:p>
-        </w:tc>
-        <w:tc>
-          <w:tcPr>
-            <w:tcW w:type="dxa" w:w="7160"/>
-          </w:tcPr>
-          <w:p>
-            <w:pPr>
-              <w:spacing w:after="0" w:line="264" w:lineRule="auto"/>
-            </w:pPr>
-            <w:r/>
-            <w:r>
-              <w:rPr>
-                <w:rFonts w:ascii="Calibri" w:hAnsi="Calibri"/>
-                <w:b w:val="0"/>
-                <w:sz w:val="20"/>
-              </w:rPr>
-              <w:t>Java 21, Spring Boot 3, Spring Web, Spring Security, Spring Data JPA or jOOQ.</w:t>
-            </w:r>
-          </w:p>
-        </w:tc>
-      </w:tr>
-      <w:tr>
-        <w:tc>
-          <w:tcPr>
-            <w:tcW w:type="dxa" w:w="2200"/>
-          </w:tcPr>
-          <w:p>
-            <w:pPr>
-              <w:spacing w:after="0" w:line="264" w:lineRule="auto"/>
-            </w:pPr>
-            <w:r/>
-            <w:r>
-              <w:rPr>
-                <w:rFonts w:ascii="Calibri" w:hAnsi="Calibri"/>
-                <w:b w:val="0"/>
-                <w:sz w:val="20"/>
-              </w:rPr>
-              <w:t>Database</w:t>
-            </w:r>
-          </w:p>
-        </w:tc>
-        <w:tc>
-          <w:tcPr>
-            <w:tcW w:type="dxa" w:w="7160"/>
-          </w:tcPr>
-          <w:p>
-            <w:pPr>
-              <w:spacing w:after="0" w:line="264" w:lineRule="auto"/>
-            </w:pPr>
-            <w:r/>
-            <w:r>
-              <w:rPr>
-                <w:rFonts w:ascii="Calibri" w:hAnsi="Calibri"/>
-                <w:b w:val="0"/>
-                <w:sz w:val="20"/>
-              </w:rPr>
-              <w:t>PostgreSQL with Flyway migrations.</w:t>
-            </w:r>
-          </w:p>
-        </w:tc>
-      </w:tr>
-      <w:tr>
-        <w:tc>
-          <w:tcPr>
-            <w:tcW w:type="dxa" w:w="2200"/>
-          </w:tcPr>
-          <w:p>
-            <w:pPr>
-              <w:spacing w:after="0" w:line="264" w:lineRule="auto"/>
-            </w:pPr>
-            <w:r/>
-            <w:r>
-              <w:rPr>
-                <w:rFonts w:ascii="Calibri" w:hAnsi="Calibri"/>
-                <w:b w:val="0"/>
-                <w:sz w:val="20"/>
-              </w:rPr>
-              <w:t>Realtime</w:t>
-            </w:r>
-          </w:p>
-        </w:tc>
-        <w:tc>
-          <w:tcPr>
-            <w:tcW w:type="dxa" w:w="7160"/>
-          </w:tcPr>
-          <w:p>
-            <w:pPr>
-              <w:spacing w:after="0" w:line="264" w:lineRule="auto"/>
-            </w:pPr>
-            <w:r/>
-            <w:r>
-              <w:rPr>
-                <w:rFonts w:ascii="Calibri" w:hAnsi="Calibri"/>
-                <w:b w:val="0"/>
-                <w:sz w:val="20"/>
-              </w:rPr>
-              <w:t>Server-Sent Events or WebSocket for live inbox and workflow run updates.</w:t>
-            </w:r>
-          </w:p>
-        </w:tc>
-      </w:tr>
-      <w:tr>
-        <w:tc>
-          <w:tcPr>
-            <w:tcW w:type="dxa" w:w="2200"/>
-          </w:tcPr>
-          <w:p>
-            <w:pPr>
-              <w:spacing w:after="0" w:line="264" w:lineRule="auto"/>
-            </w:pPr>
-            <w:r/>
-            <w:r>
-              <w:rPr>
-                <w:rFonts w:ascii="Calibri" w:hAnsi="Calibri"/>
-                <w:b w:val="0"/>
-                <w:sz w:val="20"/>
-              </w:rPr>
-              <w:t>Workflow runtime</w:t>
-            </w:r>
-          </w:p>
-        </w:tc>
-        <w:tc>
-          <w:tcPr>
-            <w:tcW w:type="dxa" w:w="7160"/>
-          </w:tcPr>
-          <w:p>
-            <w:pPr>
-              <w:spacing w:after="0" w:line="264" w:lineRule="auto"/>
-            </w:pPr>
-            <w:r/>
-            <w:r>
-              <w:rPr>
-                <w:rFonts w:ascii="Calibri" w:hAnsi="Calibri"/>
-                <w:b w:val="0"/>
-                <w:sz w:val="20"/>
-              </w:rPr>
-              <w:t>Simple custom runtime for MVP; Temporal Java SDK when long-running durable execution becomes central.</w:t>
-            </w:r>
-          </w:p>
-        </w:tc>
-      </w:tr>
-      <w:tr>
-        <w:tc>
-          <w:tcPr>
-            <w:tcW w:type="dxa" w:w="2200"/>
-          </w:tcPr>
-          <w:p>
-            <w:pPr>
-              <w:spacing w:after="0" w:line="264" w:lineRule="auto"/>
-            </w:pPr>
-            <w:r/>
-            <w:r>
-              <w:rPr>
-                <w:rFonts w:ascii="Calibri" w:hAnsi="Calibri"/>
-                <w:b w:val="0"/>
-                <w:sz w:val="20"/>
-              </w:rPr>
-              <w:t>Queue/cache</w:t>
-            </w:r>
-          </w:p>
-        </w:tc>
-        <w:tc>
-          <w:tcPr>
-            <w:tcW w:type="dxa" w:w="7160"/>
-          </w:tcPr>
-          <w:p>
-            <w:pPr>
-              <w:spacing w:after="0" w:line="264" w:lineRule="auto"/>
-            </w:pPr>
-            <w:r/>
-            <w:r>
-              <w:rPr>
-                <w:rFonts w:ascii="Calibri" w:hAnsi="Calibri"/>
-                <w:b w:val="0"/>
-                <w:sz w:val="20"/>
-              </w:rPr>
-              <w:t>Redis optional for async jobs, rate limits, and short-lived coordination.</w:t>
-            </w:r>
-          </w:p>
-        </w:tc>
-      </w:tr>
-      <w:tr>
-        <w:tc>
-          <w:tcPr>
-            <w:tcW w:type="dxa" w:w="2200"/>
-          </w:tcPr>
-          <w:p>
-            <w:pPr>
-              <w:spacing w:after="0" w:line="264" w:lineRule="auto"/>
-            </w:pPr>
-            <w:r/>
-            <w:r>
-              <w:rPr>
-                <w:rFonts w:ascii="Calibri" w:hAnsi="Calibri"/>
-                <w:b w:val="0"/>
-                <w:sz w:val="20"/>
-              </w:rPr>
-              <w:t>Infrastructure</w:t>
-            </w:r>
-          </w:p>
-        </w:tc>
-        <w:tc>
-          <w:tcPr>
-            <w:tcW w:type="dxa" w:w="7160"/>
-          </w:tcPr>
-          <w:p>
-            <w:pPr>
-              <w:spacing w:after="0" w:line="264" w:lineRule="auto"/>
-            </w:pPr>
-            <w:r/>
-            <w:r>
-              <w:rPr>
-                <w:rFonts w:ascii="Calibri" w:hAnsi="Calibri"/>
-                <w:b w:val="0"/>
-                <w:sz w:val="20"/>
-              </w:rPr>
-              <w:t>Docker and Docker Compose locally; Render, Fly.io, Railway, or AWS ECS for early deployment.</w:t>
-            </w:r>
-          </w:p>
-        </w:tc>
-      </w:tr>
-      <w:tr>
-        <w:tc>
-          <w:tcPr>
-            <w:tcW w:type="dxa" w:w="2200"/>
-          </w:tcPr>
-          <w:p>
-            <w:pPr>
-              <w:spacing w:after="0" w:line="264" w:lineRule="auto"/>
-            </w:pPr>
-            <w:r/>
-            <w:r>
-              <w:rPr>
-                <w:rFonts w:ascii="Calibri" w:hAnsi="Calibri"/>
-                <w:b w:val="0"/>
-                <w:sz w:val="20"/>
-              </w:rPr>
-              <w:t>Observability</w:t>
-            </w:r>
-          </w:p>
-        </w:tc>
-        <w:tc>
-          <w:tcPr>
-            <w:tcW w:type="dxa" w:w="7160"/>
-          </w:tcPr>
-          <w:p>
-            <w:pPr>
-              <w:spacing w:after="0" w:line="264" w:lineRule="auto"/>
-            </w:pPr>
-            <w:r/>
-            <w:r>
-              <w:rPr>
-                <w:rFonts w:ascii="Calibri" w:hAnsi="Calibri"/>
-                <w:b w:val="0"/>
-                <w:sz w:val="20"/>
-              </w:rPr>
-              <w:t>Structured JSON logs, request IDs, workflow run IDs, Sentry, and OpenTelemetry later.</w:t>
-            </w:r>
-          </w:p>
-        </w:tc>
-      </w:tr>
-      <w:tr>
-        <w:tc>
-          <w:tcPr>
-            <w:tcW w:type="dxa" w:w="2200"/>
-          </w:tcPr>
-          <w:p>
-            <w:pPr>
-              <w:spacing w:after="0" w:line="264" w:lineRule="auto"/>
-            </w:pPr>
-            <w:r/>
-            <w:r>
-              <w:rPr>
-                <w:rFonts w:ascii="Calibri" w:hAnsi="Calibri"/>
-                <w:b w:val="0"/>
-                <w:sz w:val="20"/>
-              </w:rPr>
-              <w:t>Testing</w:t>
-            </w:r>
-          </w:p>
-        </w:tc>
-        <w:tc>
-          <w:tcPr>
-            <w:tcW w:type="dxa" w:w="7160"/>
-          </w:tcPr>
-          <w:p>
-            <w:pPr>
-              <w:spacing w:after="0" w:line="264" w:lineRule="auto"/>
-            </w:pPr>
-            <w:r/>
-            <w:r>
-              <w:rPr>
-                <w:rFonts w:ascii="Calibri" w:hAnsi="Calibri"/>
-                <w:b w:val="0"/>
-                <w:sz w:val="20"/>
-              </w:rPr>
-              <w:t>JUnit 5, Testcontainers, Spring Boot integration tests, and Playwright for frontend flows.</w:t>
-            </w:r>
-          </w:p>
-        </w:tc>
-      </w:tr>
-    </w:tbl>
-    <w:p>
-      <w:pPr>
-        <w:pStyle w:val="Heading1"/>
-      </w:pPr>
-      <w:r>
-        <w:t>9. Data Model</w:t>
+        <w:t>Secret masking is still planned.</w:t>
       </w:r>
     </w:p>
     <w:p>
+      <w:pPr>
+        <w:pStyle w:val="Heading2"/>
+      </w:pPr>
       <w:r>
-        <w:t>The core schema should be channel-agnostic. Provider-specific identifiers should live in external identity or provider metadata records.</w:t>
-      </w:r>
-    </w:p>
-    <w:tbl>
-      <w:tblPr>
-        <w:tblStyle w:val="TableGrid"/>
-        <w:tblW w:type="dxa" w:w="9360"/>
-        <w:jc w:val="left"/>
-        <w:tblLayout w:type="fixed"/>
-        <w:tblLook w:firstColumn="1" w:firstRow="1" w:lastColumn="0" w:lastRow="0" w:noHBand="0" w:noVBand="1" w:val="04A0"/>
-        <w:tblInd w:w="120" w:type="dxa"/>
-      </w:tblPr>
-      <w:tblGrid>
-        <w:gridCol w:w="2600"/>
-        <w:gridCol w:w="6760"/>
-      </w:tblGrid>
-      <w:tr>
-        <w:tc>
-          <w:tcPr>
-            <w:tcW w:type="dxa" w:w="2600"/>
-            <w:tcMar>
-              <w:top w:w="80" w:type="dxa"/>
-              <w:start w:w="120" w:type="dxa"/>
-              <w:bottom w:w="80" w:type="dxa"/>
-              <w:end w:w="120" w:type="dxa"/>
-            </w:tcMar>
-            <w:vAlign w:val="center"/>
-            <w:shd w:fill="F2F4F7"/>
-          </w:tcPr>
-          <w:p>
-            <w:pPr>
-              <w:spacing w:after="0" w:line="264" w:lineRule="auto"/>
-            </w:pPr>
-            <w:r/>
-            <w:r>
-              <w:rPr>
-                <w:rFonts w:ascii="Calibri" w:hAnsi="Calibri"/>
-                <w:b/>
-                <w:color w:val="0B2545"/>
-                <w:sz w:val="20"/>
-              </w:rPr>
-              <w:t>Table</w:t>
-            </w:r>
-          </w:p>
-        </w:tc>
-        <w:tc>
-          <w:tcPr>
-            <w:tcW w:type="dxa" w:w="6760"/>
-            <w:tcMar>
-              <w:top w:w="80" w:type="dxa"/>
-              <w:start w:w="120" w:type="dxa"/>
-              <w:bottom w:w="80" w:type="dxa"/>
-              <w:end w:w="120" w:type="dxa"/>
-            </w:tcMar>
-            <w:vAlign w:val="center"/>
-            <w:shd w:fill="F2F4F7"/>
-          </w:tcPr>
-          <w:p>
-            <w:pPr>
-              <w:spacing w:after="0" w:line="264" w:lineRule="auto"/>
-            </w:pPr>
-            <w:r/>
-            <w:r>
-              <w:rPr>
-                <w:rFonts w:ascii="Calibri" w:hAnsi="Calibri"/>
-                <w:b/>
-                <w:color w:val="0B2545"/>
-                <w:sz w:val="20"/>
-              </w:rPr>
-              <w:t>Purpose</w:t>
-            </w:r>
-          </w:p>
-        </w:tc>
-      </w:tr>
-      <w:tr>
-        <w:tc>
-          <w:tcPr>
-            <w:tcW w:type="dxa" w:w="2600"/>
-          </w:tcPr>
-          <w:p>
-            <w:pPr>
-              <w:spacing w:after="0" w:line="264" w:lineRule="auto"/>
-            </w:pPr>
-            <w:r/>
-            <w:r>
-              <w:rPr>
-                <w:rFonts w:ascii="Calibri" w:hAnsi="Calibri"/>
-                <w:b w:val="0"/>
-                <w:sz w:val="20"/>
-              </w:rPr>
-              <w:t>workspaces</w:t>
-            </w:r>
-          </w:p>
-        </w:tc>
-        <w:tc>
-          <w:tcPr>
-            <w:tcW w:type="dxa" w:w="6760"/>
-          </w:tcPr>
-          <w:p>
-            <w:pPr>
-              <w:spacing w:after="0" w:line="264" w:lineRule="auto"/>
-            </w:pPr>
-            <w:r/>
-            <w:r>
-              <w:rPr>
-                <w:rFonts w:ascii="Calibri" w:hAnsi="Calibri"/>
-                <w:b w:val="0"/>
-                <w:sz w:val="20"/>
-              </w:rPr>
-              <w:t>Tenant boundary for users, channels, contacts, conversations, and workflows.</w:t>
-            </w:r>
-          </w:p>
-        </w:tc>
-      </w:tr>
-      <w:tr>
-        <w:tc>
-          <w:tcPr>
-            <w:tcW w:type="dxa" w:w="2600"/>
-          </w:tcPr>
-          <w:p>
-            <w:pPr>
-              <w:spacing w:after="0" w:line="264" w:lineRule="auto"/>
-            </w:pPr>
-            <w:r/>
-            <w:r>
-              <w:rPr>
-                <w:rFonts w:ascii="Calibri" w:hAnsi="Calibri"/>
-                <w:b w:val="0"/>
-                <w:sz w:val="20"/>
-              </w:rPr>
-              <w:t>users</w:t>
-            </w:r>
-          </w:p>
-        </w:tc>
-        <w:tc>
-          <w:tcPr>
-            <w:tcW w:type="dxa" w:w="6760"/>
-          </w:tcPr>
-          <w:p>
-            <w:pPr>
-              <w:spacing w:after="0" w:line="264" w:lineRule="auto"/>
-            </w:pPr>
-            <w:r/>
-            <w:r>
-              <w:rPr>
-                <w:rFonts w:ascii="Calibri" w:hAnsi="Calibri"/>
-                <w:b w:val="0"/>
-                <w:sz w:val="20"/>
-              </w:rPr>
-              <w:t>Platform user accounts.</w:t>
-            </w:r>
-          </w:p>
-        </w:tc>
-      </w:tr>
-      <w:tr>
-        <w:tc>
-          <w:tcPr>
-            <w:tcW w:type="dxa" w:w="2600"/>
-          </w:tcPr>
-          <w:p>
-            <w:pPr>
-              <w:spacing w:after="0" w:line="264" w:lineRule="auto"/>
-            </w:pPr>
-            <w:r/>
-            <w:r>
-              <w:rPr>
-                <w:rFonts w:ascii="Calibri" w:hAnsi="Calibri"/>
-                <w:b w:val="0"/>
-                <w:sz w:val="20"/>
-              </w:rPr>
-              <w:t>workspace_members</w:t>
-            </w:r>
-          </w:p>
-        </w:tc>
-        <w:tc>
-          <w:tcPr>
-            <w:tcW w:type="dxa" w:w="6760"/>
-          </w:tcPr>
-          <w:p>
-            <w:pPr>
-              <w:spacing w:after="0" w:line="264" w:lineRule="auto"/>
-            </w:pPr>
-            <w:r/>
-            <w:r>
-              <w:rPr>
-                <w:rFonts w:ascii="Calibri" w:hAnsi="Calibri"/>
-                <w:b w:val="0"/>
-                <w:sz w:val="20"/>
-              </w:rPr>
-              <w:t>User role and membership within a workspace.</w:t>
-            </w:r>
-          </w:p>
-        </w:tc>
-      </w:tr>
-      <w:tr>
-        <w:tc>
-          <w:tcPr>
-            <w:tcW w:type="dxa" w:w="2600"/>
-          </w:tcPr>
-          <w:p>
-            <w:pPr>
-              <w:spacing w:after="0" w:line="264" w:lineRule="auto"/>
-            </w:pPr>
-            <w:r/>
-            <w:r>
-              <w:rPr>
-                <w:rFonts w:ascii="Calibri" w:hAnsi="Calibri"/>
-                <w:b w:val="0"/>
-                <w:sz w:val="20"/>
-              </w:rPr>
-              <w:t>channel_accounts</w:t>
-            </w:r>
-          </w:p>
-        </w:tc>
-        <w:tc>
-          <w:tcPr>
-            <w:tcW w:type="dxa" w:w="6760"/>
-          </w:tcPr>
-          <w:p>
-            <w:pPr>
-              <w:spacing w:after="0" w:line="264" w:lineRule="auto"/>
-            </w:pPr>
-            <w:r/>
-            <w:r>
-              <w:rPr>
-                <w:rFonts w:ascii="Calibri" w:hAnsi="Calibri"/>
-                <w:b w:val="0"/>
-                <w:sz w:val="20"/>
-              </w:rPr>
-              <w:t>Connected provider accounts such as Telegram bot, WhatsApp number, or Instagram account.</w:t>
-            </w:r>
-          </w:p>
-        </w:tc>
-      </w:tr>
-      <w:tr>
-        <w:tc>
-          <w:tcPr>
-            <w:tcW w:type="dxa" w:w="2600"/>
-          </w:tcPr>
-          <w:p>
-            <w:pPr>
-              <w:spacing w:after="0" w:line="264" w:lineRule="auto"/>
-            </w:pPr>
-            <w:r/>
-            <w:r>
-              <w:rPr>
-                <w:rFonts w:ascii="Calibri" w:hAnsi="Calibri"/>
-                <w:b w:val="0"/>
-                <w:sz w:val="20"/>
-              </w:rPr>
-              <w:t>contacts</w:t>
-            </w:r>
-          </w:p>
-        </w:tc>
-        <w:tc>
-          <w:tcPr>
-            <w:tcW w:type="dxa" w:w="6760"/>
-          </w:tcPr>
-          <w:p>
-            <w:pPr>
-              <w:spacing w:after="0" w:line="264" w:lineRule="auto"/>
-            </w:pPr>
-            <w:r/>
-            <w:r>
-              <w:rPr>
-                <w:rFonts w:ascii="Calibri" w:hAnsi="Calibri"/>
-                <w:b w:val="0"/>
-                <w:sz w:val="20"/>
-              </w:rPr>
-              <w:t>Generic person or customer record within a workspace.</w:t>
-            </w:r>
-          </w:p>
-        </w:tc>
-      </w:tr>
-      <w:tr>
-        <w:tc>
-          <w:tcPr>
-            <w:tcW w:type="dxa" w:w="2600"/>
-          </w:tcPr>
-          <w:p>
-            <w:pPr>
-              <w:spacing w:after="0" w:line="264" w:lineRule="auto"/>
-            </w:pPr>
-            <w:r/>
-            <w:r>
-              <w:rPr>
-                <w:rFonts w:ascii="Calibri" w:hAnsi="Calibri"/>
-                <w:b w:val="0"/>
-                <w:sz w:val="20"/>
-              </w:rPr>
-              <w:t>external_identities</w:t>
-            </w:r>
-          </w:p>
-        </w:tc>
-        <w:tc>
-          <w:tcPr>
-            <w:tcW w:type="dxa" w:w="6760"/>
-          </w:tcPr>
-          <w:p>
-            <w:pPr>
-              <w:spacing w:after="0" w:line="264" w:lineRule="auto"/>
-            </w:pPr>
-            <w:r/>
-            <w:r>
-              <w:rPr>
-                <w:rFonts w:ascii="Calibri" w:hAnsi="Calibri"/>
-                <w:b w:val="0"/>
-                <w:sz w:val="20"/>
-              </w:rPr>
-              <w:t>Provider-specific identity mapping such as Telegram user ID or future WhatsApp phone ID.</w:t>
-            </w:r>
-          </w:p>
-        </w:tc>
-      </w:tr>
-      <w:tr>
-        <w:tc>
-          <w:tcPr>
-            <w:tcW w:type="dxa" w:w="2600"/>
-          </w:tcPr>
-          <w:p>
-            <w:pPr>
-              <w:spacing w:after="0" w:line="264" w:lineRule="auto"/>
-            </w:pPr>
-            <w:r/>
-            <w:r>
-              <w:rPr>
-                <w:rFonts w:ascii="Calibri" w:hAnsi="Calibri"/>
-                <w:b w:val="0"/>
-                <w:sz w:val="20"/>
-              </w:rPr>
-              <w:t>conversations</w:t>
-            </w:r>
-          </w:p>
-        </w:tc>
-        <w:tc>
-          <w:tcPr>
-            <w:tcW w:type="dxa" w:w="6760"/>
-          </w:tcPr>
-          <w:p>
-            <w:pPr>
-              <w:spacing w:after="0" w:line="264" w:lineRule="auto"/>
-            </w:pPr>
-            <w:r/>
-            <w:r>
-              <w:rPr>
-                <w:rFonts w:ascii="Calibri" w:hAnsi="Calibri"/>
-                <w:b w:val="0"/>
-                <w:sz w:val="20"/>
-              </w:rPr>
-              <w:t>Thread of interaction between a contact and a channel account.</w:t>
-            </w:r>
-          </w:p>
-        </w:tc>
-      </w:tr>
-      <w:tr>
-        <w:tc>
-          <w:tcPr>
-            <w:tcW w:type="dxa" w:w="2600"/>
-          </w:tcPr>
-          <w:p>
-            <w:pPr>
-              <w:spacing w:after="0" w:line="264" w:lineRule="auto"/>
-            </w:pPr>
-            <w:r/>
-            <w:r>
-              <w:rPr>
-                <w:rFonts w:ascii="Calibri" w:hAnsi="Calibri"/>
-                <w:b w:val="0"/>
-                <w:sz w:val="20"/>
-              </w:rPr>
-              <w:t>messages</w:t>
-            </w:r>
-          </w:p>
-        </w:tc>
-        <w:tc>
-          <w:tcPr>
-            <w:tcW w:type="dxa" w:w="6760"/>
-          </w:tcPr>
-          <w:p>
-            <w:pPr>
-              <w:spacing w:after="0" w:line="264" w:lineRule="auto"/>
-            </w:pPr>
-            <w:r/>
-            <w:r>
-              <w:rPr>
-                <w:rFonts w:ascii="Calibri" w:hAnsi="Calibri"/>
-                <w:b w:val="0"/>
-                <w:sz w:val="20"/>
-              </w:rPr>
-              <w:t>Normalized inbound and outbound messages with raw provider payload retained for audit/debugging.</w:t>
-            </w:r>
-          </w:p>
-        </w:tc>
-      </w:tr>
-      <w:tr>
-        <w:tc>
-          <w:tcPr>
-            <w:tcW w:type="dxa" w:w="2600"/>
-          </w:tcPr>
-          <w:p>
-            <w:pPr>
-              <w:spacing w:after="0" w:line="264" w:lineRule="auto"/>
-            </w:pPr>
-            <w:r/>
-            <w:r>
-              <w:rPr>
-                <w:rFonts w:ascii="Calibri" w:hAnsi="Calibri"/>
-                <w:b w:val="0"/>
-                <w:sz w:val="20"/>
-              </w:rPr>
-              <w:t>workflow_definitions</w:t>
-            </w:r>
-          </w:p>
-        </w:tc>
-        <w:tc>
-          <w:tcPr>
-            <w:tcW w:type="dxa" w:w="6760"/>
-          </w:tcPr>
-          <w:p>
-            <w:pPr>
-              <w:spacing w:after="0" w:line="264" w:lineRule="auto"/>
-            </w:pPr>
-            <w:r/>
-            <w:r>
-              <w:rPr>
-                <w:rFonts w:ascii="Calibri" w:hAnsi="Calibri"/>
-                <w:b w:val="0"/>
-                <w:sz w:val="20"/>
-              </w:rPr>
-              <w:t>Editable workflow container.</w:t>
-            </w:r>
-          </w:p>
-        </w:tc>
-      </w:tr>
-      <w:tr>
-        <w:tc>
-          <w:tcPr>
-            <w:tcW w:type="dxa" w:w="2600"/>
-          </w:tcPr>
-          <w:p>
-            <w:pPr>
-              <w:spacing w:after="0" w:line="264" w:lineRule="auto"/>
-            </w:pPr>
-            <w:r/>
-            <w:r>
-              <w:rPr>
-                <w:rFonts w:ascii="Calibri" w:hAnsi="Calibri"/>
-                <w:b w:val="0"/>
-                <w:sz w:val="20"/>
-              </w:rPr>
-              <w:t>workflow_versions</w:t>
-            </w:r>
-          </w:p>
-        </w:tc>
-        <w:tc>
-          <w:tcPr>
-            <w:tcW w:type="dxa" w:w="6760"/>
-          </w:tcPr>
-          <w:p>
-            <w:pPr>
-              <w:spacing w:after="0" w:line="264" w:lineRule="auto"/>
-            </w:pPr>
-            <w:r/>
-            <w:r>
-              <w:rPr>
-                <w:rFonts w:ascii="Calibri" w:hAnsi="Calibri"/>
-                <w:b w:val="0"/>
-                <w:sz w:val="20"/>
-              </w:rPr>
-              <w:t>Published immutable versions used by runtime execution.</w:t>
-            </w:r>
-          </w:p>
-        </w:tc>
-      </w:tr>
-      <w:tr>
-        <w:tc>
-          <w:tcPr>
-            <w:tcW w:type="dxa" w:w="2600"/>
-          </w:tcPr>
-          <w:p>
-            <w:pPr>
-              <w:spacing w:after="0" w:line="264" w:lineRule="auto"/>
-            </w:pPr>
-            <w:r/>
-            <w:r>
-              <w:rPr>
-                <w:rFonts w:ascii="Calibri" w:hAnsi="Calibri"/>
-                <w:b w:val="0"/>
-                <w:sz w:val="20"/>
-              </w:rPr>
-              <w:t>workflow_runs</w:t>
-            </w:r>
-          </w:p>
-        </w:tc>
-        <w:tc>
-          <w:tcPr>
-            <w:tcW w:type="dxa" w:w="6760"/>
-          </w:tcPr>
-          <w:p>
-            <w:pPr>
-              <w:spacing w:after="0" w:line="264" w:lineRule="auto"/>
-            </w:pPr>
-            <w:r/>
-            <w:r>
-              <w:rPr>
-                <w:rFonts w:ascii="Calibri" w:hAnsi="Calibri"/>
-                <w:b w:val="0"/>
-                <w:sz w:val="20"/>
-              </w:rPr>
-              <w:t>Single workflow execution instance.</w:t>
-            </w:r>
-          </w:p>
-        </w:tc>
-      </w:tr>
-      <w:tr>
-        <w:tc>
-          <w:tcPr>
-            <w:tcW w:type="dxa" w:w="2600"/>
-          </w:tcPr>
-          <w:p>
-            <w:pPr>
-              <w:spacing w:after="0" w:line="264" w:lineRule="auto"/>
-            </w:pPr>
-            <w:r/>
-            <w:r>
-              <w:rPr>
-                <w:rFonts w:ascii="Calibri" w:hAnsi="Calibri"/>
-                <w:b w:val="0"/>
-                <w:sz w:val="20"/>
-              </w:rPr>
-              <w:t>workflow_run_steps</w:t>
-            </w:r>
-          </w:p>
-        </w:tc>
-        <w:tc>
-          <w:tcPr>
-            <w:tcW w:type="dxa" w:w="6760"/>
-          </w:tcPr>
-          <w:p>
-            <w:pPr>
-              <w:spacing w:after="0" w:line="264" w:lineRule="auto"/>
-            </w:pPr>
-            <w:r/>
-            <w:r>
-              <w:rPr>
-                <w:rFonts w:ascii="Calibri" w:hAnsi="Calibri"/>
-                <w:b w:val="0"/>
-                <w:sz w:val="20"/>
-              </w:rPr>
-              <w:t>Per-node execution records, inputs, outputs, status, retries, and errors.</w:t>
-            </w:r>
-          </w:p>
-        </w:tc>
-      </w:tr>
-      <w:tr>
-        <w:tc>
-          <w:tcPr>
-            <w:tcW w:type="dxa" w:w="2600"/>
-          </w:tcPr>
-          <w:p>
-            <w:pPr>
-              <w:spacing w:after="0" w:line="264" w:lineRule="auto"/>
-            </w:pPr>
-            <w:r/>
-            <w:r>
-              <w:rPr>
-                <w:rFonts w:ascii="Calibri" w:hAnsi="Calibri"/>
-                <w:b w:val="0"/>
-                <w:sz w:val="20"/>
-              </w:rPr>
-              <w:t>workflow_variables</w:t>
-            </w:r>
-          </w:p>
-        </w:tc>
-        <w:tc>
-          <w:tcPr>
-            <w:tcW w:type="dxa" w:w="6760"/>
-          </w:tcPr>
-          <w:p>
-            <w:pPr>
-              <w:spacing w:after="0" w:line="264" w:lineRule="auto"/>
-            </w:pPr>
-            <w:r/>
-            <w:r>
-              <w:rPr>
-                <w:rFonts w:ascii="Calibri" w:hAnsi="Calibri"/>
-                <w:b w:val="0"/>
-                <w:sz w:val="20"/>
-              </w:rPr>
-              <w:t>Scoped variables and snapshots for workflow execution.</w:t>
-            </w:r>
-          </w:p>
-        </w:tc>
-      </w:tr>
-    </w:tbl>
-    <w:p>
-      <w:pPr>
-        <w:pStyle w:val="Heading1"/>
-      </w:pPr>
-      <w:r>
-        <w:t>10. Execution Requirements</w:t>
+        <w:t>7.3 HTTP Step</w:t>
       </w:r>
     </w:p>
     <w:p>
       <w:pPr>
         <w:pStyle w:val="ListBullet"/>
-        <w:spacing w:after="80" w:line="280" w:lineRule="auto"/>
       </w:pPr>
       <w:r>
-        <w:t>Workflow runs must lock to a published workflow version.</w:t>
+        <w:t>Implemented: GET, POST, PUT, PATCH, DELETE.</w:t>
       </w:r>
     </w:p>
     <w:p>
       <w:pPr>
         <w:pStyle w:val="ListBullet"/>
-        <w:spacing w:after="80" w:line="280" w:lineRule="auto"/>
       </w:pPr>
       <w:r>
-        <w:t>Message send steps must be idempotent to prevent duplicate outbound messages after retry.</w:t>
+        <w:t>Implemented: URL interpolation, headers, body, content type, timeout in seconds.</w:t>
       </w:r>
     </w:p>
     <w:p>
       <w:pPr>
         <w:pStyle w:val="ListBullet"/>
-        <w:spacing w:after="80" w:line="280" w:lineRule="auto"/>
       </w:pPr>
       <w:r>
-        <w:t>Every step should write a structured log record.</w:t>
+        <w:t>Implemented: 2xx routes to success; non-2xx/network errors route to error and set error.message.</w:t>
       </w:r>
     </w:p>
     <w:p>
       <w:pPr>
         <w:pStyle w:val="ListBullet"/>
-        <w:spacing w:after="80" w:line="280" w:lineRule="auto"/>
       </w:pPr>
       <w:r>
-        <w:t>Every branch decision should be explainable from stored inputs and variables.</w:t>
+        <w:t>Implemented: response status variable and JSON path response mappings.</w:t>
       </w:r>
     </w:p>
     <w:p>
       <w:pPr>
         <w:pStyle w:val="ListBullet"/>
-        <w:spacing w:after="80" w:line="280" w:lineRule="auto"/>
       </w:pPr>
       <w:r>
-        <w:t>HTTP timeouts and retry exhaustion should support explicit error branches.</w:t>
+        <w:t>Planned: retry count, retry delay/backoff, auth helpers, and secret masking.</w:t>
       </w:r>
     </w:p>
     <w:p>
       <w:pPr>
-        <w:pStyle w:val="ListBullet"/>
-        <w:spacing w:after="80" w:line="280" w:lineRule="auto"/>
+        <w:pStyle w:val="Heading1"/>
       </w:pPr>
       <w:r>
-        <w:t>Test runs should not accidentally send real customer messages unless explicitly enabled.</w:t>
+        <w:t>8. Architecture</w:t>
       </w:r>
     </w:p>
     <w:p>
       <w:pPr>
         <w:pStyle w:val="ListBullet"/>
-        <w:spacing w:after="80" w:line="280" w:lineRule="auto"/>
       </w:pPr>
       <w:r>
-        <w:t>Webhook processing should handle duplicate, late, and out-of-order events.</w:t>
+        <w:t>Monorepo with Java Spring Boot API and Next.js frontend.</w:t>
       </w:r>
     </w:p>
     <w:p>
       <w:pPr>
-        <w:pStyle w:val="Heading1"/>
+        <w:pStyle w:val="ListBullet"/>
       </w:pPr>
       <w:r>
-        <w:t>11. Security Requirements</w:t>
+        <w:t>PostgreSQL stores users, workspaces, channel accounts, conversations, messages, workflow definitions, runs, and run steps.</w:t>
       </w:r>
     </w:p>
     <w:p>
       <w:pPr>
         <w:pStyle w:val="ListBullet"/>
-        <w:spacing w:after="80" w:line="280" w:lineRule="auto"/>
       </w:pPr>
       <w:r>
-        <w:t>Encrypt channel credentials such as Telegram bot tokens.</w:t>
+        <w:t>Flyway migrations are run manually; the API does not auto-migrate on startup.</w:t>
       </w:r>
     </w:p>
     <w:p>
       <w:pPr>
         <w:pStyle w:val="ListBullet"/>
-        <w:spacing w:after="80" w:line="280" w:lineRule="auto"/>
       </w:pPr>
       <w:r>
-        <w:t>Verify provider webhook secrets where supported.</w:t>
+        <w:t>Telegram webhooks normalize provider payloads into channel-agnostic records.</w:t>
       </w:r>
     </w:p>
     <w:p>
       <w:pPr>
         <w:pStyle w:val="ListBullet"/>
-        <w:spacing w:after="80" w:line="280" w:lineRule="auto"/>
       </w:pPr>
       <w:r>
-        <w:t>Enforce workspace-level authorization on all API access.</w:t>
+        <w:t>SSE broadcasts workspace updates to open inbox sessions.</w:t>
       </w:r>
     </w:p>
     <w:p>
       <w:pPr>
         <w:pStyle w:val="ListBullet"/>
-        <w:spacing w:after="80" w:line="280" w:lineRule="auto"/>
       </w:pPr>
       <w:r>
-        <w:t>Mask secrets in workflow editor previews and run logs.</w:t>
+        <w:t>Workflow definitions are stored as React Flow-style draft graph JSON.</w:t>
       </w:r>
     </w:p>
     <w:p>
       <w:pPr>
         <w:pStyle w:val="ListBullet"/>
-        <w:spacing w:after="80" w:line="280" w:lineRule="auto"/>
       </w:pPr>
       <w:r>
-        <w:t>Keep raw provider payloads for debugging, but apply retention and privacy controls.</w:t>
+        <w:t>Workflow execution is asynchronous and records durable run/step logs.</w:t>
       </w:r>
     </w:p>
     <w:p>
       <w:pPr>
-        <w:pStyle w:val="ListBullet"/>
-        <w:spacing w:after="80" w:line="280" w:lineRule="auto"/>
+        <w:pStyle w:val="Heading1"/>
       </w:pPr>
       <w:r>
-        <w:t>Audit workflow publishing, channel connection changes, role changes, and credential updates.</w:t>
+        <w:t>9. Technology Stack</w:t>
       </w:r>
     </w:p>
     <w:p>
       <w:pPr>
-        <w:pStyle w:val="Heading1"/>
+        <w:pStyle w:val="ListBullet"/>
       </w:pPr>
       <w:r>
-        <w:t>12. Milestones</w:t>
-      </w:r>
-    </w:p>
-    <w:tbl>
-      <w:tblPr>
-        <w:tblStyle w:val="TableGrid"/>
-        <w:tblW w:type="dxa" w:w="9360"/>
-        <w:jc w:val="left"/>
-        <w:tblLayout w:type="fixed"/>
-        <w:tblLook w:firstColumn="1" w:firstRow="1" w:lastColumn="0" w:lastRow="0" w:noHBand="0" w:noVBand="1" w:val="04A0"/>
-        <w:tblInd w:w="120" w:type="dxa"/>
-      </w:tblPr>
-      <w:tblGrid>
-        <w:gridCol w:w="2400"/>
-        <w:gridCol w:w="6960"/>
-      </w:tblGrid>
-      <w:tr>
-        <w:tc>
-          <w:tcPr>
-            <w:tcW w:type="dxa" w:w="2400"/>
-            <w:tcMar>
-              <w:top w:w="80" w:type="dxa"/>
-              <w:start w:w="120" w:type="dxa"/>
-              <w:bottom w:w="80" w:type="dxa"/>
-              <w:end w:w="120" w:type="dxa"/>
-            </w:tcMar>
-            <w:vAlign w:val="center"/>
-            <w:shd w:fill="F2F4F7"/>
-          </w:tcPr>
-          <w:p>
-            <w:pPr>
-              <w:spacing w:after="0" w:line="264" w:lineRule="auto"/>
-            </w:pPr>
-            <w:r/>
-            <w:r>
-              <w:rPr>
-                <w:rFonts w:ascii="Calibri" w:hAnsi="Calibri"/>
-                <w:b/>
-                <w:color w:val="0B2545"/>
-                <w:sz w:val="20"/>
-              </w:rPr>
-              <w:t>Milestone</w:t>
-            </w:r>
-          </w:p>
-        </w:tc>
-        <w:tc>
-          <w:tcPr>
-            <w:tcW w:type="dxa" w:w="6960"/>
-            <w:tcMar>
-              <w:top w:w="80" w:type="dxa"/>
-              <w:start w:w="120" w:type="dxa"/>
-              <w:bottom w:w="80" w:type="dxa"/>
-              <w:end w:w="120" w:type="dxa"/>
-            </w:tcMar>
-            <w:vAlign w:val="center"/>
-            <w:shd w:fill="F2F4F7"/>
-          </w:tcPr>
-          <w:p>
-            <w:pPr>
-              <w:spacing w:after="0" w:line="264" w:lineRule="auto"/>
-            </w:pPr>
-            <w:r/>
-            <w:r>
-              <w:rPr>
-                <w:rFonts w:ascii="Calibri" w:hAnsi="Calibri"/>
-                <w:b/>
-                <w:color w:val="0B2545"/>
-                <w:sz w:val="20"/>
-              </w:rPr>
-              <w:t>Deliverables</w:t>
-            </w:r>
-          </w:p>
-        </w:tc>
-      </w:tr>
-      <w:tr>
-        <w:tc>
-          <w:tcPr>
-            <w:tcW w:type="dxa" w:w="2400"/>
-          </w:tcPr>
-          <w:p>
-            <w:pPr>
-              <w:spacing w:after="0" w:line="264" w:lineRule="auto"/>
-            </w:pPr>
-            <w:r/>
-            <w:r>
-              <w:rPr>
-                <w:rFonts w:ascii="Calibri" w:hAnsi="Calibri"/>
-                <w:b w:val="0"/>
-                <w:sz w:val="20"/>
-              </w:rPr>
-              <w:t>1. Messaging core</w:t>
-            </w:r>
-          </w:p>
-        </w:tc>
-        <w:tc>
-          <w:tcPr>
-            <w:tcW w:type="dxa" w:w="6960"/>
-          </w:tcPr>
-          <w:p>
-            <w:pPr>
-              <w:spacing w:after="0" w:line="264" w:lineRule="auto"/>
-            </w:pPr>
-            <w:r/>
-            <w:r>
-              <w:rPr>
-                <w:rFonts w:ascii="Calibri" w:hAnsi="Calibri"/>
-                <w:b w:val="0"/>
-                <w:sz w:val="20"/>
-              </w:rPr>
-              <w:t>Telegram adapter, webhook receiver, generic persistence, inbound messages, outbound replies, basic inbox.</w:t>
-            </w:r>
-          </w:p>
-        </w:tc>
-      </w:tr>
-      <w:tr>
-        <w:tc>
-          <w:tcPr>
-            <w:tcW w:type="dxa" w:w="2400"/>
-          </w:tcPr>
-          <w:p>
-            <w:pPr>
-              <w:spacing w:after="0" w:line="264" w:lineRule="auto"/>
-            </w:pPr>
-            <w:r/>
-            <w:r>
-              <w:rPr>
-                <w:rFonts w:ascii="Calibri" w:hAnsi="Calibri"/>
-                <w:b w:val="0"/>
-                <w:sz w:val="20"/>
-              </w:rPr>
-              <w:t>2. Basic workflow runtime</w:t>
-            </w:r>
-          </w:p>
-        </w:tc>
-        <w:tc>
-          <w:tcPr>
-            <w:tcW w:type="dxa" w:w="6960"/>
-          </w:tcPr>
-          <w:p>
-            <w:pPr>
-              <w:spacing w:after="0" w:line="264" w:lineRule="auto"/>
-            </w:pPr>
-            <w:r/>
-            <w:r>
-              <w:rPr>
-                <w:rFonts w:ascii="Calibri" w:hAnsi="Calibri"/>
-                <w:b w:val="0"/>
-                <w:sz w:val="20"/>
-              </w:rPr>
-              <w:t>Message trigger, set variable node, send message node, run status, and step logs.</w:t>
-            </w:r>
-          </w:p>
-        </w:tc>
-      </w:tr>
-      <w:tr>
-        <w:tc>
-          <w:tcPr>
-            <w:tcW w:type="dxa" w:w="2400"/>
-          </w:tcPr>
-          <w:p>
-            <w:pPr>
-              <w:spacing w:after="0" w:line="264" w:lineRule="auto"/>
-            </w:pPr>
-            <w:r/>
-            <w:r>
-              <w:rPr>
-                <w:rFonts w:ascii="Calibri" w:hAnsi="Calibri"/>
-                <w:b w:val="0"/>
-                <w:sz w:val="20"/>
-              </w:rPr>
-              <w:t>3. HTTP automation</w:t>
-            </w:r>
-          </w:p>
-        </w:tc>
-        <w:tc>
-          <w:tcPr>
-            <w:tcW w:type="dxa" w:w="6960"/>
-          </w:tcPr>
-          <w:p>
-            <w:pPr>
-              <w:spacing w:after="0" w:line="264" w:lineRule="auto"/>
-            </w:pPr>
-            <w:r/>
-            <w:r>
-              <w:rPr>
-                <w:rFonts w:ascii="Calibri" w:hAnsi="Calibri"/>
-                <w:b w:val="0"/>
-                <w:sz w:val="20"/>
-              </w:rPr>
-              <w:t>HTTP node with timeout, retries, response mapping, success branch, and error branch.</w:t>
-            </w:r>
-          </w:p>
-        </w:tc>
-      </w:tr>
-      <w:tr>
-        <w:tc>
-          <w:tcPr>
-            <w:tcW w:type="dxa" w:w="2400"/>
-          </w:tcPr>
-          <w:p>
-            <w:pPr>
-              <w:spacing w:after="0" w:line="264" w:lineRule="auto"/>
-            </w:pPr>
-            <w:r/>
-            <w:r>
-              <w:rPr>
-                <w:rFonts w:ascii="Calibri" w:hAnsi="Calibri"/>
-                <w:b w:val="0"/>
-                <w:sz w:val="20"/>
-              </w:rPr>
-              <w:t>4. Workflow builder</w:t>
-            </w:r>
-          </w:p>
-        </w:tc>
-        <w:tc>
-          <w:tcPr>
-            <w:tcW w:type="dxa" w:w="6960"/>
-          </w:tcPr>
-          <w:p>
-            <w:pPr>
-              <w:spacing w:after="0" w:line="264" w:lineRule="auto"/>
-            </w:pPr>
-            <w:r/>
-            <w:r>
-              <w:rPr>
-                <w:rFonts w:ascii="Calibri" w:hAnsi="Calibri"/>
-                <w:b w:val="0"/>
-                <w:sz w:val="20"/>
-              </w:rPr>
-              <w:t>React Flow editor, save draft, publish version, and manual test run.</w:t>
-            </w:r>
-          </w:p>
-        </w:tc>
-      </w:tr>
-      <w:tr>
-        <w:tc>
-          <w:tcPr>
-            <w:tcW w:type="dxa" w:w="2400"/>
-          </w:tcPr>
-          <w:p>
-            <w:pPr>
-              <w:spacing w:after="0" w:line="264" w:lineRule="auto"/>
-            </w:pPr>
-            <w:r/>
-            <w:r>
-              <w:rPr>
-                <w:rFonts w:ascii="Calibri" w:hAnsi="Calibri"/>
-                <w:b w:val="0"/>
-                <w:sz w:val="20"/>
-              </w:rPr>
-              <w:t>5. Production readiness</w:t>
-            </w:r>
-          </w:p>
-        </w:tc>
-        <w:tc>
-          <w:tcPr>
-            <w:tcW w:type="dxa" w:w="6960"/>
-          </w:tcPr>
-          <w:p>
-            <w:pPr>
-              <w:spacing w:after="0" w:line="264" w:lineRule="auto"/>
-            </w:pPr>
-            <w:r/>
-            <w:r>
-              <w:rPr>
-                <w:rFonts w:ascii="Calibri" w:hAnsi="Calibri"/>
-                <w:b w:val="0"/>
-                <w:sz w:val="20"/>
-              </w:rPr>
-              <w:t>Auth, roles, webhook security, monitoring, deployment, and basic documentation.</w:t>
-            </w:r>
-          </w:p>
-        </w:tc>
-      </w:tr>
-    </w:tbl>
-    <w:p>
-      <w:pPr>
-        <w:pStyle w:val="Heading1"/>
-      </w:pPr>
-      <w:r>
-        <w:t>13. Build Order</w:t>
+        <w:t>Backend: Java 21, Spring Boot, Spring Security, Spring Data JPA, Flyway, PostgreSQL.</w:t>
       </w:r>
     </w:p>
     <w:p>
       <w:pPr>
-        <w:pStyle w:val="ListNumber"/>
-        <w:spacing w:after="80" w:line="280" w:lineRule="auto"/>
+        <w:pStyle w:val="ListBullet"/>
       </w:pPr>
       <w:r>
-        <w:t>Set up Spring Boot backend, Next.js frontend, PostgreSQL, and Docker Compose.</w:t>
+        <w:t>Frontend: Next.js, React, TypeScript, Tailwind CSS, TanStack Query, React Flow.</w:t>
       </w:r>
     </w:p>
     <w:p>
       <w:pPr>
-        <w:pStyle w:val="ListNumber"/>
-        <w:spacing w:after="80" w:line="280" w:lineRule="auto"/>
+        <w:pStyle w:val="ListBullet"/>
       </w:pPr>
       <w:r>
-        <w:t>Create workspace, user, channel account, contact, identity, conversation, and message schema.</w:t>
+        <w:t>Contracts: OpenAPI 3.1 and JSON Schema.</w:t>
       </w:r>
     </w:p>
     <w:p>
       <w:pPr>
-        <w:pStyle w:val="ListNumber"/>
-        <w:spacing w:after="80" w:line="280" w:lineRule="auto"/>
+        <w:pStyle w:val="ListBullet"/>
       </w:pPr>
       <w:r>
-        <w:t>Implement Telegram webhook ingestion and normalize inbound messages.</w:t>
+        <w:t>Testing: Maven/JUnit on backend; Vitest and Testing Library on frontend.</w:t>
       </w:r>
     </w:p>
     <w:p>
       <w:pPr>
-        <w:pStyle w:val="ListNumber"/>
-        <w:spacing w:after="80" w:line="280" w:lineRule="auto"/>
+        <w:pStyle w:val="ListBullet"/>
       </w:pPr>
       <w:r>
-        <w:t>Build agent reply API and Telegram outbound send path.</w:t>
+        <w:t>Local infrastructure: Docker Compose for PostgreSQL and Redis.</w:t>
       </w:r>
     </w:p>
     <w:p>
       <w:pPr>
-        <w:pStyle w:val="ListNumber"/>
-        <w:spacing w:after="80" w:line="280" w:lineRule="auto"/>
+        <w:pStyle w:val="Heading1"/>
       </w:pPr>
       <w:r>
-        <w:t>Create a basic inbox UI with realtime updates.</w:t>
+        <w:t>10. Data Model</w:t>
       </w:r>
     </w:p>
     <w:p>
       <w:pPr>
-        <w:pStyle w:val="ListNumber"/>
-        <w:spacing w:after="80" w:line="280" w:lineRule="auto"/>
+        <w:pStyle w:val="ListBullet"/>
       </w:pPr>
       <w:r>
-        <w:t>Add workflow definition and published version models.</w:t>
+        <w:t>users: account identity and authentication provider state.</w:t>
       </w:r>
     </w:p>
     <w:p>
       <w:pPr>
-        <w:pStyle w:val="ListNumber"/>
-        <w:spacing w:after="80" w:line="280" w:lineRule="auto"/>
+        <w:pStyle w:val="ListBullet"/>
       </w:pPr>
       <w:r>
-        <w:t>Implement workflow execution service with run and step logs.</w:t>
+        <w:t>workspaces and workspace_members: tenant and membership boundary.</w:t>
       </w:r>
     </w:p>
     <w:p>
       <w:pPr>
-        <w:pStyle w:val="ListNumber"/>
-        <w:spacing w:after="80" w:line="280" w:lineRule="auto"/>
+        <w:pStyle w:val="ListBullet"/>
       </w:pPr>
       <w:r>
-        <w:t>Add set variable and send message nodes.</w:t>
+        <w:t>channel_accounts: provider connection records and encrypted credentials.</w:t>
       </w:r>
     </w:p>
     <w:p>
       <w:pPr>
-        <w:pStyle w:val="ListNumber"/>
-        <w:spacing w:after="80" w:line="280" w:lineRule="auto"/>
+        <w:pStyle w:val="ListBullet"/>
       </w:pPr>
       <w:r>
-        <w:t>Add HTTP request node with timeout, retry, response mapping, and error branch.</w:t>
+        <w:t>contacts and external_identities: channel-neutral customer identity model.</w:t>
       </w:r>
     </w:p>
     <w:p>
       <w:pPr>
-        <w:pStyle w:val="ListNumber"/>
-        <w:spacing w:after="80" w:line="280" w:lineRule="auto"/>
+        <w:pStyle w:val="ListBullet"/>
       </w:pPr>
       <w:r>
-        <w:t>Add React Flow workflow builder and test-run UX.</w:t>
+        <w:t>conversations and messages: inbox thread and timeline.</w:t>
       </w:r>
     </w:p>
     <w:p>
       <w:pPr>
-        <w:pStyle w:val="Heading1"/>
+        <w:pStyle w:val="ListBullet"/>
       </w:pPr>
       <w:r>
-        <w:t>14. Complexity Estimate</w:t>
-      </w:r>
-    </w:p>
-    <w:tbl>
-      <w:tblPr>
-        <w:tblStyle w:val="TableGrid"/>
-        <w:tblW w:type="dxa" w:w="9360"/>
-        <w:jc w:val="left"/>
-        <w:tblLayout w:type="fixed"/>
-        <w:tblLook w:firstColumn="1" w:firstRow="1" w:lastColumn="0" w:lastRow="0" w:noHBand="0" w:noVBand="1" w:val="04A0"/>
-        <w:tblInd w:w="120" w:type="dxa"/>
-      </w:tblPr>
-      <w:tblGrid>
-        <w:gridCol w:w="3600"/>
-        <w:gridCol w:w="5760"/>
-      </w:tblGrid>
-      <w:tr>
-        <w:tc>
-          <w:tcPr>
-            <w:tcW w:type="dxa" w:w="3600"/>
-            <w:tcMar>
-              <w:top w:w="80" w:type="dxa"/>
-              <w:start w:w="120" w:type="dxa"/>
-              <w:bottom w:w="80" w:type="dxa"/>
-              <w:end w:w="120" w:type="dxa"/>
-            </w:tcMar>
-            <w:vAlign w:val="center"/>
-            <w:shd w:fill="F2F4F7"/>
-          </w:tcPr>
-          <w:p>
-            <w:pPr>
-              <w:spacing w:after="0" w:line="264" w:lineRule="auto"/>
-            </w:pPr>
-            <w:r/>
-            <w:r>
-              <w:rPr>
-                <w:rFonts w:ascii="Calibri" w:hAnsi="Calibri"/>
-                <w:b/>
-                <w:color w:val="0B2545"/>
-                <w:sz w:val="20"/>
-              </w:rPr>
-              <w:t>Workstream</w:t>
-            </w:r>
-          </w:p>
-        </w:tc>
-        <w:tc>
-          <w:tcPr>
-            <w:tcW w:type="dxa" w:w="5760"/>
-            <w:tcMar>
-              <w:top w:w="80" w:type="dxa"/>
-              <w:start w:w="120" w:type="dxa"/>
-              <w:bottom w:w="80" w:type="dxa"/>
-              <w:end w:w="120" w:type="dxa"/>
-            </w:tcMar>
-            <w:vAlign w:val="center"/>
-            <w:shd w:fill="F2F4F7"/>
-          </w:tcPr>
-          <w:p>
-            <w:pPr>
-              <w:spacing w:after="0" w:line="264" w:lineRule="auto"/>
-            </w:pPr>
-            <w:r/>
-            <w:r>
-              <w:rPr>
-                <w:rFonts w:ascii="Calibri" w:hAnsi="Calibri"/>
-                <w:b/>
-                <w:color w:val="0B2545"/>
-                <w:sz w:val="20"/>
-              </w:rPr>
-              <w:t>Solo Developer Estimate</w:t>
-            </w:r>
-          </w:p>
-        </w:tc>
-      </w:tr>
-      <w:tr>
-        <w:tc>
-          <w:tcPr>
-            <w:tcW w:type="dxa" w:w="3600"/>
-          </w:tcPr>
-          <w:p>
-            <w:pPr>
-              <w:spacing w:after="0" w:line="264" w:lineRule="auto"/>
-            </w:pPr>
-            <w:r/>
-            <w:r>
-              <w:rPr>
-                <w:rFonts w:ascii="Calibri" w:hAnsi="Calibri"/>
-                <w:b w:val="0"/>
-                <w:sz w:val="20"/>
-              </w:rPr>
-              <w:t>Telegram pilot inbox</w:t>
-            </w:r>
-          </w:p>
-        </w:tc>
-        <w:tc>
-          <w:tcPr>
-            <w:tcW w:type="dxa" w:w="5760"/>
-          </w:tcPr>
-          <w:p>
-            <w:pPr>
-              <w:spacing w:after="0" w:line="264" w:lineRule="auto"/>
-            </w:pPr>
-            <w:r/>
-            <w:r>
-              <w:rPr>
-                <w:rFonts w:ascii="Calibri" w:hAnsi="Calibri"/>
-                <w:b w:val="0"/>
-                <w:sz w:val="20"/>
-              </w:rPr>
-              <w:t>3-5 weeks</w:t>
-            </w:r>
-          </w:p>
-        </w:tc>
-      </w:tr>
-      <w:tr>
-        <w:tc>
-          <w:tcPr>
-            <w:tcW w:type="dxa" w:w="3600"/>
-          </w:tcPr>
-          <w:p>
-            <w:pPr>
-              <w:spacing w:after="0" w:line="264" w:lineRule="auto"/>
-            </w:pPr>
-            <w:r/>
-            <w:r>
-              <w:rPr>
-                <w:rFonts w:ascii="Calibri" w:hAnsi="Calibri"/>
-                <w:b w:val="0"/>
-                <w:sz w:val="20"/>
-              </w:rPr>
-              <w:t>Basic workflow runtime</w:t>
-            </w:r>
-          </w:p>
-        </w:tc>
-        <w:tc>
-          <w:tcPr>
-            <w:tcW w:type="dxa" w:w="5760"/>
-          </w:tcPr>
-          <w:p>
-            <w:pPr>
-              <w:spacing w:after="0" w:line="264" w:lineRule="auto"/>
-            </w:pPr>
-            <w:r/>
-            <w:r>
-              <w:rPr>
-                <w:rFonts w:ascii="Calibri" w:hAnsi="Calibri"/>
-                <w:b w:val="0"/>
-                <w:sz w:val="20"/>
-              </w:rPr>
-              <w:t>4-6 weeks</w:t>
-            </w:r>
-          </w:p>
-        </w:tc>
-      </w:tr>
-      <w:tr>
-        <w:tc>
-          <w:tcPr>
-            <w:tcW w:type="dxa" w:w="3600"/>
-          </w:tcPr>
-          <w:p>
-            <w:pPr>
-              <w:spacing w:after="0" w:line="264" w:lineRule="auto"/>
-            </w:pPr>
-            <w:r/>
-            <w:r>
-              <w:rPr>
-                <w:rFonts w:ascii="Calibri" w:hAnsi="Calibri"/>
-                <w:b w:val="0"/>
-                <w:sz w:val="20"/>
-              </w:rPr>
-              <w:t>Visual workflow builder</w:t>
-            </w:r>
-          </w:p>
-        </w:tc>
-        <w:tc>
-          <w:tcPr>
-            <w:tcW w:type="dxa" w:w="5760"/>
-          </w:tcPr>
-          <w:p>
-            <w:pPr>
-              <w:spacing w:after="0" w:line="264" w:lineRule="auto"/>
-            </w:pPr>
-            <w:r/>
-            <w:r>
-              <w:rPr>
-                <w:rFonts w:ascii="Calibri" w:hAnsi="Calibri"/>
-                <w:b w:val="0"/>
-                <w:sz w:val="20"/>
-              </w:rPr>
-              <w:t>3-5 weeks</w:t>
-            </w:r>
-          </w:p>
-        </w:tc>
-      </w:tr>
-      <w:tr>
-        <w:tc>
-          <w:tcPr>
-            <w:tcW w:type="dxa" w:w="3600"/>
-          </w:tcPr>
-          <w:p>
-            <w:pPr>
-              <w:spacing w:after="0" w:line="264" w:lineRule="auto"/>
-            </w:pPr>
-            <w:r/>
-            <w:r>
-              <w:rPr>
-                <w:rFonts w:ascii="Calibri" w:hAnsi="Calibri"/>
-                <w:b w:val="0"/>
-                <w:sz w:val="20"/>
-              </w:rPr>
-              <w:t>Debug logs and polish</w:t>
-            </w:r>
-          </w:p>
-        </w:tc>
-        <w:tc>
-          <w:tcPr>
-            <w:tcW w:type="dxa" w:w="5760"/>
-          </w:tcPr>
-          <w:p>
-            <w:pPr>
-              <w:spacing w:after="0" w:line="264" w:lineRule="auto"/>
-            </w:pPr>
-            <w:r/>
-            <w:r>
-              <w:rPr>
-                <w:rFonts w:ascii="Calibri" w:hAnsi="Calibri"/>
-                <w:b w:val="0"/>
-                <w:sz w:val="20"/>
-              </w:rPr>
-              <w:t>2-4 weeks</w:t>
-            </w:r>
-          </w:p>
-        </w:tc>
-      </w:tr>
-      <w:tr>
-        <w:tc>
-          <w:tcPr>
-            <w:tcW w:type="dxa" w:w="3600"/>
-          </w:tcPr>
-          <w:p>
-            <w:pPr>
-              <w:spacing w:after="0" w:line="264" w:lineRule="auto"/>
-            </w:pPr>
-            <w:r/>
-            <w:r>
-              <w:rPr>
-                <w:rFonts w:ascii="Calibri" w:hAnsi="Calibri"/>
-                <w:b w:val="0"/>
-                <w:sz w:val="20"/>
-              </w:rPr>
-              <w:t>Usable MVP</w:t>
-            </w:r>
-          </w:p>
-        </w:tc>
-        <w:tc>
-          <w:tcPr>
-            <w:tcW w:type="dxa" w:w="5760"/>
-          </w:tcPr>
-          <w:p>
-            <w:pPr>
-              <w:spacing w:after="0" w:line="264" w:lineRule="auto"/>
-            </w:pPr>
-            <w:r/>
-            <w:r>
-              <w:rPr>
-                <w:rFonts w:ascii="Calibri" w:hAnsi="Calibri"/>
-                <w:b w:val="0"/>
-                <w:sz w:val="20"/>
-              </w:rPr>
-              <w:t>3-4 months</w:t>
-            </w:r>
-          </w:p>
-        </w:tc>
-      </w:tr>
-      <w:tr>
-        <w:tc>
-          <w:tcPr>
-            <w:tcW w:type="dxa" w:w="3600"/>
-          </w:tcPr>
-          <w:p>
-            <w:pPr>
-              <w:spacing w:after="0" w:line="264" w:lineRule="auto"/>
-            </w:pPr>
-            <w:r/>
-            <w:r>
-              <w:rPr>
-                <w:rFonts w:ascii="Calibri" w:hAnsi="Calibri"/>
-                <w:b w:val="0"/>
-                <w:sz w:val="20"/>
-              </w:rPr>
-              <w:t>Sellable early SaaS</w:t>
-            </w:r>
-          </w:p>
-        </w:tc>
-        <w:tc>
-          <w:tcPr>
-            <w:tcW w:type="dxa" w:w="5760"/>
-          </w:tcPr>
-          <w:p>
-            <w:pPr>
-              <w:spacing w:after="0" w:line="264" w:lineRule="auto"/>
-            </w:pPr>
-            <w:r/>
-            <w:r>
-              <w:rPr>
-                <w:rFonts w:ascii="Calibri" w:hAnsi="Calibri"/>
-                <w:b w:val="0"/>
-                <w:sz w:val="20"/>
-              </w:rPr>
-              <w:t>6-9 months</w:t>
-            </w:r>
-          </w:p>
-        </w:tc>
-      </w:tr>
-      <w:tr>
-        <w:tc>
-          <w:tcPr>
-            <w:tcW w:type="dxa" w:w="3600"/>
-          </w:tcPr>
-          <w:p>
-            <w:pPr>
-              <w:spacing w:after="0" w:line="264" w:lineRule="auto"/>
-            </w:pPr>
-            <w:r/>
-            <w:r>
-              <w:rPr>
-                <w:rFonts w:ascii="Calibri" w:hAnsi="Calibri"/>
-                <w:b w:val="0"/>
-                <w:sz w:val="20"/>
-              </w:rPr>
-              <w:t>Full omnichannel platform</w:t>
-            </w:r>
-          </w:p>
-        </w:tc>
-        <w:tc>
-          <w:tcPr>
-            <w:tcW w:type="dxa" w:w="5760"/>
-          </w:tcPr>
-          <w:p>
-            <w:pPr>
-              <w:spacing w:after="0" w:line="264" w:lineRule="auto"/>
-            </w:pPr>
-            <w:r/>
-            <w:r>
-              <w:rPr>
-                <w:rFonts w:ascii="Calibri" w:hAnsi="Calibri"/>
-                <w:b w:val="0"/>
-                <w:sz w:val="20"/>
-              </w:rPr>
-              <w:t>18+ months with a team</w:t>
-            </w:r>
-          </w:p>
-        </w:tc>
-      </w:tr>
-    </w:tbl>
-    <w:p>
-      <w:pPr>
-        <w:pStyle w:val="Heading1"/>
-      </w:pPr>
-      <w:r>
-        <w:t>15. Positioning</w:t>
+        <w:t>workflow_definitions: workflow name, enabled state, and draft graph JSON.</w:t>
       </w:r>
     </w:p>
     <w:p>
+      <w:pPr>
+        <w:pStyle w:val="ListBullet"/>
+      </w:pPr>
       <w:r>
-        <w:t>RelayFlow should be positioned as a customer messaging platform with developer-grade workflow automation. The early Telegram pilot is a validation path, not the product identity.</w:t>
+        <w:t>workflow_run and workflow_run_step: durable execution and observability records.</w:t>
       </w:r>
     </w:p>
-    <w:tbl>
-      <w:tblPr>
-        <w:tblStyle w:val="TableGrid"/>
-        <w:tblW w:type="dxa" w:w="9360"/>
-        <w:jc w:val="left"/>
-        <w:tblLayout w:type="fixed"/>
-        <w:tblLook w:firstColumn="1" w:firstRow="1" w:lastColumn="0" w:lastRow="0" w:noHBand="0" w:noVBand="1" w:val="04A0"/>
-        <w:tblInd w:w="120" w:type="dxa"/>
-      </w:tblPr>
-      <w:tblGrid>
-        <w:gridCol w:w="9360"/>
-      </w:tblGrid>
-      <w:tr>
-        <w:tc>
-          <w:tcPr>
-            <w:tcW w:type="dxa" w:w="9360"/>
-            <w:tcMar>
-              <w:top w:w="140" w:type="dxa"/>
-              <w:start w:w="180" w:type="dxa"/>
-              <w:bottom w:w="140" w:type="dxa"/>
-              <w:end w:w="180" w:type="dxa"/>
-            </w:tcMar>
-            <w:vAlign w:val="center"/>
-            <w:shd w:fill="F4F6F9"/>
-          </w:tcPr>
-          <w:p>
-            <w:pPr>
-              <w:spacing w:after="0"/>
-            </w:pPr>
-            <w:r>
-              <w:rPr>
-                <w:rFonts w:ascii="Calibri" w:hAnsi="Calibri"/>
-                <w:b/>
-                <w:color w:val="1F3A5F"/>
-                <w:sz w:val="21"/>
-              </w:rPr>
-              <w:t xml:space="preserve">Positioning statement: </w:t>
-            </w:r>
-            <w:r>
-              <w:rPr>
-                <w:rFonts w:ascii="Calibri" w:hAnsi="Calibri"/>
-                <w:sz w:val="21"/>
-              </w:rPr>
-              <w:t>An omnichannel customer messaging platform for teams that need inbox, automation, and API control in one debuggable workflow system.</w:t>
-            </w:r>
-          </w:p>
-        </w:tc>
-      </w:tr>
-    </w:tbl>
-    <w:p/>
+    <w:p>
+      <w:pPr>
+        <w:pStyle w:val="Heading1"/>
+      </w:pPr>
+      <w:r>
+        <w:t>11. Execution Requirements</w:t>
+      </w:r>
+    </w:p>
+    <w:p>
+      <w:pPr>
+        <w:pStyle w:val="ListBullet"/>
+      </w:pPr>
+      <w:r>
+        <w:t>Every workflow run writes a run record.</w:t>
+      </w:r>
+    </w:p>
+    <w:p>
+      <w:pPr>
+        <w:pStyle w:val="ListBullet"/>
+      </w:pPr>
+      <w:r>
+        <w:t>Every executed node writes a step record with input/output snapshots and duration.</w:t>
+      </w:r>
+    </w:p>
+    <w:p>
+      <w:pPr>
+        <w:pStyle w:val="ListBullet"/>
+      </w:pPr>
+      <w:r>
+        <w:t>Workflow execution should not block webhook request handling.</w:t>
+      </w:r>
+    </w:p>
+    <w:p>
+      <w:pPr>
+        <w:pStyle w:val="ListBullet"/>
+      </w:pPr>
+      <w:r>
+        <w:t>Ask Question nodes persist WAITING state and resume after contact replies.</w:t>
+      </w:r>
+    </w:p>
+    <w:p>
+      <w:pPr>
+        <w:pStyle w:val="ListBullet"/>
+      </w:pPr>
+      <w:r>
+        <w:t>Outbound Telegram send failures roll back user-created outbound message persistence.</w:t>
+      </w:r>
+    </w:p>
+    <w:p>
+      <w:pPr>
+        <w:pStyle w:val="ListBullet"/>
+      </w:pPr>
+      <w:r>
+        <w:t>Future versioning should lock runs to the workflow version active at trigger time.</w:t>
+      </w:r>
+    </w:p>
+    <w:p>
+      <w:pPr>
+        <w:pStyle w:val="ListBullet"/>
+      </w:pPr>
+      <w:r>
+        <w:t>Future test-run mode must avoid sending real customer messages unless explicitly enabled.</w:t>
+      </w:r>
+    </w:p>
+    <w:p>
+      <w:pPr>
+        <w:pStyle w:val="Heading1"/>
+      </w:pPr>
+      <w:r>
+        <w:t>12. Security Requirements</w:t>
+      </w:r>
+    </w:p>
+    <w:p>
+      <w:pPr>
+        <w:pStyle w:val="ListBullet"/>
+      </w:pPr>
+      <w:r>
+        <w:t>Implemented: encrypt channel credentials such as Telegram bot tokens.</w:t>
+      </w:r>
+    </w:p>
+    <w:p>
+      <w:pPr>
+        <w:pStyle w:val="ListBullet"/>
+      </w:pPr>
+      <w:r>
+        <w:t>Implemented: session-based auth for protected API routes.</w:t>
+      </w:r>
+    </w:p>
+    <w:p>
+      <w:pPr>
+        <w:pStyle w:val="ListBullet"/>
+      </w:pPr>
+      <w:r>
+        <w:t>Planned: enforce workspace-level authorization checks on all workspace-scoped endpoints.</w:t>
+      </w:r>
+    </w:p>
+    <w:p>
+      <w:pPr>
+        <w:pStyle w:val="ListBullet"/>
+      </w:pPr>
+      <w:r>
+        <w:t>Planned: verify Telegram webhook secret tokens.</w:t>
+      </w:r>
+    </w:p>
+    <w:p>
+      <w:pPr>
+        <w:pStyle w:val="ListBullet"/>
+      </w:pPr>
+      <w:r>
+        <w:t>Planned: mask secrets in workflow editor previews and run logs.</w:t>
+      </w:r>
+    </w:p>
+    <w:p>
+      <w:pPr>
+        <w:pStyle w:val="ListBullet"/>
+      </w:pPr>
+      <w:r>
+        <w:t>Planned: audit workflow publishing, channel connection changes, role changes, and credential updates.</w:t>
+      </w:r>
+    </w:p>
+    <w:p>
+      <w:pPr>
+        <w:pStyle w:val="Heading1"/>
+      </w:pPr>
+      <w:r>
+        <w:t>13. API And Contract Requirements</w:t>
+      </w:r>
+    </w:p>
+    <w:p>
+      <w:pPr>
+        <w:pStyle w:val="ListBullet"/>
+      </w:pPr>
+      <w:r>
+        <w:t>OpenAPI must document auth, workspaces, channel accounts, contacts, external identities, conversations, messages, workflows, SSE, and Telegram webhooks.</w:t>
+      </w:r>
+    </w:p>
+    <w:p>
+      <w:pPr>
+        <w:pStyle w:val="ListBullet"/>
+      </w:pPr>
+      <w:r>
+        <w:t>JSON schemas must describe normalized message events and the persisted workflow graph format.</w:t>
+      </w:r>
+    </w:p>
+    <w:p>
+      <w:pPr>
+        <w:pStyle w:val="ListBullet"/>
+      </w:pPr>
+      <w:r>
+        <w:t>Contract updates should happen in the same change set as API shape changes.</w:t>
+      </w:r>
+    </w:p>
+    <w:p>
+      <w:pPr>
+        <w:pStyle w:val="Heading1"/>
+      </w:pPr>
+      <w:r>
+        <w:t>14. Next Build Order</w:t>
+      </w:r>
+    </w:p>
+    <w:p>
+      <w:pPr>
+        <w:pStyle w:val="ListNumber"/>
+      </w:pPr>
+      <w:r>
+        <w:t>Add workflow run logs UI: workflow runs list and step-by-step detail view.</w:t>
+      </w:r>
+    </w:p>
+    <w:p>
+      <w:pPr>
+        <w:pStyle w:val="ListNumber"/>
+      </w:pPr>
+      <w:r>
+        <w:t>Add workspace membership authorization checks across workspace-scoped endpoints.</w:t>
+      </w:r>
+    </w:p>
+    <w:p>
+      <w:pPr>
+        <w:pStyle w:val="ListNumber"/>
+      </w:pPr>
+      <w:r>
+        <w:t>Add Telegram webhook secret verification.</w:t>
+      </w:r>
+    </w:p>
+    <w:p>
+      <w:pPr>
+        <w:pStyle w:val="ListNumber"/>
+      </w:pPr>
+      <w:r>
+        <w:t>Add HTTP retry count, retry delay/backoff, and auth helper configuration.</w:t>
+      </w:r>
+    </w:p>
+    <w:p>
+      <w:pPr>
+        <w:pStyle w:val="ListNumber"/>
+      </w:pPr>
+      <w:r>
+        <w:t>Add secret masking for HTTP headers, request bodies, responses, and run logs.</w:t>
+      </w:r>
+    </w:p>
+    <w:p>
+      <w:pPr>
+        <w:pStyle w:val="ListNumber"/>
+      </w:pPr>
+      <w:r>
+        <w:t>Add manual workflow test-run mode.</w:t>
+      </w:r>
+    </w:p>
+    <w:p>
+      <w:pPr>
+        <w:pStyle w:val="ListNumber"/>
+      </w:pPr>
+      <w:r>
+        <w:t>Add published workflow version history.</w:t>
+      </w:r>
+    </w:p>
+    <w:p>
+      <w:pPr>
+        <w:pStyle w:val="ListNumber"/>
+      </w:pPr>
+      <w:r>
+        <w:t>Add role-based access control and conversation assignment.</w:t>
+      </w:r>
+    </w:p>
+    <w:p>
+      <w:pPr>
+        <w:pStyle w:val="Heading1"/>
+      </w:pPr>
+      <w:r>
+        <w:t>15. Complexity Estimate</w:t>
+      </w:r>
+    </w:p>
+    <w:p>
+      <w:pPr>
+        <w:spacing w:after="120"/>
+      </w:pPr>
+      <w:r>
+        <w:t>The project is medium-to-high complexity because it combines multi-tenant auth, channel integrations, realtime inbox behavior, workflow graph editing, durable workflow execution, external HTTP calls, and observability. The current implementation has completed the first major vertical slice: Telegram pilot, inbox, workflow builder, and runtime persistence. The next complexity wall is production hardening: authorization, webhook verification, run-log UX, secrets masking, retries, and workflow versioning.</w:t>
+      </w:r>
+    </w:p>
+    <w:p>
+      <w:pPr>
+        <w:pStyle w:val="Heading1"/>
+      </w:pPr>
+      <w:r>
+        <w:t>16. Positioning</w:t>
+      </w:r>
+    </w:p>
+    <w:p>
+      <w:pPr>
+        <w:spacing w:after="120"/>
+      </w:pPr>
+      <w:r>
+        <w:t>RelayFlow should be positioned as a customer messaging platform with developer-grade workflow automation. Telegram is a validation path, not the product identity. The durable thesis remains: one inbox, channel-agnostic data, and workflow automation that is inspectable, controllable, and reliable.</w:t>
+      </w:r>
+    </w:p>
     <w:sectPr>
-      <w:footerReference w:type="default" r:id="rId9"/>
       <w:pgSz w:w="12240" w:h="15840"/>
-      <w:pgMar w:top="1440" w:right="1440" w:bottom="1440" w:left="1440" w:header="708" w:footer="708" w:gutter="0"/>
+      <w:pgMar w:top="1152" w:right="1224" w:bottom="1152" w:left="1224" w:header="720" w:footer="720" w:gutter="0"/>
       <w:cols w:space="720"/>
       <w:docGrid w:linePitch="360"/>
     </w:sectPr>
   </w:body>
 </w:document>
-</file>
-
-<file path=word/footer1.xml><?xml version="1.0" encoding="utf-8"?>
-<w:ftr xmlns:m="http://schemas.openxmlformats.org/officeDocument/2006/math" xmlns:mc="http://schemas.openxmlformats.org/markup-compatibility/2006" xmlns:mo="http://schemas.microsoft.com/office/mac/office/2008/main" xmlns:mv="urn:schemas-microsoft-com:mac:vml" xmlns:o="urn:schemas-microsoft-com:office:office" xmlns:r="http://schemas.openxmlformats.org/officeDocument/2006/relationships" xmlns:v="urn:schemas-microsoft-com:vml" xmlns:w10="urn:schemas-microsoft-com:office:word" xmlns:w14="http://schemas.microsoft.com/office/word/2010/wordml" xmlns:w="http://schemas.openxmlformats.org/wordprocessingml/2006/main" xmlns:wne="http://schemas.microsoft.com/office/word/2006/wordml" xmlns:wp14="http://schemas.microsoft.com/office/word/2010/wordprocessingDrawing" xmlns:wp="http://schemas.openxmlformats.org/drawingml/2006/wordprocessingDrawing" xmlns:wpc="http://schemas.microsoft.com/office/word/2010/wordprocessingCanvas" xmlns:wpg="http://schemas.microsoft.com/office/word/2010/wordprocessingGroup" xmlns:wpi="http://schemas.microsoft.com/office/word/2010/wordprocessingInk" xmlns:wps="http://schemas.microsoft.com/office/word/2010/wordprocessingShape" mc:Ignorable="w14 wp14">
-  <w:p>
-    <w:pPr>
-      <w:pStyle w:val="Footer"/>
-      <w:spacing w:before="0" w:after="0"/>
-      <w:jc w:val="right"/>
-    </w:pPr>
-    <w:r>
-      <w:rPr>
-        <w:rFonts w:ascii="Calibri" w:hAnsi="Calibri"/>
-        <w:color w:val="666666"/>
-        <w:sz w:val="18"/>
-      </w:rPr>
-      <w:t>RelayFlow PRD and Technical Strategy</w:t>
-    </w:r>
-  </w:p>
-</w:ftr>
 </file>
 
 <file path=word/numbering.xml><?xml version="1.0" encoding="utf-8"?>
@@ -3913,12 +2042,9 @@
     <w:name w:val="Normal"/>
     <w:qFormat/>
     <w:rsid w:val="00FC693F"/>
-    <w:pPr>
-      <w:spacing w:after="120" w:line="264" w:lineRule="auto"/>
-    </w:pPr>
     <w:rPr>
-      <w:rFonts w:ascii="Calibri" w:hAnsi="Calibri"/>
-      <w:sz w:val="22"/>
+      <w:rFonts w:ascii="Arial" w:hAnsi="Arial"/>
+      <w:sz w:val="20"/>
     </w:rPr>
   </w:style>
   <w:style w:type="paragraph" w:styleId="Header">
@@ -3976,14 +2102,14 @@
     <w:pPr>
       <w:keepNext/>
       <w:keepLines/>
-      <w:spacing w:before="320" w:after="160"/>
+      <w:spacing w:before="480" w:after="0"/>
       <w:outlineLvl w:val="0"/>
     </w:pPr>
     <w:rPr>
-      <w:rFonts w:asciiTheme="majorHAnsi" w:eastAsiaTheme="majorEastAsia" w:hAnsiTheme="majorHAnsi" w:cstheme="majorBidi" w:ascii="Calibri" w:hAnsi="Calibri"/>
+      <w:rFonts w:asciiTheme="majorHAnsi" w:eastAsiaTheme="majorEastAsia" w:hAnsiTheme="majorHAnsi" w:cstheme="majorBidi" w:ascii="Arial" w:hAnsi="Arial"/>
       <w:b/>
       <w:bCs/>
-      <w:color w:val="2E74B5"/>
+      <w:color w:val="0E2456"/>
       <w:sz w:val="32"/>
       <w:szCs w:val="28"/>
     </w:rPr>
@@ -4000,15 +2126,15 @@
     <w:pPr>
       <w:keepNext/>
       <w:keepLines/>
-      <w:spacing w:before="240" w:after="120"/>
+      <w:spacing w:before="200" w:after="0"/>
       <w:outlineLvl w:val="1"/>
     </w:pPr>
     <w:rPr>
-      <w:rFonts w:asciiTheme="majorHAnsi" w:eastAsiaTheme="majorEastAsia" w:hAnsiTheme="majorHAnsi" w:cstheme="majorBidi" w:ascii="Calibri" w:hAnsi="Calibri"/>
+      <w:rFonts w:asciiTheme="majorHAnsi" w:eastAsiaTheme="majorEastAsia" w:hAnsiTheme="majorHAnsi" w:cstheme="majorBidi" w:ascii="Arial" w:hAnsi="Arial"/>
       <w:b/>
       <w:bCs/>
-      <w:color w:val="2E74B5"/>
-      <w:sz w:val="26"/>
+      <w:color w:val="2E69FF"/>
+      <w:sz w:val="24"/>
       <w:szCs w:val="26"/>
     </w:rPr>
   </w:style>
@@ -4024,15 +2150,14 @@
     <w:pPr>
       <w:keepNext/>
       <w:keepLines/>
-      <w:spacing w:before="160" w:after="80"/>
+      <w:spacing w:before="200" w:after="0"/>
       <w:outlineLvl w:val="2"/>
     </w:pPr>
     <w:rPr>
-      <w:rFonts w:asciiTheme="majorHAnsi" w:eastAsiaTheme="majorEastAsia" w:hAnsiTheme="majorHAnsi" w:cstheme="majorBidi" w:ascii="Calibri" w:hAnsi="Calibri"/>
+      <w:rFonts w:asciiTheme="majorHAnsi" w:eastAsiaTheme="majorEastAsia" w:hAnsiTheme="majorHAnsi" w:cstheme="majorBidi"/>
       <w:b/>
       <w:bCs/>
-      <w:color w:val="1F4D78"/>
-      <w:sz w:val="24"/>
+      <w:color w:val="4F81BD" w:themeColor="accent1"/>
     </w:rPr>
   </w:style>
   <w:style w:type="paragraph" w:styleId="Heading4">
@@ -4448,14 +2573,8 @@
       <w:numPr>
         <w:numId w:val="1"/>
       </w:numPr>
-      <w:spacing w:after="80" w:line="280" w:lineRule="auto"/>
-      <w:ind w:left="720" w:hanging="360"/>
       <w:contextualSpacing/>
     </w:pPr>
-    <w:rPr>
-      <w:rFonts w:ascii="Calibri" w:hAnsi="Calibri"/>
-      <w:sz w:val="22"/>
-    </w:rPr>
   </w:style>
   <w:style w:type="paragraph" w:styleId="ListBullet2">
     <w:name w:val="List Bullet 2"/>
@@ -4493,14 +2612,8 @@
       <w:numPr>
         <w:numId w:val="5"/>
       </w:numPr>
-      <w:spacing w:after="80" w:line="280" w:lineRule="auto"/>
-      <w:ind w:left="720" w:hanging="360"/>
       <w:contextualSpacing/>
     </w:pPr>
-    <w:rPr>
-      <w:rFonts w:ascii="Calibri" w:hAnsi="Calibri"/>
-      <w:sz w:val="22"/>
-    </w:rPr>
   </w:style>
   <w:style w:type="paragraph" w:styleId="ListNumber2">
     <w:name w:val="List Number 2"/>

</xml_diff>

<commit_message>
add public API, webhooks, and API key management
</commit_message>
<xml_diff>
--- a/docs/prd/RelayFlow_PRD_Technical_Strategy.docx
+++ b/docs/prd/RelayFlow_PRD_Technical_Strategy.docx
@@ -37,7 +37,7 @@
         <w:spacing w:after="120"/>
       </w:pPr>
       <w:r>
-        <w:t>RelayFlow is an omnichannel customer messaging platform with developer-grade workflow automation. Telegram is the first adapter used to validate the channel model, but the product is not Telegram-specific. The core model is designed around workspaces, channel accounts, contacts, external identities, conversations, messages, and workflow definitions.</w:t>
+        <w:t>RelayFlow is an omnichannel customer messaging platform with developer-grade workflow automation. Telegram is the first adapter used to validate the channel model, but the product is not Telegram-specific. The core model is designed around workspaces, workspace members and permissions, channel accounts, contacts, external identities, conversations, messages, integrations, and workflow definitions.</w:t>
       </w:r>
     </w:p>
     <w:p>
@@ -768,7 +768,7 @@
         <w:pStyle w:val="ListBullet"/>
       </w:pPr>
       <w:r>
-        <w:t>Generic contact, external identity, conversation, and message models.</w:t>
+        <w:t>Generic contact, external identity, conversation, and message models, including contact list/detail/delete/merge flows.</w:t>
       </w:r>
     </w:p>
     <w:p>
@@ -776,7 +776,7 @@
         <w:pStyle w:val="ListBullet"/>
       </w:pPr>
       <w:r>
-        <w:t>Agent inbox with conversation list, message thread, and outbound reply composer.</w:t>
+        <w:t>Agent inbox with conversation list, message thread, outbound reply composer, conversation status updates, and workflow lock handling.</w:t>
       </w:r>
     </w:p>
     <w:p>
@@ -825,6 +825,14 @@
       </w:pPr>
       <w:r>
         <w:t>Workflow publish validation for structural graph rules, including valid Jump To targets.</w:t>
+        <w:br/>
+        <w:t>Workspace member permissions for inbox, contacts, workflows, channels, API keys, and webhooks.</w:t>
+        <w:br/>
+        <w:t>Workspace invites with expiring tokens and permission assignment.</w:t>
+        <w:br/>
+        <w:t>Workspace API keys and public API endpoints for conversations, messages, and outbound replies.</w:t>
+        <w:br/>
+        <w:t>Workspace webhooks with encrypted HMAC secret, signature header, retry/backoff delivery, and contact.created events.</w:t>
       </w:r>
     </w:p>
     <w:p>
@@ -864,7 +872,7 @@
         <w:pStyle w:val="ListBullet"/>
       </w:pPr>
       <w:r>
-        <w:t>Role-based authorization for owner/admin/agent.</w:t>
+        <w:t>Broader role model beyond current owner/member permissions.</w:t>
       </w:r>
     </w:p>
     <w:p>
@@ -1008,7 +1016,7 @@
         <w:pStyle w:val="ListBullet"/>
       </w:pPr>
       <w:r>
-        <w:t>As an agent, I can view conversations and reply from the inbox.</w:t>
+        <w:t>As an agent, I can view conversations and reply from the inbox when I have inbox permission and no active workflow owns the conversation.</w:t>
       </w:r>
     </w:p>
     <w:p>
@@ -1049,6 +1057,12 @@
       </w:pPr>
       <w:r>
         <w:t>As an admin, I should be able to inspect every workflow run and step in a future run logs UI.</w:t>
+        <w:br/>
+        <w:t>As a workspace owner, I can invite members and grant only the permissions they need.</w:t>
+        <w:br/>
+        <w:t>As an integrator, I can use API keys to read conversations/messages and send outbound replies.</w:t>
+        <w:br/>
+        <w:t>As an integrator, I can subscribe to signed workspace webhook events.</w:t>
       </w:r>
     </w:p>
     <w:p>
@@ -1258,7 +1272,7 @@
         <w:pStyle w:val="ListBullet"/>
       </w:pPr>
       <w:r>
-        <w:t>PostgreSQL stores users, workspaces, channel accounts, conversations, messages, workflow definitions, runs, and run steps.</w:t>
+        <w:t>PostgreSQL stores users, workspaces, members, invites, API keys, webhooks, channel accounts, contacts, external identities, conversations, messages, workflow definitions, runs, and run steps.</w:t>
       </w:r>
     </w:p>
     <w:p>
@@ -1298,7 +1312,7 @@
         <w:pStyle w:val="ListBullet"/>
       </w:pPr>
       <w:r>
-        <w:t>Workflow execution is asynchronous and records durable run/step logs.</w:t>
+        <w:t>Workflow execution is asynchronous, locks conversations while active, and records durable run/step logs.</w:t>
       </w:r>
     </w:p>
     <w:p>
@@ -1370,7 +1384,7 @@
         <w:pStyle w:val="ListBullet"/>
       </w:pPr>
       <w:r>
-        <w:t>workspaces and workspace_members: tenant and membership boundary.</w:t>
+        <w:t>workspaces, workspace_members, and workspace_member_permissions: tenant, membership, and permission boundary.</w:t>
       </w:r>
     </w:p>
     <w:p>
@@ -1378,6 +1392,12 @@
         <w:pStyle w:val="ListBullet"/>
       </w:pPr>
       <w:r>
+        <w:t>workspace_invites: expiring invite tokens with permission sets.</w:t>
+        <w:br/>
+        <w:t>workspace_api_keys: hashed public API keys with revocation, expiry, and last-used tracking.</w:t>
+        <w:br/>
+        <w:t>workspace_webhooks and workspace_webhook_events: outbound webhook configuration and subscribed events.</w:t>
+        <w:br/>
         <w:t>channel_accounts: provider connection records and encrypted credentials.</w:t>
       </w:r>
     </w:p>
@@ -1451,6 +1471,8 @@
       </w:pPr>
       <w:r>
         <w:t>Ask Question nodes persist WAITING state and resume after contact replies.</w:t>
+        <w:br/>
+        <w:t>Active workflow runs lock the conversation so agents and API clients cannot send competing replies.</w:t>
       </w:r>
     </w:p>
     <w:p>
@@ -1506,7 +1528,7 @@
         <w:pStyle w:val="ListBullet"/>
       </w:pPr>
       <w:r>
-        <w:t>Planned: enforce workspace-level authorization checks on all workspace-scoped endpoints.</w:t>
+        <w:t>Implemented: workspace-level authorization and granular permission checks for mutating workspace-scoped endpoints.</w:t>
       </w:r>
     </w:p>
     <w:p>
@@ -1530,7 +1552,7 @@
         <w:pStyle w:val="ListBullet"/>
       </w:pPr>
       <w:r>
-        <w:t>Planned: audit workflow publishing, channel connection changes, role changes, and credential updates.</w:t>
+        <w:t>Planned: audit workflow publishing, channel connection changes, permission changes, API key changes, webhook changes, and credential updates.</w:t>
       </w:r>
     </w:p>
     <w:p>
@@ -1546,7 +1568,7 @@
         <w:pStyle w:val="ListBullet"/>
       </w:pPr>
       <w:r>
-        <w:t>OpenAPI must document auth, workspaces, channel accounts, contacts, external identities, conversations, messages, workflows, SSE, and Telegram webhooks.</w:t>
+        <w:t>OpenAPI must document auth, workspaces, members, invites, API keys, webhooks, public API, channel accounts, contacts, external identities, conversations, messages, workflows, SSE, and Telegram webhooks.</w:t>
       </w:r>
     </w:p>
     <w:p>
@@ -1554,7 +1576,7 @@
         <w:pStyle w:val="ListBullet"/>
       </w:pPr>
       <w:r>
-        <w:t>JSON schemas must describe normalized message events and the persisted workflow graph format.</w:t>
+        <w:t>JSON schemas must describe normalized message events, outbound webhook events, and the persisted workflow graph format.</w:t>
       </w:r>
     </w:p>
     <w:p>
@@ -1586,7 +1608,7 @@
         <w:pStyle w:val="ListNumber"/>
       </w:pPr>
       <w:r>
-        <w:t>Add workspace membership authorization checks across workspace-scoped endpoints.</w:t>
+        <w:t>Harden workspace authorization coverage across all read and write workspace-scoped endpoints.</w:t>
       </w:r>
     </w:p>
     <w:p>
@@ -1634,7 +1656,7 @@
         <w:pStyle w:val="ListNumber"/>
       </w:pPr>
       <w:r>
-        <w:t>Add role-based access control and conversation assignment.</w:t>
+        <w:t>Add broader role presets, audit logs, and conversation assignment.</w:t>
       </w:r>
     </w:p>
     <w:p>
@@ -1650,7 +1672,7 @@
         <w:spacing w:after="120"/>
       </w:pPr>
       <w:r>
-        <w:t>The project is medium-to-high complexity because it combines multi-tenant auth, channel integrations, realtime inbox behavior, workflow graph editing, durable workflow execution, external HTTP calls, and observability. The current implementation has completed the first major vertical slice: Telegram pilot, inbox, workflow builder, and runtime persistence. The next complexity wall is production hardening: authorization, webhook verification, run-log UX, secrets masking, retries, and workflow versioning.</w:t>
+        <w:t>The project is medium-to-high complexity because it combines multi-tenant auth, permissions, invites, API keys, webhooks, channel integrations, realtime inbox behavior, workflow graph editing, durable workflow execution, external HTTP calls, and observability. The current implementation has completed the first major vertical slice: Telegram pilot, inbox, contacts, workflow builder, runtime persistence, permissions, and integration foundations. The next complexity wall is production hardening: full authorization coverage, webhook verification, run-log UX, audit logs, secrets masking, retries, and workflow versioning.</w:t>
       </w:r>
     </w:p>
     <w:p>

</xml_diff>

<commit_message>
self hosting first commit
</commit_message>
<xml_diff>
--- a/docs/prd/RelayFlow_PRD_Technical_Strategy.docx
+++ b/docs/prd/RelayFlow_PRD_Technical_Strategy.docx
@@ -3,16 +3,15 @@
 <w:document xmlns:wpc="http://schemas.microsoft.com/office/word/2010/wordprocessingCanvas" xmlns:mo="http://schemas.microsoft.com/office/mac/office/2008/main" xmlns:mc="http://schemas.openxmlformats.org/markup-compatibility/2006" xmlns:mv="urn:schemas-microsoft-com:mac:vml" xmlns:o="urn:schemas-microsoft-com:office:office" xmlns:r="http://schemas.openxmlformats.org/officeDocument/2006/relationships" xmlns:m="http://schemas.openxmlformats.org/officeDocument/2006/math" xmlns:v="urn:schemas-microsoft-com:vml" xmlns:wp14="http://schemas.microsoft.com/office/word/2010/wordprocessingDrawing" xmlns:wp="http://schemas.openxmlformats.org/drawingml/2006/wordprocessingDrawing" xmlns:w10="urn:schemas-microsoft-com:office:word" xmlns:w="http://schemas.openxmlformats.org/wordprocessingml/2006/main" xmlns:w14="http://schemas.microsoft.com/office/word/2010/wordml" xmlns:wpg="http://schemas.microsoft.com/office/word/2010/wordprocessingGroup" xmlns:wpi="http://schemas.microsoft.com/office/word/2010/wordprocessingInk" xmlns:wne="http://schemas.microsoft.com/office/word/2006/wordml" xmlns:wps="http://schemas.microsoft.com/office/word/2010/wordprocessingShape" mc:Ignorable="w14 wp14">
   <w:body>
     <w:p>
-      <w:pPr>
-        <w:jc w:val="left"/>
-      </w:pPr>
+      <w:pPr/>
       <w:r>
         <w:t>RelayFlow</w:t>
       </w:r>
     </w:p>
     <w:p>
+      <w:pPr/>
       <w:r>
-        <w:t>Product Requirements and Technical Strategy | Updated June 10, 2026</w:t>
+        <w:t>Product Requirements and Technical Strategy | Updated July 8, 2026</w:t>
       </w:r>
     </w:p>
     <w:p>
@@ -24,19 +23,15 @@
       </w:r>
     </w:p>
     <w:p>
-      <w:pPr>
-        <w:spacing w:after="120"/>
-      </w:pPr>
+      <w:pPr/>
       <w:r>
-        <w:t>RelayFlow is an omnichannel customer messaging platform with developer-grade workflow automation. Telegram is the first adapter used to validate the channel model, WhatsApp Business Cloud API support has started as the second adapter, and the product is not Telegram-specific. The core model is designed around users, identities, preferences, MFA methods, workspaces, workspace members and permissions, subscriptions, channel accounts, contacts, external identities, conversations, messages, integrations, and workflow definitions.</w:t>
+        <w:t>RelayFlow is an omnichannel customer messaging platform with developer-grade workflow automation and an optional AI agent. Telegram is the first adapter used to validate the channel model, WhatsApp Business Cloud API is the second adapter, and the product is not Telegram-specific. The core model is designed around users, identities, preferences, MFA methods, workspaces, workspace members and permissions, channel accounts, contacts, external identities, conversations, messages, integrations, and workflow definitions.</w:t>
       </w:r>
     </w:p>
     <w:p>
-      <w:pPr>
-        <w:spacing w:after="120"/>
-      </w:pPr>
+      <w:pPr/>
       <w:r>
-        <w:t>The product differentiates on reliable automation: mutable workflow variables, controllable HTTP behavior, visible execution logs, durable message handling, and plan-aware workspace growth.</w:t>
+        <w:t>RelayFlow is distributed as self-hosted (BYOC) software: operators run their own Docker Compose stack on their own infrastructure, gated by an offline-verified license key. The product differentiates on reliable automation — mutable workflow variables, controllable HTTP behavior, visible execution logs, durable message handling — plus an AI agent that can draft or auto-send replies within operator-defined guardrails.</w:t>
       </w:r>
     </w:p>
     <w:p>
@@ -81,6 +76,14 @@
     </w:p>
     <w:p>
       <w:pPr>
+        <w:pStyle w:val="ListBullet"/>
+      </w:pPr>
+      <w:r>
+        <w:t>Teams that need to own their data and avoid recurring SaaS billing need a credible self-hosted option, not just a hosted multi-tenant product.</w:t>
+      </w:r>
+    </w:p>
+    <w:p>
+      <w:pPr>
         <w:pStyle w:val="Heading1"/>
       </w:pPr>
       <w:r>
@@ -88,11 +91,9 @@
       </w:r>
     </w:p>
     <w:p>
-      <w:pPr>
-        <w:spacing w:after="120"/>
-      </w:pPr>
+      <w:pPr/>
       <w:r>
-        <w:t>The initial target market is small businesses handling customer chats through Telegram, with WhatsApp Business Cloud API now added as the next validation channel. Telegram remains the first test phase adapter, but the broader market is SMB teams handling support, sales, and operations across messaging channels.</w:t>
+        <w:t>The initial target market is small businesses handling customer chats through Telegram, with WhatsApp Business Cloud API as the next validation channel. The broader market is SMB and technical teams handling support, sales, and operations across messaging channels who want to self-host rather than depend on a vendor's hosted multi-tenant instance.</w:t>
       </w:r>
     </w:p>
     <w:p>
@@ -121,9 +122,6 @@
           </w:tcPr>
           <w:p>
             <w:r>
-              <w:rPr>
-                <w:sz w:val="18"/>
-              </w:rPr>
               <w:t>Area</w:t>
             </w:r>
           </w:p>
@@ -134,9 +132,6 @@
           </w:tcPr>
           <w:p>
             <w:r>
-              <w:rPr>
-                <w:sz w:val="18"/>
-              </w:rPr>
               <w:t>Status</w:t>
             </w:r>
           </w:p>
@@ -147,9 +142,6 @@
           </w:tcPr>
           <w:p>
             <w:r>
-              <w:rPr>
-                <w:sz w:val="18"/>
-              </w:rPr>
               <w:t>Notes</w:t>
             </w:r>
           </w:p>
@@ -162,9 +154,6 @@
           </w:tcPr>
           <w:p>
             <w:r>
-              <w:rPr>
-                <w:sz w:val="18"/>
-              </w:rPr>
               <w:t>Auth</w:t>
             </w:r>
           </w:p>
@@ -175,9 +164,6 @@
           </w:tcPr>
           <w:p>
             <w:r>
-              <w:rPr>
-                <w:sz w:val="18"/>
-              </w:rPr>
               <w:t>Implemented</w:t>
             </w:r>
           </w:p>
@@ -188,10 +174,7 @@
           </w:tcPr>
           <w:p>
             <w:r>
-              <w:rPr>
-                <w:sz w:val="18"/>
-              </w:rPr>
-              <w:t>Email/password, Google OAuth, anonymous guest sessions, logout cookie clearing.</w:t>
+              <w:t>Email/password login, Google OAuth, TOTP 2FA, instance bootstrap for the first account, invite-gated signup for every account after.</w:t>
             </w:r>
           </w:p>
         </w:tc>
@@ -203,9 +186,6 @@
           </w:tcPr>
           <w:p>
             <w:r>
-              <w:rPr>
-                <w:sz w:val="18"/>
-              </w:rPr>
               <w:t>Workspace model</w:t>
             </w:r>
           </w:p>
@@ -216,9 +196,6 @@
           </w:tcPr>
           <w:p>
             <w:r>
-              <w:rPr>
-                <w:sz w:val="18"/>
-              </w:rPr>
               <w:t>Implemented</w:t>
             </w:r>
           </w:p>
@@ -229,10 +206,7 @@
           </w:tcPr>
           <w:p>
             <w:r>
-              <w:rPr>
-                <w:sz w:val="18"/>
-              </w:rPr>
-              <w:t>Users can own workspaces; workspace switcher and create-workspace flow exist.</w:t>
+              <w:t>Users can own workspaces; workspace switcher, create-workspace flow, and rename exist. Creating additional workspaces is not yet gated beyond authentication (see 5.3).</w:t>
             </w:r>
           </w:p>
         </w:tc>
@@ -244,9 +218,6 @@
           </w:tcPr>
           <w:p>
             <w:r>
-              <w:rPr>
-                <w:sz w:val="18"/>
-              </w:rPr>
               <w:t>Messaging core</w:t>
             </w:r>
           </w:p>
@@ -257,9 +228,6 @@
           </w:tcPr>
           <w:p>
             <w:r>
-              <w:rPr>
-                <w:sz w:val="18"/>
-              </w:rPr>
               <w:t>Implemented</w:t>
             </w:r>
           </w:p>
@@ -270,9 +238,6 @@
           </w:tcPr>
           <w:p>
             <w:r>
-              <w:rPr>
-                <w:sz w:val="18"/>
-              </w:rPr>
               <w:t>Workspaces, channel accounts, contacts, identities, conversations, messages.</w:t>
             </w:r>
           </w:p>
@@ -285,9 +250,6 @@
           </w:tcPr>
           <w:p>
             <w:r>
-              <w:rPr>
-                <w:sz w:val="18"/>
-              </w:rPr>
               <w:t>Telegram adapter</w:t>
             </w:r>
           </w:p>
@@ -298,9 +260,6 @@
           </w:tcPr>
           <w:p>
             <w:r>
-              <w:rPr>
-                <w:sz w:val="18"/>
-              </w:rPr>
               <w:t>Implemented</w:t>
             </w:r>
           </w:p>
@@ -311,10 +270,7 @@
           </w:tcPr>
           <w:p>
             <w:r>
-              <w:rPr>
-                <w:sz w:val="18"/>
-              </w:rPr>
-              <w:t>Dedicated bot webhooks, shared guest bot flow, inbound normalization, outbound send.</w:t>
+              <w:t>Dedicated bot webhooks per channel account, inbound normalization, outbound send, secret-token verification.</w:t>
             </w:r>
           </w:p>
         </w:tc>
@@ -326,10 +282,7 @@
           </w:tcPr>
           <w:p>
             <w:r>
-              <w:rPr>
-                <w:sz w:val="18"/>
-              </w:rPr>
-              <w:t>Inbox UI</w:t>
+              <w:t>WhatsApp adapter</w:t>
             </w:r>
           </w:p>
         </w:tc>
@@ -339,9 +292,6 @@
           </w:tcPr>
           <w:p>
             <w:r>
-              <w:rPr>
-                <w:sz w:val="18"/>
-              </w:rPr>
               <w:t>Implemented</w:t>
             </w:r>
           </w:p>
@@ -352,10 +302,7 @@
           </w:tcPr>
           <w:p>
             <w:r>
-              <w:rPr>
-                <w:sz w:val="18"/>
-              </w:rPr>
-              <w:t>Conversation list, message thread, composer, SSE-backed updates.</w:t>
+              <w:t>Business Cloud API webhook verification handshake, inbound text and button-reply ingestion, outbound text/button relay.</w:t>
             </w:r>
           </w:p>
         </w:tc>
@@ -367,10 +314,7 @@
           </w:tcPr>
           <w:p>
             <w:r>
-              <w:rPr>
-                <w:sz w:val="18"/>
-              </w:rPr>
-              <w:t>Settings UI</w:t>
+              <w:t>Inbox UI</w:t>
             </w:r>
           </w:p>
         </w:tc>
@@ -380,9 +324,6 @@
           </w:tcPr>
           <w:p>
             <w:r>
-              <w:rPr>
-                <w:sz w:val="18"/>
-              </w:rPr>
               <w:t>Implemented</w:t>
             </w:r>
           </w:p>
@@ -393,10 +334,7 @@
           </w:tcPr>
           <w:p>
             <w:r>
-              <w:rPr>
-                <w:sz w:val="18"/>
-              </w:rPr>
-              <w:t>Channel management moved to workspace settings.</w:t>
+              <w:t>Conversation list, message thread, composer, SSE-backed updates, conversation assignment.</w:t>
             </w:r>
           </w:p>
         </w:tc>
@@ -408,9 +346,38 @@
           </w:tcPr>
           <w:p>
             <w:r>
-              <w:rPr>
-                <w:sz w:val="18"/>
-              </w:rPr>
+              <w:t>Settings UI</w:t>
+            </w:r>
+          </w:p>
+        </w:tc>
+        <w:tc>
+          <w:tcPr>
+            <w:tcW w:type="dxa" w:w="3264"/>
+          </w:tcPr>
+          <w:p>
+            <w:r>
+              <w:t>Implemented</w:t>
+            </w:r>
+          </w:p>
+        </w:tc>
+        <w:tc>
+          <w:tcPr>
+            <w:tcW w:type="dxa" w:w="3264"/>
+          </w:tcPr>
+          <w:p>
+            <w:r>
+              <w:t>Channels, members and permissions, invites, API keys, webhooks.</w:t>
+            </w:r>
+          </w:p>
+        </w:tc>
+      </w:tr>
+      <w:tr>
+        <w:tc>
+          <w:tcPr>
+            <w:tcW w:type="dxa" w:w="3264"/>
+          </w:tcPr>
+          <w:p>
+            <w:r>
               <w:t>Workflow definitions</w:t>
             </w:r>
           </w:p>
@@ -421,9 +388,6 @@
           </w:tcPr>
           <w:p>
             <w:r>
-              <w:rPr>
-                <w:sz w:val="18"/>
-              </w:rPr>
               <w:t>Implemented</w:t>
             </w:r>
           </w:p>
@@ -434,9 +398,6 @@
           </w:tcPr>
           <w:p>
             <w:r>
-              <w:rPr>
-                <w:sz w:val="18"/>
-              </w:rPr>
               <w:t>CRUD API and draft graph persistence.</w:t>
             </w:r>
           </w:p>
@@ -449,9 +410,6 @@
           </w:tcPr>
           <w:p>
             <w:r>
-              <w:rPr>
-                <w:sz w:val="18"/>
-              </w:rPr>
               <w:t>Workflow runtime</w:t>
             </w:r>
           </w:p>
@@ -462,9 +420,6 @@
           </w:tcPr>
           <w:p>
             <w:r>
-              <w:rPr>
-                <w:sz w:val="18"/>
-              </w:rPr>
               <w:t>Implemented</w:t>
             </w:r>
           </w:p>
@@ -475,9 +430,6 @@
           </w:tcPr>
           <w:p>
             <w:r>
-              <w:rPr>
-                <w:sz w:val="18"/>
-              </w:rPr>
               <w:t>Graph execution, run records, step records, waiting/resume behavior.</w:t>
             </w:r>
           </w:p>
@@ -490,9 +442,6 @@
           </w:tcPr>
           <w:p>
             <w:r>
-              <w:rPr>
-                <w:sz w:val="18"/>
-              </w:rPr>
               <w:t>Workflow builder</w:t>
             </w:r>
           </w:p>
@@ -503,9 +452,6 @@
           </w:tcPr>
           <w:p>
             <w:r>
-              <w:rPr>
-                <w:sz w:val="18"/>
-              </w:rPr>
               <w:t>Implemented</w:t>
             </w:r>
           </w:p>
@@ -516,9 +462,6 @@
           </w:tcPr>
           <w:p>
             <w:r>
-              <w:rPr>
-                <w:sz w:val="18"/>
-              </w:rPr>
               <w:t>React Flow canvas, node palette, config panel, save, publish/unpublish.</w:t>
             </w:r>
           </w:p>
@@ -531,9 +474,6 @@
           </w:tcPr>
           <w:p>
             <w:r>
-              <w:rPr>
-                <w:sz w:val="18"/>
-              </w:rPr>
               <w:t>Workflow run logs UI</w:t>
             </w:r>
           </w:p>
@@ -544,10 +484,7 @@
           </w:tcPr>
           <w:p>
             <w:r>
-              <w:rPr>
-                <w:sz w:val="18"/>
-              </w:rPr>
-              <w:t>Planned</w:t>
+              <w:t>Implemented</w:t>
             </w:r>
           </w:p>
         </w:tc>
@@ -557,10 +494,7 @@
           </w:tcPr>
           <w:p>
             <w:r>
-              <w:rPr>
-                <w:sz w:val="18"/>
-              </w:rPr>
-              <w:t>Data is persisted, but a user-facing run log screen is still needed.</w:t>
+              <w:t>`/workflows/{id}/runs` lists run history with a step-by-step input/output breakdown.</w:t>
             </w:r>
           </w:p>
         </w:tc>
@@ -572,10 +506,7 @@
           </w:tcPr>
           <w:p>
             <w:r>
-              <w:rPr>
-                <w:sz w:val="18"/>
-              </w:rPr>
-              <w:t>Workspace authorization</w:t>
+              <w:t>AI agent</w:t>
             </w:r>
           </w:p>
         </w:tc>
@@ -585,10 +516,7 @@
           </w:tcPr>
           <w:p>
             <w:r>
-              <w:rPr>
-                <w:sz w:val="18"/>
-              </w:rPr>
-              <w:t>Planned</w:t>
+              <w:t>Implemented</w:t>
             </w:r>
           </w:p>
         </w:tc>
@@ -598,10 +526,7 @@
           </w:tcPr>
           <w:p>
             <w:r>
-              <w:rPr>
-                <w:sz w:val="18"/>
-              </w:rPr>
-              <w:t>Membership model exists; full workspace-scoped authorization checks remain pending.</w:t>
+              <w:t>Per-workspace config, multi-provider LLM layer (Anthropic/OpenAI/Groq/Ollama), decision pipeline with draft-or-auto-send, escalation keywords, inbox draft banner.</w:t>
             </w:r>
           </w:p>
         </w:tc>
@@ -613,10 +538,7 @@
           </w:tcPr>
           <w:p>
             <w:r>
-              <w:rPr>
-                <w:sz w:val="18"/>
-              </w:rPr>
-              <w:t>Webhook verification</w:t>
+              <w:t>Workspace authorization</w:t>
             </w:r>
           </w:p>
         </w:tc>
@@ -626,10 +548,7 @@
           </w:tcPr>
           <w:p>
             <w:r>
-              <w:rPr>
-                <w:sz w:val="18"/>
-              </w:rPr>
-              <w:t>Planned</w:t>
+              <w:t>Implemented</w:t>
             </w:r>
           </w:p>
         </w:tc>
@@ -639,10 +558,7 @@
           </w:tcPr>
           <w:p>
             <w:r>
-              <w:rPr>
-                <w:sz w:val="18"/>
-              </w:rPr>
-              <w:t>Telegram secret-token validation remains pending.</w:t>
+              <w:t>Membership model plus granular permission checks on mutating workspace-scoped endpoints.</w:t>
             </w:r>
           </w:p>
         </w:tc>
@@ -654,9 +570,70 @@
           </w:tcPr>
           <w:p>
             <w:r>
-              <w:rPr>
-                <w:sz w:val="18"/>
-              </w:rPr>
+              <w:t>Webhook verification</w:t>
+            </w:r>
+          </w:p>
+        </w:tc>
+        <w:tc>
+          <w:tcPr>
+            <w:tcW w:type="dxa" w:w="3264"/>
+          </w:tcPr>
+          <w:p>
+            <w:r>
+              <w:t>Implemented</w:t>
+            </w:r>
+          </w:p>
+        </w:tc>
+        <w:tc>
+          <w:tcPr>
+            <w:tcW w:type="dxa" w:w="3264"/>
+          </w:tcPr>
+          <w:p>
+            <w:r>
+              <w:t>Telegram secret-token validation. WhatsApp Cloud API signature verification (beyond the verify-token handshake) remains planned.</w:t>
+            </w:r>
+          </w:p>
+        </w:tc>
+      </w:tr>
+      <w:tr>
+        <w:tc>
+          <w:tcPr>
+            <w:tcW w:type="dxa" w:w="3264"/>
+          </w:tcPr>
+          <w:p>
+            <w:r>
+              <w:t>Self-hosted licensing</w:t>
+            </w:r>
+          </w:p>
+        </w:tc>
+        <w:tc>
+          <w:tcPr>
+            <w:tcW w:type="dxa" w:w="3264"/>
+          </w:tcPr>
+          <w:p>
+            <w:r>
+              <w:t>Implemented</w:t>
+            </w:r>
+          </w:p>
+        </w:tc>
+        <w:tc>
+          <w:tcPr>
+            <w:tcW w:type="dxa" w:w="3264"/>
+          </w:tcPr>
+          <w:p>
+            <w:r>
+              <w:t>Offline Ed25519 license-key verification at API startup; keys purchased and issued through apps/marketing.</w:t>
+            </w:r>
+          </w:p>
+        </w:tc>
+      </w:tr>
+      <w:tr>
+        <w:tc>
+          <w:tcPr>
+            <w:tcW w:type="dxa" w:w="3264"/>
+          </w:tcPr>
+          <w:p>
+            <w:r>
               <w:t>Manual migrations</w:t>
             </w:r>
           </w:p>
@@ -667,9 +644,6 @@
           </w:tcPr>
           <w:p>
             <w:r>
-              <w:rPr>
-                <w:sz w:val="18"/>
-              </w:rPr>
               <w:t>Required</w:t>
             </w:r>
           </w:p>
@@ -680,9 +654,6 @@
           </w:tcPr>
           <w:p>
             <w:r>
-              <w:rPr>
-                <w:sz w:val="18"/>
-              </w:rPr>
               <w:t>Flyway is disabled at runtime; migrations must be run manually.</w:t>
             </w:r>
           </w:p>
@@ -690,9 +661,6 @@
       </w:tr>
     </w:tbl>
     <w:p>
-      <w:r/>
-    </w:p>
-    <w:p>
       <w:pPr>
         <w:pStyle w:val="Heading1"/>
       </w:pPr>
@@ -709,11 +677,9 @@
       </w:r>
     </w:p>
     <w:p>
-      <w:pPr>
-        <w:spacing w:after="120"/>
-      </w:pPr>
+      <w:pPr/>
       <w:r>
-        <w:t>Prove that RelayFlow can normalize Telegram conversations into a channel-agnostic inbox and run configurable workflows with transparent execution data.</w:t>
+        <w:t>Prove that RelayFlow can normalize Telegram and WhatsApp conversations into a channel-agnostic inbox, run configurable workflows with transparent execution data, and ship as self-hosted software an operator can run on their own infrastructure.</w:t>
       </w:r>
     </w:p>
     <w:p>
@@ -737,7 +703,7 @@
         <w:pStyle w:val="ListBullet"/>
       </w:pPr>
       <w:r>
-        <w:t>Email/password signup with email verification, Google login, TOTP two-factor login, and anonymous guest sessions.</w:t>
+        <w:t>Instance bootstrap for the first account and workspace on a fresh deployment (no email verification round-trip — the operator already has server access); every account after that requires a valid workspace invite token.</w:t>
       </w:r>
     </w:p>
     <w:p>
@@ -745,9 +711,7 @@
         <w:pStyle w:val="ListBullet"/>
       </w:pPr>
       <w:r>
-        <w:t>Telegram bot connection as the pilot channel adapter.</w:t>
-        <w:br/>
-        <w:t>WhatsApp Business Cloud API connection with webhook verification, inbound text and interactive button-reply ingestion, outbound text/button relay, and settings UI.</w:t>
+        <w:t>Google login and TOTP two-factor login.</w:t>
       </w:r>
     </w:p>
     <w:p>
@@ -755,7 +719,15 @@
         <w:pStyle w:val="ListBullet"/>
       </w:pPr>
       <w:r>
-        <w:t>Shared Telegram guest bot with /start workspace linking.</w:t>
+        <w:t>Telegram bot connection as the pilot channel adapter.</w:t>
+      </w:r>
+    </w:p>
+    <w:p>
+      <w:pPr>
+        <w:pStyle w:val="ListBullet"/>
+      </w:pPr>
+      <w:r>
+        <w:t>WhatsApp Business Cloud API connection with webhook verification, inbound text and interactive button-reply ingestion, outbound text/button relay, and settings UI.</w:t>
       </w:r>
     </w:p>
     <w:p>
@@ -771,7 +743,7 @@
         <w:pStyle w:val="ListBullet"/>
       </w:pPr>
       <w:r>
-        <w:t>Agent inbox with conversation list, message thread, outbound reply composer, conversation status updates, and workflow lock handling.</w:t>
+        <w:t>Agent inbox with conversation list, message thread, outbound reply composer, conversation assignment, conversation status updates, and workflow lock handling.</w:t>
       </w:r>
     </w:p>
     <w:p>
@@ -811,7 +783,7 @@
         <w:pStyle w:val="ListBullet"/>
       </w:pPr>
       <w:r>
-        <w:t>Persisted workflow runs and per-step input/output snapshots.</w:t>
+        <w:t>Persisted workflow runs and per-step input/output snapshots, exposed through a run logs UI.</w:t>
       </w:r>
     </w:p>
     <w:p>
@@ -820,16 +792,62 @@
       </w:pPr>
       <w:r>
         <w:t>Workflow publish validation for structural graph rules, including valid Jump To targets.</w:t>
-        <w:br/>
+      </w:r>
+    </w:p>
+    <w:p>
+      <w:pPr>
+        <w:pStyle w:val="ListBullet"/>
+      </w:pPr>
+      <w:r>
         <w:t>Workspace member permissions for inbox, contacts, workflows, channels, API keys, and webhooks, with guarded owner transfer.</w:t>
-        <w:br/>
-        <w:t>Workspace invites with expiring tokens and permission assignment.</w:t>
-        <w:br/>
+      </w:r>
+    </w:p>
+    <w:p>
+      <w:pPr>
+        <w:pStyle w:val="ListBullet"/>
+      </w:pPr>
+      <w:r>
+        <w:t>Workspace invites with expiring tokens and permission assignment — also the gate for all non-bootstrap account creation.</w:t>
+      </w:r>
+    </w:p>
+    <w:p>
+      <w:pPr>
+        <w:pStyle w:val="ListBullet"/>
+      </w:pPr>
+      <w:r>
         <w:t>Workspace API keys and public API endpoints for conversations, messages, and outbound replies.</w:t>
-        <w:br/>
+      </w:r>
+    </w:p>
+    <w:p>
+      <w:pPr>
+        <w:pStyle w:val="ListBullet"/>
+      </w:pPr>
+      <w:r>
         <w:t>Workspace webhooks with encrypted HMAC secret, signature header, retry/backoff delivery, and contact.created events.</w:t>
-        <w:br/>
-        <w:t>Subscription billing foundation with FREE, PRO_MONTHLY, and PRO_ANNUAL plans, required Redis-seeded limits and pricing, Paystack checkout, owner billing UI, scheduled cancellation, Paystack webhooks including subscription.not_renew, downgrade locking, and plan caps for channels, workflows, and workspace members.</w:t>
+      </w:r>
+    </w:p>
+    <w:p>
+      <w:pPr>
+        <w:pStyle w:val="ListBullet"/>
+      </w:pPr>
+      <w:r>
+        <w:t>AI agent: per-workspace configuration (autonomy ceiling, instructions, knowledge base Q&amp;A, escalation keywords, workflow mappings), a multi-provider LLM layer (Anthropic, OpenAI, Groq, self-hosted Ollama) switchable without restart, a decision pipeline (keyword escalation → LLM → escalate/draft/auto-send), and an inbox draft banner for reviewing AI-suggested replies and workflow triggers.</w:t>
+      </w:r>
+    </w:p>
+    <w:p>
+      <w:pPr>
+        <w:pStyle w:val="ListBullet"/>
+      </w:pPr>
+      <w:r>
+        <w:t>Self-hosted distribution: Docker Compose production stack (api, web, Postgres, Redis, Caddy for automatic TLS, a one-shot Flyway migrate service), and an offline-verified Ed25519 license key required at API startup.</w:t>
+      </w:r>
+    </w:p>
+    <w:p>
+      <w:pPr>
+        <w:pStyle w:val="ListBullet"/>
+      </w:pPr>
+      <w:r>
+        <w:t>License issuance: apps/marketing is a separate, self-contained Next.js service (its own SQLite database, its own Paystack one-time-payment checkout) that sells and issues license keys — entirely independent of apps/api.</w:t>
       </w:r>
     </w:p>
     <w:p>
@@ -845,14 +863,6 @@
         <w:pStyle w:val="ListBullet"/>
       </w:pPr>
       <w:r>
-        <w:t>Workflow run logs UI.</w:t>
-      </w:r>
-    </w:p>
-    <w:p>
-      <w:pPr>
-        <w:pStyle w:val="ListBullet"/>
-      </w:pPr>
-      <w:r>
         <w:t>Manual workflow test-run mode.</w:t>
       </w:r>
     </w:p>
@@ -877,14 +887,6 @@
         <w:pStyle w:val="ListBullet"/>
       </w:pPr>
       <w:r>
-        <w:t>Conversation assignment to workspace members.</w:t>
-      </w:r>
-    </w:p>
-    <w:p>
-      <w:pPr>
-        <w:pStyle w:val="ListBullet"/>
-      </w:pPr>
-      <w:r>
         <w:t>Retry count, retry delay, and backoff controls for HTTP nodes.</w:t>
       </w:r>
     </w:p>
@@ -901,7 +903,7 @@
         <w:pStyle w:val="ListBullet"/>
       </w:pPr>
       <w:r>
-        <w:t>Telegram webhook secret verification.</w:t>
+        <w:t>WhatsApp webhook signature verification (beyond the initial verify-token handshake).</w:t>
       </w:r>
     </w:p>
     <w:p>
@@ -909,7 +911,31 @@
         <w:pStyle w:val="ListBullet"/>
       </w:pPr>
       <w:r>
-        <w:t>Additional channel adapters beyond Telegram and WhatsApp.</w:t>
+        <w:t>Additional channel adapters beyond Telegram and WhatsApp (Instagram planned).</w:t>
+      </w:r>
+    </w:p>
+    <w:p>
+      <w:pPr>
+        <w:pStyle w:val="ListBullet"/>
+      </w:pPr>
+      <w:r>
+        <w:t>Restricting `POST /workspaces` (creating additional workspaces) — currently any authenticated user can create one; only account creation and the first workspace are gated today.</w:t>
+      </w:r>
+    </w:p>
+    <w:p>
+      <w:pPr>
+        <w:pStyle w:val="ListBullet"/>
+      </w:pPr>
+      <w:r>
+        <w:t>Automated redeploy on `apps/marketing` image publish (CI currently only builds and pushes the image).</w:t>
+      </w:r>
+    </w:p>
+    <w:p>
+      <w:pPr>
+        <w:pStyle w:val="ListBullet"/>
+      </w:pPr>
+      <w:r>
+        <w:t>Decision on whether published self-hosted Docker images should move to a private registry as a stronger lever against license-check bypass than the on-prem check alone.</w:t>
       </w:r>
     </w:p>
     <w:p>
@@ -933,14 +959,6 @@
         <w:pStyle w:val="ListBullet"/>
       </w:pPr>
       <w:r>
-        <w:t>AI agent features.</w:t>
-      </w:r>
-    </w:p>
-    <w:p>
-      <w:pPr>
-        <w:pStyle w:val="ListBullet"/>
-      </w:pPr>
-      <w:r>
         <w:t>Advanced analytics.</w:t>
       </w:r>
     </w:p>
@@ -957,7 +975,15 @@
         <w:pStyle w:val="ListBullet"/>
       </w:pPr>
       <w:r>
-        <w:t>Advanced billing self-service beyond the current Paystack checkout, owner billing UI, scheduled cancellation, webhook, and downgrade foundation.</w:t>
+        <w:t>A hosted multi-tenant SaaS instance of the core product — apps/api and apps/web are self-hosted-only; only the marketing site and license checkout stay hosted by RelayFlow.</w:t>
+      </w:r>
+    </w:p>
+    <w:p>
+      <w:pPr>
+        <w:pStyle w:val="ListBullet"/>
+      </w:pPr>
+      <w:r>
+        <w:t>Recurring/subscription billing — self-hosted licenses are a one-time purchase for a fixed term, renewed by purchasing again.</w:t>
       </w:r>
     </w:p>
     <w:p>
@@ -989,6 +1015,22 @@
         <w:pStyle w:val="ListBullet"/>
       </w:pPr>
       <w:r>
+        <w:t>As an operator, I can bootstrap a fresh self-hosted instance into a working admin account and workspace in one step.</w:t>
+      </w:r>
+    </w:p>
+    <w:p>
+      <w:pPr>
+        <w:pStyle w:val="ListBullet"/>
+      </w:pPr>
+      <w:r>
+        <w:t>As a workspace owner, I can invite a teammate by email; they must accept the invite to gain access — there is no open public signup.</w:t>
+      </w:r>
+    </w:p>
+    <w:p>
+      <w:pPr>
+        <w:pStyle w:val="ListBullet"/>
+      </w:pPr>
+      <w:r>
         <w:t>As a workspace owner, I can create or switch workspaces.</w:t>
       </w:r>
     </w:p>
@@ -1005,7 +1047,7 @@
         <w:pStyle w:val="ListBullet"/>
       </w:pPr>
       <w:r>
-        <w:t>As a guest user, I can try the product through a temporary workspace and shared Telegram bot.</w:t>
+        <w:t>As an agent, I can view conversations and reply from the inbox when I have inbox permission and no active workflow owns the conversation.</w:t>
       </w:r>
     </w:p>
     <w:p>
@@ -1013,10 +1055,14 @@
         <w:pStyle w:val="ListBullet"/>
       </w:pPr>
       <w:r>
-        <w:t>As an agent, I can view conversations and reply from the inbox when I have inbox permission and no active workflow owns the conversation.</w:t>
-        <w:br/>
-        <w:t>As a user, I can verify my email before first login.</w:t>
-        <w:br/>
+        <w:t>As an agent, I can assign a conversation to a teammate, or unassign it.</w:t>
+      </w:r>
+    </w:p>
+    <w:p>
+      <w:pPr>
+        <w:pStyle w:val="ListBullet"/>
+      </w:pPr>
+      <w:r>
         <w:t>As a user, I can update my profile, change my password, enable/disable TOTP 2FA, and delete my account.</w:t>
       </w:r>
     </w:p>
@@ -1057,15 +1103,55 @@
         <w:pStyle w:val="ListBullet"/>
       </w:pPr>
       <w:r>
-        <w:t>As an admin, I should be able to inspect every workflow run and step in a future run logs UI.</w:t>
-        <w:br/>
+        <w:t>As an admin, I can inspect every workflow run and step in the run logs UI.</w:t>
+      </w:r>
+    </w:p>
+    <w:p>
+      <w:pPr>
+        <w:pStyle w:val="ListBullet"/>
+      </w:pPr>
+      <w:r>
         <w:t>As a workspace owner, I can invite members, transfer ownership to another member, and grant only the permissions each person needs.</w:t>
-        <w:br/>
-        <w:t>As a workspace owner, I can use the billing settings panel to view plan limits, start Paystack checkout for monthly or annual PRO, see downgrade notices, and schedule subscription cancellation.</w:t>
-        <w:br/>
+      </w:r>
+    </w:p>
+    <w:p>
+      <w:pPr>
+        <w:pStyle w:val="ListBullet"/>
+      </w:pPr>
+      <w:r>
         <w:t>As an integrator, I can use API keys to read conversations/messages and send outbound replies.</w:t>
-        <w:br/>
+      </w:r>
+    </w:p>
+    <w:p>
+      <w:pPr>
+        <w:pStyle w:val="ListBullet"/>
+      </w:pPr>
+      <w:r>
         <w:t>As an integrator, I can subscribe to signed workspace webhook events.</w:t>
+      </w:r>
+    </w:p>
+    <w:p>
+      <w:pPr>
+        <w:pStyle w:val="ListBullet"/>
+      </w:pPr>
+      <w:r>
+        <w:t>As a workspace owner, I can enable an AI agent that drafts or auto-sends replies within instructions and autonomy limits I control, and escalates to a human on defined keywords or low confidence.</w:t>
+      </w:r>
+    </w:p>
+    <w:p>
+      <w:pPr>
+        <w:pStyle w:val="ListBullet"/>
+      </w:pPr>
+      <w:r>
+        <w:t>As a buyer, I can purchase a self-hosted license key through the marketing site and receive it by email and on-screen within moments of payment.</w:t>
+      </w:r>
+    </w:p>
+    <w:p>
+      <w:pPr>
+        <w:pStyle w:val="ListBullet"/>
+      </w:pPr>
+      <w:r>
+        <w:t>As an operator, my self-hosted instance keeps running through a short license lapse (a grace period) rather than going down the moment a key expires.</w:t>
       </w:r>
     </w:p>
     <w:p>
@@ -1138,7 +1224,13 @@
       </w:pPr>
       <w:r>
         <w:t>Jump To: redirects execution to another node by ID with a configurable max-jump limit to prevent unbounded loops.</w:t>
-        <w:br/>
+      </w:r>
+    </w:p>
+    <w:p>
+      <w:pPr>
+        <w:pStyle w:val="ListBullet"/>
+      </w:pPr>
+      <w:r>
         <w:t>End Conversation: optionally sends a closing message and sets the conversation to closed.</w:t>
       </w:r>
     </w:p>
@@ -1151,9 +1243,7 @@
       </w:r>
     </w:p>
     <w:p>
-      <w:pPr>
-        <w:spacing w:after="120"/>
-      </w:pPr>
+      <w:pPr/>
       <w:r>
         <w:t>The current runtime uses a flat variable map with dot-notation names. Built-in variables include workspace, conversation, contact, channel, and triggering message values. User-defined variables are produced by Set Variable, HTTP response mappings, and Ask Question responses.</w:t>
       </w:r>
@@ -1267,7 +1357,7 @@
         <w:pStyle w:val="ListBullet"/>
       </w:pPr>
       <w:r>
-        <w:t>Monorepo with Java Spring Boot API and Next.js frontend.</w:t>
+        <w:t>Three independently deployable apps: apps/api (Java Spring Boot), apps/web (Next.js product frontend), and apps/marketing (Next.js marketing site plus self-hosted license checkout).</w:t>
       </w:r>
     </w:p>
     <w:p>
@@ -1275,7 +1365,7 @@
         <w:pStyle w:val="ListBullet"/>
       </w:pPr>
       <w:r>
-        <w:t>PostgreSQL stores users, workspaces, members, invites, API keys, webhooks, subscriptions, channel accounts, contacts, external identities, conversations, messages, workflow definitions, runs, and run steps.</w:t>
+        <w:t>apps/api and apps/web are distributed self-hosted-only via Docker Compose; RelayFlow does not run a hosted multi-tenant instance of the core product. Only apps/marketing stays hosted by RelayFlow.</w:t>
       </w:r>
     </w:p>
     <w:p>
@@ -1283,7 +1373,15 @@
         <w:pStyle w:val="ListBullet"/>
       </w:pPr>
       <w:r>
-        <w:t>Flyway migrations are run manually; the API does not auto-migrate on startup.</w:t>
+        <w:t>PostgreSQL stores users, workspaces, members, invites, API keys, webhooks, channel accounts, contacts, external identities, conversations, messages, workflow definitions, runs, run steps, and AI agent configuration/invocation/draft data.</w:t>
+      </w:r>
+    </w:p>
+    <w:p>
+      <w:pPr>
+        <w:pStyle w:val="ListBullet"/>
+      </w:pPr>
+      <w:r>
+        <w:t>Flyway migrations are run manually; the API does not auto-migrate on startup (a dedicated one-shot Docker service runs them in production).</w:t>
       </w:r>
     </w:p>
     <w:p>
@@ -1299,7 +1397,7 @@
         <w:pStyle w:val="ListBullet"/>
       </w:pPr>
       <w:r>
-        <w:t>SSE broadcasts workspace updates to open inbox sessions.</w:t>
+        <w:t>SSE broadcasts workspace updates, including AI draft creation, to open inbox sessions.</w:t>
       </w:r>
     </w:p>
     <w:p>
@@ -1320,6 +1418,14 @@
     </w:p>
     <w:p>
       <w:pPr>
+        <w:pStyle w:val="ListBullet"/>
+      </w:pPr>
+      <w:r>
+        <w:t>apps/marketing is a separate Next.js server with its own SQLite database and Paystack integration — it signs Ed25519 license keys that apps/api's LicenseKeyValidator verifies fully offline; the two sides share no runtime dependency.</w:t>
+      </w:r>
+    </w:p>
+    <w:p>
+      <w:pPr>
         <w:pStyle w:val="Heading1"/>
       </w:pPr>
       <w:r>
@@ -1331,7 +1437,7 @@
         <w:pStyle w:val="ListBullet"/>
       </w:pPr>
       <w:r>
-        <w:t>Backend: Java 21, Spring Boot, Spring Security, Spring Data JPA, Flyway, PostgreSQL, Redis, Paystack integration.</w:t>
+        <w:t>Backend (apps/api): Java 21, Spring Boot, Spring Security, Spring Data JPA, Flyway, PostgreSQL, Redis.</w:t>
       </w:r>
     </w:p>
     <w:p>
@@ -1339,7 +1445,23 @@
         <w:pStyle w:val="ListBullet"/>
       </w:pPr>
       <w:r>
-        <w:t>Frontend: Next.js, React, TypeScript, Tailwind CSS, TanStack Query, React Flow.</w:t>
+        <w:t>Frontend (apps/web): Next.js, React, TypeScript, Tailwind CSS, TanStack Query, React Flow.</w:t>
+      </w:r>
+    </w:p>
+    <w:p>
+      <w:pPr>
+        <w:pStyle w:val="ListBullet"/>
+      </w:pPr>
+      <w:r>
+        <w:t>License checkout (apps/marketing): Next.js server (not statically exported), Node's built-in SQLite module, Paystack one-time-payment checkout, Ed25519 license signing.</w:t>
+      </w:r>
+    </w:p>
+    <w:p>
+      <w:pPr>
+        <w:pStyle w:val="ListBullet"/>
+      </w:pPr>
+      <w:r>
+        <w:t>AI agent: pluggable LLM layer over Anthropic, OpenAI, Groq, and self-hosted Ollama.</w:t>
       </w:r>
     </w:p>
     <w:p>
@@ -1355,7 +1477,7 @@
         <w:pStyle w:val="ListBullet"/>
       </w:pPr>
       <w:r>
-        <w:t>Testing: Maven/JUnit on backend; Vitest and Testing Library on frontend.</w:t>
+        <w:t>Testing: Maven/JUnit on the backend (including a cross-language fixture test guarding the Node/Java license-key contract); Vitest and Testing Library on both frontends.</w:t>
       </w:r>
     </w:p>
     <w:p>
@@ -1363,7 +1485,7 @@
         <w:pStyle w:val="ListBullet"/>
       </w:pPr>
       <w:r>
-        <w:t>Local infrastructure: Docker Compose for PostgreSQL and Redis.</w:t>
+        <w:t>Deployment: Docker Compose for local infrastructure (PostgreSQL, Redis, optional Ollama) and for the self-hosted production stack (adds Caddy for automatic TLS and a one-shot migration service).</w:t>
       </w:r>
     </w:p>
     <w:p>
@@ -1380,14 +1502,30 @@
       </w:pPr>
       <w:r>
         <w:t>users: core account/profile lifecycle fields.</w:t>
-        <w:br/>
-        <w:t>user_identities: email, Google, and anonymous authentication identities.</w:t>
-        <w:br/>
+      </w:r>
+    </w:p>
+    <w:p>
+      <w:pPr>
+        <w:pStyle w:val="ListBullet"/>
+      </w:pPr>
+      <w:r>
+        <w:t>user_identities: email and Google authentication identities.</w:t>
+      </w:r>
+    </w:p>
+    <w:p>
+      <w:pPr>
+        <w:pStyle w:val="ListBullet"/>
+      </w:pPr>
+      <w:r>
         <w:t>user_preferences: per-user preferences such as email updates.</w:t>
-        <w:br/>
+      </w:r>
+    </w:p>
+    <w:p>
+      <w:pPr>
+        <w:pStyle w:val="ListBullet"/>
+      </w:pPr>
+      <w:r>
         <w:t>user_mfa_methods and two_factor_challenges: TOTP setup/login state.</w:t>
-        <w:br/>
-        <w:t>email_verification_tokens: email ownership verification links.</w:t>
       </w:r>
     </w:p>
     <w:p>
@@ -1403,14 +1541,30 @@
         <w:pStyle w:val="ListBullet"/>
       </w:pPr>
       <w:r>
-        <w:t>workspace_invites: expiring invite tokens with permission sets.</w:t>
-        <w:br/>
+        <w:t>workspace_invites: expiring invite tokens with permission sets — the gate for every account created after instance bootstrap.</w:t>
+      </w:r>
+    </w:p>
+    <w:p>
+      <w:pPr>
+        <w:pStyle w:val="ListBullet"/>
+      </w:pPr>
+      <w:r>
         <w:t>workspace_api_keys: hashed public API keys with revocation, expiry, and last-used tracking.</w:t>
-        <w:br/>
+      </w:r>
+    </w:p>
+    <w:p>
+      <w:pPr>
+        <w:pStyle w:val="ListBullet"/>
+      </w:pPr>
+      <w:r>
         <w:t>workspace_webhooks and workspace_webhook_events: outbound webhook configuration and subscribed events.</w:t>
-        <w:br/>
-        <w:t>workspace_subscriptions: current plan, billing status, provider, provider customer/subscription codes, provider cancellation token, billing period end, and downgrade locked-resource counts.</w:t>
-        <w:br/>
+      </w:r>
+    </w:p>
+    <w:p>
+      <w:pPr>
+        <w:pStyle w:val="ListBullet"/>
+      </w:pPr>
+      <w:r>
         <w:t>channel_accounts: provider connection records and encrypted credentials.</w:t>
       </w:r>
     </w:p>
@@ -1448,6 +1602,22 @@
     </w:p>
     <w:p>
       <w:pPr>
+        <w:pStyle w:val="ListBullet"/>
+      </w:pPr>
+      <w:r>
+        <w:t>ai_agent_configs, ai_agent_invocation_log, and conversation_ai_drafts: per-workspace AI agent configuration, invocation history, and pending draft replies.</w:t>
+      </w:r>
+    </w:p>
+    <w:p>
+      <w:pPr>
+        <w:pStyle w:val="ListBullet"/>
+      </w:pPr>
+      <w:r>
+        <w:t>There is no license/subscription table in Postgres — self-hosted license state is not persisted; it is verified from the RELAYFLOW_LICENSE_KEY environment variable in memory at API startup.</w:t>
+      </w:r>
+    </w:p>
+    <w:p>
+      <w:pPr>
         <w:pStyle w:val="Heading1"/>
       </w:pPr>
       <w:r>
@@ -1484,8 +1654,14 @@
       </w:pPr>
       <w:r>
         <w:t>Ask Question nodes persist WAITING state and resume after contact replies.</w:t>
-        <w:br/>
-        <w:t>Active workflow runs lock the conversation so agents and API clients cannot send competing replies.</w:t>
+      </w:r>
+    </w:p>
+    <w:p>
+      <w:pPr>
+        <w:pStyle w:val="ListBullet"/>
+      </w:pPr>
+      <w:r>
+        <w:t>Active workflow runs lock the conversation so agents, the AI agent, and API clients cannot send competing replies.</w:t>
       </w:r>
     </w:p>
     <w:p>
@@ -1541,8 +1717,14 @@
         <w:pStyle w:val="ListBullet"/>
       </w:pPr>
       <w:r>
-        <w:t>Implemented: verified email/password auth, Google OAuth, anonymous guest sessions, TOTP 2FA, profile management, account deletion, and session invalidation.</w:t>
-        <w:br/>
+        <w:t>Implemented: email/password auth, Google OAuth, TOTP 2FA, profile management, account deletion, and session invalidation.</w:t>
+      </w:r>
+    </w:p>
+    <w:p>
+      <w:pPr>
+        <w:pStyle w:val="ListBullet"/>
+      </w:pPr>
+      <w:r>
         <w:t>Implemented: workspace-level authorization and granular permission checks for mutating workspace-scoped endpoints.</w:t>
       </w:r>
     </w:p>
@@ -1551,7 +1733,31 @@
         <w:pStyle w:val="ListBullet"/>
       </w:pPr>
       <w:r>
-        <w:t>Implemented: validate Paystack webhook signatures. Planned: verify Telegram webhook secret tokens and WhatsApp webhook signatures.</w:t>
+        <w:t>Implemented: instance bootstrap is a one-time action guarded by an empty user table; every subsequent account requires a valid, non-expired workspace invite token — there is no open public signup surface.</w:t>
+      </w:r>
+    </w:p>
+    <w:p>
+      <w:pPr>
+        <w:pStyle w:val="ListBullet"/>
+      </w:pPr>
+      <w:r>
+        <w:t>Implemented: Telegram webhook secret-token verification. Planned: WhatsApp webhook signature verification beyond the initial verify-token handshake.</w:t>
+      </w:r>
+    </w:p>
+    <w:p>
+      <w:pPr>
+        <w:pStyle w:val="ListBullet"/>
+      </w:pPr>
+      <w:r>
+        <w:t>Implemented: self-hosted license key verified fully offline via Ed25519 signature at API startup, with a 14-day grace period past expiry before the instance refuses to start. Known limitation (accepted, consistent with other self-hosted enterprise software): a host operator who controls the machine can bypass this check — its purpose is filtering casual non-payment and giving an audit hook, not cryptographic prevention.</w:t>
+      </w:r>
+    </w:p>
+    <w:p>
+      <w:pPr>
+        <w:pStyle w:val="ListBullet"/>
+      </w:pPr>
+      <w:r>
+        <w:t>Implemented: apps/marketing's Paystack webhook verifies the HMAC signature over the raw request body, additionally re-verifies the transaction server-to-server before issuing a key, and applies an idempotent order-state transition so retried webhook deliveries never double-issue a license.</w:t>
       </w:r>
     </w:p>
     <w:p>
@@ -1583,7 +1789,7 @@
         <w:pStyle w:val="ListBullet"/>
       </w:pPr>
       <w:r>
-        <w:t>OpenAPI must document auth, profile/2FA, workspaces, members including ownership transfer, invites, API keys, webhooks, public API, channel accounts, contacts, external identities, conversations, messages, workflows, subscriptions, Paystack webhooks including subscription.not_renew handling, SSE, Telegram webhooks, WhatsApp webhooks, and normalized error responses for validation failures, missing required request parameters, business conflicts, missing resources, provider failures, and unexpected server errors.</w:t>
+        <w:t>OpenAPI must document auth (including instance bootstrap), profile/2FA, workspaces, members including ownership transfer, invites, API keys, webhooks, public API, channel accounts, contacts, external identities, conversations, messages, workflows and run logs, AI agent configuration and drafts, SSE, Telegram webhooks, WhatsApp webhooks, and normalized error responses for validation failures, missing required request parameters, business conflicts, missing resources, provider failures, and unexpected server errors.</w:t>
       </w:r>
     </w:p>
     <w:p>
@@ -1599,6 +1805,14 @@
         <w:pStyle w:val="ListBullet"/>
       </w:pPr>
       <w:r>
+        <w:t>apps/marketing's checkout/issuance API (checkout, order status, Paystack webhook) is a separate service and is not part of the apps/api OpenAPI contract.</w:t>
+      </w:r>
+    </w:p>
+    <w:p>
+      <w:pPr>
+        <w:pStyle w:val="ListBullet"/>
+      </w:pPr>
+      <w:r>
         <w:t>Contract updates should happen in the same change set as API shape changes.</w:t>
       </w:r>
     </w:p>
@@ -1615,30 +1829,6 @@
         <w:pStyle w:val="ListNumber"/>
       </w:pPr>
       <w:r>
-        <w:t>Add workflow run logs UI: workflow runs list and step-by-step detail view.</w:t>
-      </w:r>
-    </w:p>
-    <w:p>
-      <w:pPr>
-        <w:pStyle w:val="ListNumber"/>
-      </w:pPr>
-      <w:r>
-        <w:t>Harden workspace authorization coverage across all read and write workspace-scoped endpoints.</w:t>
-      </w:r>
-    </w:p>
-    <w:p>
-      <w:pPr>
-        <w:pStyle w:val="ListNumber"/>
-      </w:pPr>
-      <w:r>
-        <w:t>Add Telegram webhook secret verification and WhatsApp webhook signature verification.</w:t>
-      </w:r>
-    </w:p>
-    <w:p>
-      <w:pPr>
-        <w:pStyle w:val="ListNumber"/>
-      </w:pPr>
-      <w:r>
         <w:t>Add HTTP retry count, retry delay/backoff, and auth helper configuration.</w:t>
       </w:r>
     </w:p>
@@ -1655,6 +1845,22 @@
         <w:pStyle w:val="ListNumber"/>
       </w:pPr>
       <w:r>
+        <w:t>Add WhatsApp webhook signature verification.</w:t>
+      </w:r>
+    </w:p>
+    <w:p>
+      <w:pPr>
+        <w:pStyle w:val="ListNumber"/>
+      </w:pPr>
+      <w:r>
+        <w:t>Restrict additional-workspace creation (currently any authenticated user can create one).</w:t>
+      </w:r>
+    </w:p>
+    <w:p>
+      <w:pPr>
+        <w:pStyle w:val="ListNumber"/>
+      </w:pPr>
+      <w:r>
         <w:t>Add manual workflow test-run mode.</w:t>
       </w:r>
     </w:p>
@@ -1671,7 +1877,23 @@
         <w:pStyle w:val="ListNumber"/>
       </w:pPr>
       <w:r>
-        <w:t>Add broader role presets, audit logs, account security notifications, and conversation assignment.</w:t>
+        <w:t>Add broader role presets, audit logs, and account security notifications.</w:t>
+      </w:r>
+    </w:p>
+    <w:p>
+      <w:pPr>
+        <w:pStyle w:val="ListNumber"/>
+      </w:pPr>
+      <w:r>
+        <w:t>Wire up an automated redeploy trigger for apps/marketing on image publish.</w:t>
+      </w:r>
+    </w:p>
+    <w:p>
+      <w:pPr>
+        <w:pStyle w:val="ListNumber"/>
+      </w:pPr>
+      <w:r>
+        <w:t>Decide the private-vs-public Docker registry question for the self-hosted images.</w:t>
       </w:r>
     </w:p>
     <w:p>
@@ -1683,11 +1905,9 @@
       </w:r>
     </w:p>
     <w:p>
-      <w:pPr>
-        <w:spacing w:after="120"/>
-      </w:pPr>
+      <w:pPr/>
       <w:r>
-        <w:t>The project is medium-to-high complexity because it combines multi-tenant auth, verified identities, MFA, profile management, permissions, invites, API keys, webhooks, channel integrations, realtime inbox behavior, workflow graph editing, durable workflow execution, external HTTP calls, and observability. The current implementation has completed the first major vertical slice: Telegram pilot, WhatsApp adapter foundation, inbox, contacts, workflow builder, runtime persistence, profile/security basics, permissions, and integration foundations. The next complexity wall is production hardening: full authorization coverage, webhook signature verification, run-log UX, audit logs, security notifications, secrets masking, retries, and workflow versioning.</w:t>
+        <w:t>The project is medium-to-high complexity because it combines multi-tenant auth, invite-gated account creation, MFA, profile management, permissions, invites, API keys, webhooks, channel integrations, realtime inbox behavior, workflow graph editing, durable workflow execution, external HTTP calls, an AI agent with a multi-provider LLM layer, observability, and self-hosted distribution with offline license verification and a fully separate license-issuance service. The current implementation has completed the first major vertical slice: Telegram and WhatsApp adapters, inbox, contacts, workflow builder and runtime, AI agent, profile/security basics, permissions, self-hosted Docker distribution, and license issuance. The next complexity wall is production hardening: WhatsApp webhook signature verification, secret masking, retries, workflow versioning, audit logs, and the registry/redeploy decisions around the self-hosted distribution model.</w:t>
       </w:r>
     </w:p>
     <w:p>
@@ -1699,11 +1919,9 @@
       </w:r>
     </w:p>
     <w:p>
-      <w:pPr>
-        <w:spacing w:after="120"/>
-      </w:pPr>
+      <w:pPr/>
       <w:r>
-        <w:t>RelayFlow should be positioned as a customer messaging platform with developer-grade workflow automation. Telegram is a validation path, not the product identity. The durable thesis remains: one inbox, channel-agnostic data, and workflow automation that is inspectable, controllable, and reliable.</w:t>
+        <w:t>RelayFlow should be positioned as a self-hosted customer messaging platform with developer-grade workflow automation and an optional AI agent. Telegram is a validation path, not the product identity. The durable thesis remains: one inbox, channel-agnostic data, and workflow automation that is inspectable, controllable, and reliable — now paired with a BYOC distribution model for teams that want to own their data and avoid recurring SaaS billing.</w:t>
       </w:r>
     </w:p>
     <w:sectPr>

</xml_diff>